<commit_message>
bai2: Tinh thue cho san pham
</commit_message>
<xml_diff>
--- a/Tuan03/22726151_LuuNgocCaoSon.docx
+++ b/Tuan03/22726151_LuuNgocCaoSon.docx
@@ -208,411 +208,45 @@
     <w:p>
       <w:pPr>
         <w:spacing w:before="100" w:beforeAutospacing="1" w:after="100" w:afterAutospacing="1" w:line="240" w:lineRule="auto"/>
-        <w:outlineLvl w:val="2"/>
-        <w:rPr>
-          <w:rFonts w:ascii="Times New Roman" w:eastAsia="Times New Roman" w:hAnsi="Times New Roman" w:cs="Times New Roman"/>
-          <w:b/>
-          <w:bCs/>
-          <w:sz w:val="27"/>
-          <w:szCs w:val="27"/>
-        </w:rPr>
-      </w:pPr>
-      <w:r>
-        <w:rPr>
-          <w:rFonts w:ascii="Times New Roman" w:eastAsia="Times New Roman" w:hAnsi="Times New Roman" w:cs="Times New Roman"/>
-          <w:b/>
-          <w:bCs/>
-          <w:sz w:val="27"/>
-          <w:szCs w:val="27"/>
-        </w:rPr>
-        <w:t>2.</w:t>
-      </w:r>
-      <w:r>
-        <w:rPr>
-          <w:rFonts w:ascii="Times New Roman" w:eastAsia="Times New Roman" w:hAnsi="Times New Roman" w:cs="Times New Roman"/>
-          <w:b/>
-          <w:bCs/>
-          <w:sz w:val="27"/>
-          <w:szCs w:val="27"/>
-        </w:rPr>
-        <w:t xml:space="preserve"> Áp dụng Design Pattern</w:t>
-      </w:r>
-    </w:p>
-    <w:p>
-      <w:pPr>
-        <w:spacing w:before="100" w:beforeAutospacing="1" w:after="100" w:afterAutospacing="1" w:line="240" w:lineRule="auto"/>
-        <w:outlineLvl w:val="3"/>
-        <w:rPr>
-          <w:rFonts w:ascii="Times New Roman" w:eastAsia="Times New Roman" w:hAnsi="Times New Roman" w:cs="Times New Roman"/>
-          <w:b/>
-          <w:bCs/>
-          <w:sz w:val="24"/>
-          <w:szCs w:val="24"/>
-        </w:rPr>
-      </w:pPr>
-      <w:r>
-        <w:rPr>
-          <w:rFonts w:ascii="Times New Roman" w:eastAsia="Times New Roman" w:hAnsi="Times New Roman" w:cs="Times New Roman"/>
-          <w:b/>
-          <w:bCs/>
-          <w:sz w:val="24"/>
-          <w:szCs w:val="24"/>
-        </w:rPr>
-        <w:t>State Pattern</w:t>
-      </w:r>
-    </w:p>
-    <w:p>
-      <w:pPr>
-        <w:numPr>
-          <w:ilvl w:val="0"/>
-          <w:numId w:val="2"/>
-        </w:numPr>
-        <w:spacing w:before="100" w:beforeAutospacing="1" w:after="100" w:afterAutospacing="1" w:line="240" w:lineRule="auto"/>
-        <w:rPr>
-          <w:rFonts w:ascii="Times New Roman" w:eastAsia="Times New Roman" w:hAnsi="Times New Roman" w:cs="Times New Roman"/>
-          <w:sz w:val="24"/>
-          <w:szCs w:val="24"/>
-        </w:rPr>
-      </w:pPr>
-      <w:r>
-        <w:rPr>
-          <w:rFonts w:ascii="Times New Roman" w:eastAsia="Times New Roman" w:hAnsi="Times New Roman" w:cs="Times New Roman"/>
-          <w:sz w:val="24"/>
-          <w:szCs w:val="24"/>
-        </w:rPr>
-        <w:t>Dùng để quản lý trạng thái đơn hàng</w:t>
-      </w:r>
-    </w:p>
-    <w:p>
-      <w:pPr>
-        <w:numPr>
-          <w:ilvl w:val="0"/>
-          <w:numId w:val="2"/>
-        </w:numPr>
-        <w:spacing w:before="100" w:beforeAutospacing="1" w:after="100" w:afterAutospacing="1" w:line="240" w:lineRule="auto"/>
-        <w:rPr>
-          <w:rFonts w:ascii="Times New Roman" w:eastAsia="Times New Roman" w:hAnsi="Times New Roman" w:cs="Times New Roman"/>
-          <w:sz w:val="24"/>
-          <w:szCs w:val="24"/>
-        </w:rPr>
-      </w:pPr>
-      <w:r>
-        <w:rPr>
-          <w:rFonts w:ascii="Times New Roman" w:eastAsia="Times New Roman" w:hAnsi="Times New Roman" w:cs="Times New Roman"/>
-          <w:sz w:val="24"/>
-          <w:szCs w:val="24"/>
-        </w:rPr>
-        <w:t>Mỗi trạng thái là một class riêng</w:t>
-      </w:r>
-    </w:p>
-    <w:p>
-      <w:pPr>
-        <w:numPr>
-          <w:ilvl w:val="0"/>
-          <w:numId w:val="2"/>
-        </w:numPr>
-        <w:spacing w:before="100" w:beforeAutospacing="1" w:after="100" w:afterAutospacing="1" w:line="240" w:lineRule="auto"/>
-        <w:rPr>
-          <w:rFonts w:ascii="Times New Roman" w:eastAsia="Times New Roman" w:hAnsi="Times New Roman" w:cs="Times New Roman"/>
-          <w:sz w:val="24"/>
-          <w:szCs w:val="24"/>
-        </w:rPr>
-      </w:pPr>
-      <w:r>
-        <w:rPr>
-          <w:rFonts w:ascii="Times New Roman" w:eastAsia="Times New Roman" w:hAnsi="Times New Roman" w:cs="Times New Roman"/>
-          <w:sz w:val="24"/>
-          <w:szCs w:val="24"/>
-        </w:rPr>
-        <w:t>Tránh sử dụng if-else phức tạp</w:t>
-      </w:r>
-    </w:p>
-    <w:p>
-      <w:pPr>
-        <w:spacing w:before="100" w:beforeAutospacing="1" w:after="100" w:afterAutospacing="1" w:line="240" w:lineRule="auto"/>
-        <w:outlineLvl w:val="3"/>
-        <w:rPr>
-          <w:rFonts w:ascii="Times New Roman" w:eastAsia="Times New Roman" w:hAnsi="Times New Roman" w:cs="Times New Roman"/>
-          <w:b/>
-          <w:bCs/>
-          <w:sz w:val="24"/>
-          <w:szCs w:val="24"/>
-        </w:rPr>
-      </w:pPr>
-      <w:r>
-        <w:rPr>
-          <w:rFonts w:ascii="Times New Roman" w:eastAsia="Times New Roman" w:hAnsi="Times New Roman" w:cs="Times New Roman"/>
-          <w:b/>
-          <w:bCs/>
-          <w:sz w:val="24"/>
-          <w:szCs w:val="24"/>
-        </w:rPr>
-        <w:t>Strategy Pattern</w:t>
-      </w:r>
-    </w:p>
-    <w:p>
-      <w:pPr>
-        <w:numPr>
-          <w:ilvl w:val="0"/>
-          <w:numId w:val="3"/>
-        </w:numPr>
-        <w:spacing w:before="100" w:beforeAutospacing="1" w:after="100" w:afterAutospacing="1" w:line="240" w:lineRule="auto"/>
-        <w:rPr>
-          <w:rFonts w:ascii="Times New Roman" w:eastAsia="Times New Roman" w:hAnsi="Times New Roman" w:cs="Times New Roman"/>
-          <w:sz w:val="24"/>
-          <w:szCs w:val="24"/>
-        </w:rPr>
-      </w:pPr>
-      <w:r>
-        <w:rPr>
-          <w:rFonts w:ascii="Times New Roman" w:eastAsia="Times New Roman" w:hAnsi="Times New Roman" w:cs="Times New Roman"/>
-          <w:sz w:val="24"/>
-          <w:szCs w:val="24"/>
-        </w:rPr>
-        <w:t>Dùng để thay đổi cách xử lý đơn hàng</w:t>
-      </w:r>
-    </w:p>
-    <w:p>
-      <w:pPr>
-        <w:numPr>
-          <w:ilvl w:val="0"/>
-          <w:numId w:val="3"/>
-        </w:numPr>
-        <w:spacing w:before="100" w:beforeAutospacing="1" w:after="100" w:afterAutospacing="1" w:line="240" w:lineRule="auto"/>
-        <w:rPr>
-          <w:rFonts w:ascii="Times New Roman" w:eastAsia="Times New Roman" w:hAnsi="Times New Roman" w:cs="Times New Roman"/>
-          <w:sz w:val="24"/>
-          <w:szCs w:val="24"/>
-        </w:rPr>
-      </w:pPr>
-      <w:r>
-        <w:rPr>
-          <w:rFonts w:ascii="Times New Roman" w:eastAsia="Times New Roman" w:hAnsi="Times New Roman" w:cs="Times New Roman"/>
-          <w:sz w:val="24"/>
-          <w:szCs w:val="24"/>
-        </w:rPr>
-        <w:t>Ví dụ: xử lý nhanh hoặc tiêu chuẩn</w:t>
-      </w:r>
-    </w:p>
-    <w:p>
-      <w:pPr>
-        <w:spacing w:before="100" w:beforeAutospacing="1" w:after="100" w:afterAutospacing="1" w:line="240" w:lineRule="auto"/>
-        <w:outlineLvl w:val="3"/>
-        <w:rPr>
-          <w:rFonts w:ascii="Times New Roman" w:eastAsia="Times New Roman" w:hAnsi="Times New Roman" w:cs="Times New Roman"/>
-          <w:b/>
-          <w:bCs/>
-          <w:sz w:val="24"/>
-          <w:szCs w:val="24"/>
-        </w:rPr>
-      </w:pPr>
-      <w:r>
-        <w:rPr>
-          <w:rFonts w:ascii="Times New Roman" w:eastAsia="Times New Roman" w:hAnsi="Times New Roman" w:cs="Times New Roman"/>
-          <w:b/>
-          <w:bCs/>
-          <w:sz w:val="24"/>
-          <w:szCs w:val="24"/>
-        </w:rPr>
-        <w:t>Decorator Pattern</w:t>
-      </w:r>
-    </w:p>
-    <w:p>
-      <w:pPr>
-        <w:numPr>
-          <w:ilvl w:val="0"/>
-          <w:numId w:val="4"/>
-        </w:numPr>
-        <w:spacing w:before="100" w:beforeAutospacing="1" w:after="100" w:afterAutospacing="1" w:line="240" w:lineRule="auto"/>
-        <w:rPr>
-          <w:rFonts w:ascii="Times New Roman" w:eastAsia="Times New Roman" w:hAnsi="Times New Roman" w:cs="Times New Roman"/>
-          <w:sz w:val="24"/>
-          <w:szCs w:val="24"/>
-        </w:rPr>
-      </w:pPr>
-      <w:r>
-        <w:rPr>
-          <w:rFonts w:ascii="Times New Roman" w:eastAsia="Times New Roman" w:hAnsi="Times New Roman" w:cs="Times New Roman"/>
-          <w:sz w:val="24"/>
-          <w:szCs w:val="24"/>
-        </w:rPr>
-        <w:t>Thêm chức năng cho đơn hàng</w:t>
-      </w:r>
-    </w:p>
-    <w:p>
-      <w:pPr>
-        <w:numPr>
-          <w:ilvl w:val="0"/>
-          <w:numId w:val="4"/>
-        </w:numPr>
-        <w:spacing w:before="100" w:beforeAutospacing="1" w:after="100" w:afterAutospacing="1" w:line="240" w:lineRule="auto"/>
-        <w:rPr>
-          <w:rFonts w:ascii="Times New Roman" w:eastAsia="Times New Roman" w:hAnsi="Times New Roman" w:cs="Times New Roman"/>
-          <w:sz w:val="24"/>
-          <w:szCs w:val="24"/>
-        </w:rPr>
-      </w:pPr>
-      <w:r>
-        <w:rPr>
-          <w:rFonts w:ascii="Times New Roman" w:eastAsia="Times New Roman" w:hAnsi="Times New Roman" w:cs="Times New Roman"/>
-          <w:sz w:val="24"/>
-          <w:szCs w:val="24"/>
-        </w:rPr>
-        <w:t>Ví dụ: gói quà, bảo hiểm</w:t>
-      </w:r>
-    </w:p>
-    <w:p>
-      <w:pPr>
-        <w:spacing w:after="0" w:line="240" w:lineRule="auto"/>
-        <w:rPr>
-          <w:rFonts w:ascii="Times New Roman" w:eastAsia="Times New Roman" w:hAnsi="Times New Roman" w:cs="Times New Roman"/>
-          <w:sz w:val="24"/>
-          <w:szCs w:val="24"/>
-        </w:rPr>
-      </w:pPr>
-      <w:r>
-        <w:rPr>
-          <w:rFonts w:ascii="Times New Roman" w:eastAsia="Times New Roman" w:hAnsi="Times New Roman" w:cs="Times New Roman"/>
-          <w:sz w:val="24"/>
-          <w:szCs w:val="24"/>
-        </w:rPr>
-        <w:pict>
-          <v:rect id="_x0000_i1025" style="width:0;height:1.5pt" o:hralign="center" o:hrstd="t" o:hr="t" fillcolor="#a0a0a0" stroked="f"/>
-        </w:pict>
-      </w:r>
-    </w:p>
-    <w:p>
-      <w:pPr>
-        <w:spacing w:before="100" w:beforeAutospacing="1" w:after="100" w:afterAutospacing="1" w:line="240" w:lineRule="auto"/>
-        <w:outlineLvl w:val="2"/>
-        <w:rPr>
-          <w:rFonts w:ascii="Times New Roman" w:eastAsia="Times New Roman" w:hAnsi="Times New Roman" w:cs="Times New Roman"/>
-          <w:b/>
-          <w:bCs/>
-          <w:sz w:val="27"/>
-          <w:szCs w:val="27"/>
-        </w:rPr>
-      </w:pPr>
-      <w:r>
-        <w:rPr>
-          <w:rFonts w:ascii="Times New Roman" w:eastAsia="Times New Roman" w:hAnsi="Times New Roman" w:cs="Times New Roman"/>
-          <w:b/>
-          <w:bCs/>
-          <w:sz w:val="27"/>
-          <w:szCs w:val="27"/>
-        </w:rPr>
-        <w:t>3</w:t>
-      </w:r>
-      <w:r>
-        <w:rPr>
-          <w:rFonts w:ascii="Times New Roman" w:eastAsia="Times New Roman" w:hAnsi="Times New Roman" w:cs="Times New Roman"/>
-          <w:b/>
-          <w:bCs/>
-          <w:sz w:val="27"/>
-          <w:szCs w:val="27"/>
-        </w:rPr>
-        <w:t>.</w:t>
-      </w:r>
-      <w:r>
-        <w:rPr>
-          <w:rFonts w:ascii="Times New Roman" w:eastAsia="Times New Roman" w:hAnsi="Times New Roman" w:cs="Times New Roman"/>
-          <w:b/>
-          <w:bCs/>
-          <w:sz w:val="27"/>
-          <w:szCs w:val="27"/>
-        </w:rPr>
-        <w:t xml:space="preserve"> Kết quả</w:t>
-      </w:r>
-    </w:p>
-    <w:p>
-      <w:pPr>
-        <w:numPr>
-          <w:ilvl w:val="0"/>
-          <w:numId w:val="5"/>
-        </w:numPr>
-        <w:spacing w:before="100" w:beforeAutospacing="1" w:after="100" w:afterAutospacing="1" w:line="240" w:lineRule="auto"/>
-        <w:rPr>
-          <w:rFonts w:ascii="Times New Roman" w:eastAsia="Times New Roman" w:hAnsi="Times New Roman" w:cs="Times New Roman"/>
-          <w:sz w:val="24"/>
-          <w:szCs w:val="24"/>
-        </w:rPr>
-      </w:pPr>
-      <w:r>
-        <w:rPr>
-          <w:rFonts w:ascii="Times New Roman" w:eastAsia="Times New Roman" w:hAnsi="Times New Roman" w:cs="Times New Roman"/>
-          <w:sz w:val="24"/>
-          <w:szCs w:val="24"/>
-        </w:rPr>
-        <w:t>Hệ thống dễ mở rộng</w:t>
-      </w:r>
-    </w:p>
-    <w:p>
-      <w:pPr>
-        <w:numPr>
-          <w:ilvl w:val="0"/>
-          <w:numId w:val="5"/>
-        </w:numPr>
-        <w:spacing w:before="100" w:beforeAutospacing="1" w:after="100" w:afterAutospacing="1" w:line="240" w:lineRule="auto"/>
-        <w:rPr>
-          <w:rFonts w:ascii="Times New Roman" w:eastAsia="Times New Roman" w:hAnsi="Times New Roman" w:cs="Times New Roman"/>
-          <w:sz w:val="24"/>
-          <w:szCs w:val="24"/>
-        </w:rPr>
-      </w:pPr>
-      <w:r>
-        <w:rPr>
-          <w:rFonts w:ascii="Times New Roman" w:eastAsia="Times New Roman" w:hAnsi="Times New Roman" w:cs="Times New Roman"/>
-          <w:sz w:val="24"/>
-          <w:szCs w:val="24"/>
-        </w:rPr>
-        <w:t>Có thể thêm trạng thái mới mà không sửa code cũ</w:t>
-      </w:r>
-    </w:p>
-    <w:p>
-      <w:pPr>
-        <w:numPr>
-          <w:ilvl w:val="0"/>
-          <w:numId w:val="5"/>
-        </w:numPr>
-        <w:spacing w:before="100" w:beforeAutospacing="1" w:after="100" w:afterAutospacing="1" w:line="240" w:lineRule="auto"/>
-        <w:rPr>
-          <w:rFonts w:ascii="Times New Roman" w:eastAsia="Times New Roman" w:hAnsi="Times New Roman" w:cs="Times New Roman"/>
-          <w:sz w:val="24"/>
-          <w:szCs w:val="24"/>
-        </w:rPr>
-      </w:pPr>
-      <w:r>
-        <w:rPr>
-          <w:rFonts w:ascii="Times New Roman" w:eastAsia="Times New Roman" w:hAnsi="Times New Roman" w:cs="Times New Roman"/>
-          <w:sz w:val="24"/>
-          <w:szCs w:val="24"/>
-        </w:rPr>
-        <w:t>Linh hoạt khi thêm tính năng</w:t>
-      </w:r>
-    </w:p>
-    <w:p>
-      <w:pPr>
-        <w:spacing w:before="100" w:beforeAutospacing="1" w:after="100" w:afterAutospacing="1" w:line="240" w:lineRule="auto"/>
-        <w:ind w:left="360"/>
-        <w:rPr>
-          <w:rFonts w:ascii="Times New Roman" w:eastAsia="Times New Roman" w:hAnsi="Times New Roman" w:cs="Times New Roman"/>
-          <w:sz w:val="24"/>
-          <w:szCs w:val="24"/>
-        </w:rPr>
-      </w:pPr>
-      <w:bookmarkStart w:id="0" w:name="_GoBack"/>
-      <w:r>
-        <w:rPr>
-          <w:rFonts w:ascii="Times New Roman" w:eastAsia="Times New Roman" w:hAnsi="Times New Roman" w:cs="Times New Roman"/>
-          <w:sz w:val="24"/>
-          <w:szCs w:val="24"/>
-        </w:rPr>
-        <w:lastRenderedPageBreak/>
+        <w:rPr>
+          <w:rFonts w:ascii="Times New Roman" w:eastAsia="Times New Roman" w:hAnsi="Times New Roman" w:cs="Times New Roman"/>
+          <w:b/>
+          <w:sz w:val="24"/>
+          <w:szCs w:val="24"/>
+        </w:rPr>
+      </w:pPr>
+      <w:r>
+        <w:rPr>
+          <w:rFonts w:ascii="Times New Roman" w:eastAsia="Times New Roman" w:hAnsi="Times New Roman" w:cs="Times New Roman"/>
+          <w:b/>
+          <w:sz w:val="24"/>
+          <w:szCs w:val="24"/>
+        </w:rPr>
+        <w:t>UML</w:t>
+      </w:r>
+    </w:p>
+    <w:p>
+      <w:pPr>
+        <w:spacing w:before="100" w:beforeAutospacing="1" w:after="100" w:afterAutospacing="1" w:line="240" w:lineRule="auto"/>
+        <w:rPr>
+          <w:rFonts w:ascii="Times New Roman" w:eastAsia="Times New Roman" w:hAnsi="Times New Roman" w:cs="Times New Roman"/>
+          <w:b/>
+          <w:sz w:val="24"/>
+          <w:szCs w:val="24"/>
+        </w:rPr>
+      </w:pPr>
+      <w:r>
+        <w:rPr>
+          <w:rFonts w:ascii="Times New Roman" w:eastAsia="Times New Roman" w:hAnsi="Times New Roman" w:cs="Times New Roman"/>
+          <w:b/>
+          <w:sz w:val="24"/>
+          <w:szCs w:val="24"/>
+        </w:rPr>
         <w:drawing>
-          <wp:inline distT="0" distB="0" distL="0" distR="0" wp14:anchorId="7D94F1CF" wp14:editId="44D9BD85">
-            <wp:extent cx="5943600" cy="3343275"/>
-            <wp:effectExtent l="0" t="0" r="0" b="9525"/>
-            <wp:docPr id="1" name="Picture 1"/>
+          <wp:inline distT="0" distB="0" distL="0" distR="0" wp14:anchorId="5A3E57D9" wp14:editId="0B095341">
+            <wp:extent cx="5943600" cy="1796415"/>
+            <wp:effectExtent l="0" t="0" r="0" b="0"/>
+            <wp:docPr id="3" name="Picture 3"/>
             <wp:cNvGraphicFramePr>
               <a:graphicFrameLocks xmlns:a="http://schemas.openxmlformats.org/drawingml/2006/main" noChangeAspect="1"/>
             </wp:cNvGraphicFramePr>
@@ -632,6 +266,445 @@
                   <pic:spPr>
                     <a:xfrm>
                       <a:off x="0" y="0"/>
+                      <a:ext cx="5943600" cy="1796415"/>
+                    </a:xfrm>
+                    <a:prstGeom prst="rect">
+                      <a:avLst/>
+                    </a:prstGeom>
+                  </pic:spPr>
+                </pic:pic>
+              </a:graphicData>
+            </a:graphic>
+          </wp:inline>
+        </w:drawing>
+      </w:r>
+    </w:p>
+    <w:p>
+      <w:pPr>
+        <w:spacing w:before="100" w:beforeAutospacing="1" w:after="100" w:afterAutospacing="1" w:line="240" w:lineRule="auto"/>
+        <w:outlineLvl w:val="2"/>
+        <w:rPr>
+          <w:rFonts w:ascii="Times New Roman" w:eastAsia="Times New Roman" w:hAnsi="Times New Roman" w:cs="Times New Roman"/>
+          <w:b/>
+          <w:bCs/>
+          <w:sz w:val="27"/>
+          <w:szCs w:val="27"/>
+        </w:rPr>
+      </w:pPr>
+      <w:r>
+        <w:rPr>
+          <w:rFonts w:ascii="Times New Roman" w:eastAsia="Times New Roman" w:hAnsi="Times New Roman" w:cs="Times New Roman"/>
+          <w:b/>
+          <w:bCs/>
+          <w:sz w:val="27"/>
+          <w:szCs w:val="27"/>
+        </w:rPr>
+        <w:t>2.</w:t>
+      </w:r>
+      <w:r>
+        <w:rPr>
+          <w:rFonts w:ascii="Times New Roman" w:eastAsia="Times New Roman" w:hAnsi="Times New Roman" w:cs="Times New Roman"/>
+          <w:b/>
+          <w:bCs/>
+          <w:sz w:val="27"/>
+          <w:szCs w:val="27"/>
+        </w:rPr>
+        <w:t xml:space="preserve"> Áp dụng Design Pattern</w:t>
+      </w:r>
+    </w:p>
+    <w:p>
+      <w:pPr>
+        <w:spacing w:before="100" w:beforeAutospacing="1" w:after="100" w:afterAutospacing="1" w:line="240" w:lineRule="auto"/>
+        <w:outlineLvl w:val="3"/>
+        <w:rPr>
+          <w:rFonts w:ascii="Times New Roman" w:eastAsia="Times New Roman" w:hAnsi="Times New Roman" w:cs="Times New Roman"/>
+          <w:b/>
+          <w:bCs/>
+          <w:sz w:val="24"/>
+          <w:szCs w:val="24"/>
+        </w:rPr>
+      </w:pPr>
+      <w:r>
+        <w:rPr>
+          <w:rFonts w:ascii="Times New Roman" w:eastAsia="Times New Roman" w:hAnsi="Times New Roman" w:cs="Times New Roman"/>
+          <w:b/>
+          <w:bCs/>
+          <w:sz w:val="24"/>
+          <w:szCs w:val="24"/>
+        </w:rPr>
+        <w:t>State Pattern</w:t>
+      </w:r>
+    </w:p>
+    <w:p>
+      <w:pPr>
+        <w:numPr>
+          <w:ilvl w:val="0"/>
+          <w:numId w:val="2"/>
+        </w:numPr>
+        <w:spacing w:before="100" w:beforeAutospacing="1" w:after="100" w:afterAutospacing="1" w:line="240" w:lineRule="auto"/>
+        <w:rPr>
+          <w:rFonts w:ascii="Times New Roman" w:eastAsia="Times New Roman" w:hAnsi="Times New Roman" w:cs="Times New Roman"/>
+          <w:sz w:val="24"/>
+          <w:szCs w:val="24"/>
+        </w:rPr>
+      </w:pPr>
+      <w:r>
+        <w:rPr>
+          <w:rFonts w:ascii="Times New Roman" w:eastAsia="Times New Roman" w:hAnsi="Times New Roman" w:cs="Times New Roman"/>
+          <w:sz w:val="24"/>
+          <w:szCs w:val="24"/>
+        </w:rPr>
+        <w:t>Dùng để quản lý trạng thái đơn hàng</w:t>
+      </w:r>
+    </w:p>
+    <w:p>
+      <w:pPr>
+        <w:numPr>
+          <w:ilvl w:val="0"/>
+          <w:numId w:val="2"/>
+        </w:numPr>
+        <w:spacing w:before="100" w:beforeAutospacing="1" w:after="100" w:afterAutospacing="1" w:line="240" w:lineRule="auto"/>
+        <w:rPr>
+          <w:rFonts w:ascii="Times New Roman" w:eastAsia="Times New Roman" w:hAnsi="Times New Roman" w:cs="Times New Roman"/>
+          <w:sz w:val="24"/>
+          <w:szCs w:val="24"/>
+        </w:rPr>
+      </w:pPr>
+      <w:r>
+        <w:rPr>
+          <w:rFonts w:ascii="Times New Roman" w:eastAsia="Times New Roman" w:hAnsi="Times New Roman" w:cs="Times New Roman"/>
+          <w:sz w:val="24"/>
+          <w:szCs w:val="24"/>
+        </w:rPr>
+        <w:t>Mỗi trạng thái là một class riêng</w:t>
+      </w:r>
+    </w:p>
+    <w:p>
+      <w:pPr>
+        <w:numPr>
+          <w:ilvl w:val="0"/>
+          <w:numId w:val="2"/>
+        </w:numPr>
+        <w:spacing w:before="100" w:beforeAutospacing="1" w:after="100" w:afterAutospacing="1" w:line="240" w:lineRule="auto"/>
+        <w:rPr>
+          <w:rFonts w:ascii="Times New Roman" w:eastAsia="Times New Roman" w:hAnsi="Times New Roman" w:cs="Times New Roman"/>
+          <w:sz w:val="24"/>
+          <w:szCs w:val="24"/>
+        </w:rPr>
+      </w:pPr>
+      <w:r>
+        <w:rPr>
+          <w:rFonts w:ascii="Times New Roman" w:eastAsia="Times New Roman" w:hAnsi="Times New Roman" w:cs="Times New Roman"/>
+          <w:sz w:val="24"/>
+          <w:szCs w:val="24"/>
+        </w:rPr>
+        <w:t>Tránh sử dụng if-else phức tạp</w:t>
+      </w:r>
+    </w:p>
+    <w:p>
+      <w:pPr>
+        <w:spacing w:before="100" w:beforeAutospacing="1" w:after="100" w:afterAutospacing="1" w:line="240" w:lineRule="auto"/>
+        <w:outlineLvl w:val="3"/>
+        <w:rPr>
+          <w:rFonts w:ascii="Times New Roman" w:eastAsia="Times New Roman" w:hAnsi="Times New Roman" w:cs="Times New Roman"/>
+          <w:b/>
+          <w:bCs/>
+          <w:sz w:val="24"/>
+          <w:szCs w:val="24"/>
+        </w:rPr>
+      </w:pPr>
+      <w:r>
+        <w:rPr>
+          <w:rFonts w:ascii="Times New Roman" w:eastAsia="Times New Roman" w:hAnsi="Times New Roman" w:cs="Times New Roman"/>
+          <w:b/>
+          <w:bCs/>
+          <w:sz w:val="24"/>
+          <w:szCs w:val="24"/>
+        </w:rPr>
+        <w:t>Strategy Pattern</w:t>
+      </w:r>
+    </w:p>
+    <w:p>
+      <w:pPr>
+        <w:numPr>
+          <w:ilvl w:val="0"/>
+          <w:numId w:val="3"/>
+        </w:numPr>
+        <w:spacing w:before="100" w:beforeAutospacing="1" w:after="100" w:afterAutospacing="1" w:line="240" w:lineRule="auto"/>
+        <w:rPr>
+          <w:rFonts w:ascii="Times New Roman" w:eastAsia="Times New Roman" w:hAnsi="Times New Roman" w:cs="Times New Roman"/>
+          <w:sz w:val="24"/>
+          <w:szCs w:val="24"/>
+        </w:rPr>
+      </w:pPr>
+      <w:r>
+        <w:rPr>
+          <w:rFonts w:ascii="Times New Roman" w:eastAsia="Times New Roman" w:hAnsi="Times New Roman" w:cs="Times New Roman"/>
+          <w:sz w:val="24"/>
+          <w:szCs w:val="24"/>
+        </w:rPr>
+        <w:t>Dùng để thay đổi cách xử lý đơn hàng</w:t>
+      </w:r>
+    </w:p>
+    <w:p>
+      <w:pPr>
+        <w:numPr>
+          <w:ilvl w:val="0"/>
+          <w:numId w:val="3"/>
+        </w:numPr>
+        <w:spacing w:before="100" w:beforeAutospacing="1" w:after="100" w:afterAutospacing="1" w:line="240" w:lineRule="auto"/>
+        <w:rPr>
+          <w:rFonts w:ascii="Times New Roman" w:eastAsia="Times New Roman" w:hAnsi="Times New Roman" w:cs="Times New Roman"/>
+          <w:sz w:val="24"/>
+          <w:szCs w:val="24"/>
+        </w:rPr>
+      </w:pPr>
+      <w:r>
+        <w:rPr>
+          <w:rFonts w:ascii="Times New Roman" w:eastAsia="Times New Roman" w:hAnsi="Times New Roman" w:cs="Times New Roman"/>
+          <w:sz w:val="24"/>
+          <w:szCs w:val="24"/>
+        </w:rPr>
+        <w:t>Ví dụ: xử lý nhanh hoặc tiêu chuẩn</w:t>
+      </w:r>
+    </w:p>
+    <w:p>
+      <w:pPr>
+        <w:spacing w:before="100" w:beforeAutospacing="1" w:after="100" w:afterAutospacing="1" w:line="240" w:lineRule="auto"/>
+        <w:outlineLvl w:val="3"/>
+        <w:rPr>
+          <w:rFonts w:ascii="Times New Roman" w:eastAsia="Times New Roman" w:hAnsi="Times New Roman" w:cs="Times New Roman"/>
+          <w:b/>
+          <w:bCs/>
+          <w:sz w:val="24"/>
+          <w:szCs w:val="24"/>
+        </w:rPr>
+      </w:pPr>
+      <w:r>
+        <w:rPr>
+          <w:rFonts w:ascii="Times New Roman" w:eastAsia="Times New Roman" w:hAnsi="Times New Roman" w:cs="Times New Roman"/>
+          <w:b/>
+          <w:bCs/>
+          <w:sz w:val="24"/>
+          <w:szCs w:val="24"/>
+        </w:rPr>
+        <w:t>Decorator Pattern</w:t>
+      </w:r>
+    </w:p>
+    <w:p>
+      <w:pPr>
+        <w:numPr>
+          <w:ilvl w:val="0"/>
+          <w:numId w:val="4"/>
+        </w:numPr>
+        <w:spacing w:before="100" w:beforeAutospacing="1" w:after="100" w:afterAutospacing="1" w:line="240" w:lineRule="auto"/>
+        <w:rPr>
+          <w:rFonts w:ascii="Times New Roman" w:eastAsia="Times New Roman" w:hAnsi="Times New Roman" w:cs="Times New Roman"/>
+          <w:sz w:val="24"/>
+          <w:szCs w:val="24"/>
+        </w:rPr>
+      </w:pPr>
+      <w:r>
+        <w:rPr>
+          <w:rFonts w:ascii="Times New Roman" w:eastAsia="Times New Roman" w:hAnsi="Times New Roman" w:cs="Times New Roman"/>
+          <w:sz w:val="24"/>
+          <w:szCs w:val="24"/>
+        </w:rPr>
+        <w:t>Thêm chức năng cho đơn hàng</w:t>
+      </w:r>
+    </w:p>
+    <w:p>
+      <w:pPr>
+        <w:numPr>
+          <w:ilvl w:val="0"/>
+          <w:numId w:val="4"/>
+        </w:numPr>
+        <w:spacing w:before="100" w:beforeAutospacing="1" w:after="100" w:afterAutospacing="1" w:line="240" w:lineRule="auto"/>
+        <w:rPr>
+          <w:rFonts w:ascii="Times New Roman" w:eastAsia="Times New Roman" w:hAnsi="Times New Roman" w:cs="Times New Roman"/>
+          <w:sz w:val="24"/>
+          <w:szCs w:val="24"/>
+        </w:rPr>
+      </w:pPr>
+      <w:r>
+        <w:rPr>
+          <w:rFonts w:ascii="Times New Roman" w:eastAsia="Times New Roman" w:hAnsi="Times New Roman" w:cs="Times New Roman"/>
+          <w:sz w:val="24"/>
+          <w:szCs w:val="24"/>
+        </w:rPr>
+        <w:t>Ví dụ: gói quà, bảo hiểm</w:t>
+      </w:r>
+    </w:p>
+    <w:p>
+      <w:pPr>
+        <w:spacing w:after="0" w:line="240" w:lineRule="auto"/>
+        <w:rPr>
+          <w:rFonts w:ascii="Times New Roman" w:eastAsia="Times New Roman" w:hAnsi="Times New Roman" w:cs="Times New Roman"/>
+          <w:sz w:val="24"/>
+          <w:szCs w:val="24"/>
+        </w:rPr>
+      </w:pPr>
+      <w:r>
+        <w:rPr>
+          <w:rFonts w:ascii="Times New Roman" w:eastAsia="Times New Roman" w:hAnsi="Times New Roman" w:cs="Times New Roman"/>
+          <w:sz w:val="24"/>
+          <w:szCs w:val="24"/>
+        </w:rPr>
+        <w:lastRenderedPageBreak/>
+        <w:pict>
+          <v:rect id="_x0000_i1025" style="width:0;height:1.5pt" o:hralign="center" o:hrstd="t" o:hr="t" fillcolor="#a0a0a0" stroked="f"/>
+        </w:pict>
+      </w:r>
+    </w:p>
+    <w:p>
+      <w:pPr>
+        <w:spacing w:before="100" w:beforeAutospacing="1" w:after="100" w:afterAutospacing="1" w:line="240" w:lineRule="auto"/>
+        <w:outlineLvl w:val="2"/>
+        <w:rPr>
+          <w:rFonts w:ascii="Times New Roman" w:eastAsia="Times New Roman" w:hAnsi="Times New Roman" w:cs="Times New Roman"/>
+          <w:b/>
+          <w:bCs/>
+          <w:sz w:val="27"/>
+          <w:szCs w:val="27"/>
+        </w:rPr>
+      </w:pPr>
+      <w:r>
+        <w:rPr>
+          <w:rFonts w:ascii="Times New Roman" w:eastAsia="Times New Roman" w:hAnsi="Times New Roman" w:cs="Times New Roman"/>
+          <w:b/>
+          <w:bCs/>
+          <w:sz w:val="27"/>
+          <w:szCs w:val="27"/>
+        </w:rPr>
+        <w:t>3</w:t>
+      </w:r>
+      <w:r>
+        <w:rPr>
+          <w:rFonts w:ascii="Times New Roman" w:eastAsia="Times New Roman" w:hAnsi="Times New Roman" w:cs="Times New Roman"/>
+          <w:b/>
+          <w:bCs/>
+          <w:sz w:val="27"/>
+          <w:szCs w:val="27"/>
+        </w:rPr>
+        <w:t>.</w:t>
+      </w:r>
+      <w:r>
+        <w:rPr>
+          <w:rFonts w:ascii="Times New Roman" w:eastAsia="Times New Roman" w:hAnsi="Times New Roman" w:cs="Times New Roman"/>
+          <w:b/>
+          <w:bCs/>
+          <w:sz w:val="27"/>
+          <w:szCs w:val="27"/>
+        </w:rPr>
+        <w:t xml:space="preserve"> Kết quả</w:t>
+      </w:r>
+    </w:p>
+    <w:p>
+      <w:pPr>
+        <w:numPr>
+          <w:ilvl w:val="0"/>
+          <w:numId w:val="5"/>
+        </w:numPr>
+        <w:spacing w:before="100" w:beforeAutospacing="1" w:after="100" w:afterAutospacing="1" w:line="240" w:lineRule="auto"/>
+        <w:rPr>
+          <w:rFonts w:ascii="Times New Roman" w:eastAsia="Times New Roman" w:hAnsi="Times New Roman" w:cs="Times New Roman"/>
+          <w:sz w:val="24"/>
+          <w:szCs w:val="24"/>
+        </w:rPr>
+      </w:pPr>
+      <w:r>
+        <w:rPr>
+          <w:rFonts w:ascii="Times New Roman" w:eastAsia="Times New Roman" w:hAnsi="Times New Roman" w:cs="Times New Roman"/>
+          <w:sz w:val="24"/>
+          <w:szCs w:val="24"/>
+        </w:rPr>
+        <w:t>Hệ thống dễ mở rộng</w:t>
+      </w:r>
+    </w:p>
+    <w:p>
+      <w:pPr>
+        <w:numPr>
+          <w:ilvl w:val="0"/>
+          <w:numId w:val="5"/>
+        </w:numPr>
+        <w:spacing w:before="100" w:beforeAutospacing="1" w:after="100" w:afterAutospacing="1" w:line="240" w:lineRule="auto"/>
+        <w:rPr>
+          <w:rFonts w:ascii="Times New Roman" w:eastAsia="Times New Roman" w:hAnsi="Times New Roman" w:cs="Times New Roman"/>
+          <w:sz w:val="24"/>
+          <w:szCs w:val="24"/>
+        </w:rPr>
+      </w:pPr>
+      <w:r>
+        <w:rPr>
+          <w:rFonts w:ascii="Times New Roman" w:eastAsia="Times New Roman" w:hAnsi="Times New Roman" w:cs="Times New Roman"/>
+          <w:sz w:val="24"/>
+          <w:szCs w:val="24"/>
+        </w:rPr>
+        <w:t>Có thể thêm trạng thái mới mà không sửa code cũ</w:t>
+      </w:r>
+    </w:p>
+    <w:p>
+      <w:pPr>
+        <w:numPr>
+          <w:ilvl w:val="0"/>
+          <w:numId w:val="5"/>
+        </w:numPr>
+        <w:spacing w:before="100" w:beforeAutospacing="1" w:after="100" w:afterAutospacing="1" w:line="240" w:lineRule="auto"/>
+        <w:rPr>
+          <w:rFonts w:ascii="Times New Roman" w:eastAsia="Times New Roman" w:hAnsi="Times New Roman" w:cs="Times New Roman"/>
+          <w:sz w:val="24"/>
+          <w:szCs w:val="24"/>
+        </w:rPr>
+      </w:pPr>
+      <w:r>
+        <w:rPr>
+          <w:rFonts w:ascii="Times New Roman" w:eastAsia="Times New Roman" w:hAnsi="Times New Roman" w:cs="Times New Roman"/>
+          <w:sz w:val="24"/>
+          <w:szCs w:val="24"/>
+        </w:rPr>
+        <w:t>Linh hoạt khi thêm tính năng</w:t>
+      </w:r>
+    </w:p>
+    <w:p>
+      <w:pPr>
+        <w:spacing w:before="100" w:beforeAutospacing="1" w:after="100" w:afterAutospacing="1" w:line="240" w:lineRule="auto"/>
+        <w:ind w:left="360"/>
+        <w:rPr>
+          <w:rFonts w:ascii="Times New Roman" w:eastAsia="Times New Roman" w:hAnsi="Times New Roman" w:cs="Times New Roman"/>
+          <w:sz w:val="24"/>
+          <w:szCs w:val="24"/>
+        </w:rPr>
+      </w:pPr>
+      <w:r>
+        <w:rPr>
+          <w:rFonts w:ascii="Times New Roman" w:eastAsia="Times New Roman" w:hAnsi="Times New Roman" w:cs="Times New Roman"/>
+          <w:sz w:val="24"/>
+          <w:szCs w:val="24"/>
+        </w:rPr>
+        <w:drawing>
+          <wp:inline distT="0" distB="0" distL="0" distR="0" wp14:anchorId="7D94F1CF" wp14:editId="44D9BD85">
+            <wp:extent cx="5943600" cy="3343275"/>
+            <wp:effectExtent l="0" t="0" r="0" b="9525"/>
+            <wp:docPr id="1" name="Picture 1"/>
+            <wp:cNvGraphicFramePr>
+              <a:graphicFrameLocks xmlns:a="http://schemas.openxmlformats.org/drawingml/2006/main" noChangeAspect="1"/>
+            </wp:cNvGraphicFramePr>
+            <a:graphic xmlns:a="http://schemas.openxmlformats.org/drawingml/2006/main">
+              <a:graphicData uri="http://schemas.openxmlformats.org/drawingml/2006/picture">
+                <pic:pic xmlns:pic="http://schemas.openxmlformats.org/drawingml/2006/picture">
+                  <pic:nvPicPr>
+                    <pic:cNvPr id="1" name=""/>
+                    <pic:cNvPicPr/>
+                  </pic:nvPicPr>
+                  <pic:blipFill>
+                    <a:blip r:embed="rId6"/>
+                    <a:stretch>
+                      <a:fillRect/>
+                    </a:stretch>
+                  </pic:blipFill>
+                  <pic:spPr>
+                    <a:xfrm>
+                      <a:off x="0" y="0"/>
                       <a:ext cx="5943600" cy="3343275"/>
                     </a:xfrm>
                     <a:prstGeom prst="rect">
@@ -644,42 +717,643 @@
           </wp:inline>
         </w:drawing>
       </w:r>
+    </w:p>
+    <w:p>
+      <w:pPr>
+        <w:spacing w:before="100" w:beforeAutospacing="1" w:after="100" w:afterAutospacing="1" w:line="240" w:lineRule="auto"/>
+        <w:outlineLvl w:val="1"/>
+        <w:rPr>
+          <w:rFonts w:ascii="Times New Roman" w:eastAsia="Times New Roman" w:hAnsi="Times New Roman" w:cs="Times New Roman"/>
+          <w:b/>
+          <w:bCs/>
+          <w:sz w:val="36"/>
+          <w:szCs w:val="36"/>
+        </w:rPr>
+      </w:pPr>
+      <w:r>
+        <w:rPr>
+          <w:rFonts w:ascii="Times New Roman" w:eastAsia="Times New Roman" w:hAnsi="Times New Roman" w:cs="Times New Roman"/>
+          <w:b/>
+          <w:bCs/>
+          <w:sz w:val="36"/>
+          <w:szCs w:val="36"/>
+        </w:rPr>
+        <w:t>Bài 2 – Tính toán thuế sản phẩm</w:t>
+      </w:r>
+    </w:p>
+    <w:p>
+      <w:pPr>
+        <w:spacing w:before="100" w:beforeAutospacing="1" w:after="100" w:afterAutospacing="1" w:line="240" w:lineRule="auto"/>
+        <w:outlineLvl w:val="2"/>
+        <w:rPr>
+          <w:rFonts w:ascii="Times New Roman" w:eastAsia="Times New Roman" w:hAnsi="Times New Roman" w:cs="Times New Roman"/>
+          <w:b/>
+          <w:bCs/>
+          <w:sz w:val="27"/>
+          <w:szCs w:val="27"/>
+        </w:rPr>
+      </w:pPr>
+      <w:r>
+        <w:rPr>
+          <w:rFonts w:ascii="Times New Roman" w:eastAsia="Times New Roman" w:hAnsi="Times New Roman" w:cs="Times New Roman"/>
+          <w:b/>
+          <w:bCs/>
+          <w:sz w:val="27"/>
+          <w:szCs w:val="27"/>
+        </w:rPr>
+        <w:t>1</w:t>
+      </w:r>
+      <w:r>
+        <w:rPr>
+          <w:rFonts w:ascii="Times New Roman" w:eastAsia="Times New Roman" w:hAnsi="Times New Roman" w:cs="Times New Roman"/>
+          <w:b/>
+          <w:bCs/>
+          <w:sz w:val="27"/>
+          <w:szCs w:val="27"/>
+        </w:rPr>
+        <w:t>.</w:t>
+      </w:r>
+      <w:r>
+        <w:rPr>
+          <w:rFonts w:ascii="Times New Roman" w:eastAsia="Times New Roman" w:hAnsi="Times New Roman" w:cs="Times New Roman"/>
+          <w:b/>
+          <w:bCs/>
+          <w:sz w:val="27"/>
+          <w:szCs w:val="27"/>
+        </w:rPr>
+        <w:t xml:space="preserve"> Mô tả</w:t>
+      </w:r>
+    </w:p>
+    <w:p>
+      <w:pPr>
+        <w:spacing w:before="100" w:beforeAutospacing="1" w:after="100" w:afterAutospacing="1" w:line="240" w:lineRule="auto"/>
+        <w:rPr>
+          <w:rFonts w:ascii="Times New Roman" w:eastAsia="Times New Roman" w:hAnsi="Times New Roman" w:cs="Times New Roman"/>
+          <w:sz w:val="24"/>
+          <w:szCs w:val="24"/>
+        </w:rPr>
+      </w:pPr>
+      <w:r>
+        <w:rPr>
+          <w:rFonts w:ascii="Times New Roman" w:eastAsia="Times New Roman" w:hAnsi="Times New Roman" w:cs="Times New Roman"/>
+          <w:sz w:val="24"/>
+          <w:szCs w:val="24"/>
+        </w:rPr>
+        <w:t>Các sản phẩm có thể áp dụng nhiều loại thuế:</w:t>
+      </w:r>
+    </w:p>
+    <w:p>
+      <w:pPr>
+        <w:numPr>
+          <w:ilvl w:val="0"/>
+          <w:numId w:val="6"/>
+        </w:numPr>
+        <w:spacing w:before="100" w:beforeAutospacing="1" w:after="100" w:afterAutospacing="1" w:line="240" w:lineRule="auto"/>
+        <w:rPr>
+          <w:rFonts w:ascii="Times New Roman" w:eastAsia="Times New Roman" w:hAnsi="Times New Roman" w:cs="Times New Roman"/>
+          <w:sz w:val="24"/>
+          <w:szCs w:val="24"/>
+        </w:rPr>
+      </w:pPr>
+      <w:r>
+        <w:rPr>
+          <w:rFonts w:ascii="Times New Roman" w:eastAsia="Times New Roman" w:hAnsi="Times New Roman" w:cs="Times New Roman"/>
+          <w:sz w:val="24"/>
+          <w:szCs w:val="24"/>
+        </w:rPr>
+        <w:t>VAT</w:t>
+      </w:r>
+    </w:p>
+    <w:p>
+      <w:pPr>
+        <w:numPr>
+          <w:ilvl w:val="0"/>
+          <w:numId w:val="6"/>
+        </w:numPr>
+        <w:spacing w:before="100" w:beforeAutospacing="1" w:after="100" w:afterAutospacing="1" w:line="240" w:lineRule="auto"/>
+        <w:rPr>
+          <w:rFonts w:ascii="Times New Roman" w:eastAsia="Times New Roman" w:hAnsi="Times New Roman" w:cs="Times New Roman"/>
+          <w:sz w:val="24"/>
+          <w:szCs w:val="24"/>
+        </w:rPr>
+      </w:pPr>
+      <w:r>
+        <w:rPr>
+          <w:rFonts w:ascii="Times New Roman" w:eastAsia="Times New Roman" w:hAnsi="Times New Roman" w:cs="Times New Roman"/>
+          <w:sz w:val="24"/>
+          <w:szCs w:val="24"/>
+        </w:rPr>
+        <w:t>Thuế tiêu thụ</w:t>
+      </w:r>
+    </w:p>
+    <w:p>
+      <w:pPr>
+        <w:numPr>
+          <w:ilvl w:val="0"/>
+          <w:numId w:val="6"/>
+        </w:numPr>
+        <w:spacing w:before="100" w:beforeAutospacing="1" w:after="100" w:afterAutospacing="1" w:line="240" w:lineRule="auto"/>
+        <w:rPr>
+          <w:rFonts w:ascii="Times New Roman" w:eastAsia="Times New Roman" w:hAnsi="Times New Roman" w:cs="Times New Roman"/>
+          <w:sz w:val="24"/>
+          <w:szCs w:val="24"/>
+        </w:rPr>
+      </w:pPr>
+      <w:r>
+        <w:rPr>
+          <w:rFonts w:ascii="Times New Roman" w:eastAsia="Times New Roman" w:hAnsi="Times New Roman" w:cs="Times New Roman"/>
+          <w:sz w:val="24"/>
+          <w:szCs w:val="24"/>
+        </w:rPr>
+        <w:t>Thuế xa xỉ</w:t>
+      </w:r>
+    </w:p>
+    <w:p>
+      <w:pPr>
+        <w:spacing w:after="0" w:line="240" w:lineRule="auto"/>
+        <w:rPr>
+          <w:rFonts w:ascii="Times New Roman" w:eastAsia="Times New Roman" w:hAnsi="Times New Roman" w:cs="Times New Roman"/>
+          <w:b/>
+          <w:sz w:val="24"/>
+          <w:szCs w:val="24"/>
+        </w:rPr>
+      </w:pPr>
+      <w:r>
+        <w:rPr>
+          <w:rFonts w:ascii="Times New Roman" w:eastAsia="Times New Roman" w:hAnsi="Times New Roman" w:cs="Times New Roman"/>
+          <w:b/>
+          <w:sz w:val="24"/>
+          <w:szCs w:val="24"/>
+        </w:rPr>
+        <w:t>UML:</w:t>
+      </w:r>
+    </w:p>
+    <w:p>
+      <w:pPr>
+        <w:spacing w:after="0" w:line="240" w:lineRule="auto"/>
+        <w:rPr>
+          <w:rFonts w:ascii="Times New Roman" w:eastAsia="Times New Roman" w:hAnsi="Times New Roman" w:cs="Times New Roman"/>
+          <w:b/>
+          <w:sz w:val="24"/>
+          <w:szCs w:val="24"/>
+        </w:rPr>
+      </w:pPr>
+      <w:r>
+        <w:rPr>
+          <w:rFonts w:ascii="Times New Roman" w:eastAsia="Times New Roman" w:hAnsi="Times New Roman" w:cs="Times New Roman"/>
+          <w:b/>
+          <w:sz w:val="24"/>
+          <w:szCs w:val="24"/>
+        </w:rPr>
+        <w:lastRenderedPageBreak/>
+        <w:drawing>
+          <wp:inline distT="0" distB="0" distL="0" distR="0" wp14:anchorId="417AD7BB" wp14:editId="1B14820F">
+            <wp:extent cx="5943600" cy="1588770"/>
+            <wp:effectExtent l="0" t="0" r="0" b="0"/>
+            <wp:docPr id="4" name="Picture 4"/>
+            <wp:cNvGraphicFramePr>
+              <a:graphicFrameLocks xmlns:a="http://schemas.openxmlformats.org/drawingml/2006/main" noChangeAspect="1"/>
+            </wp:cNvGraphicFramePr>
+            <a:graphic xmlns:a="http://schemas.openxmlformats.org/drawingml/2006/main">
+              <a:graphicData uri="http://schemas.openxmlformats.org/drawingml/2006/picture">
+                <pic:pic xmlns:pic="http://schemas.openxmlformats.org/drawingml/2006/picture">
+                  <pic:nvPicPr>
+                    <pic:cNvPr id="1" name=""/>
+                    <pic:cNvPicPr/>
+                  </pic:nvPicPr>
+                  <pic:blipFill>
+                    <a:blip r:embed="rId7"/>
+                    <a:stretch>
+                      <a:fillRect/>
+                    </a:stretch>
+                  </pic:blipFill>
+                  <pic:spPr>
+                    <a:xfrm>
+                      <a:off x="0" y="0"/>
+                      <a:ext cx="5943600" cy="1588770"/>
+                    </a:xfrm>
+                    <a:prstGeom prst="rect">
+                      <a:avLst/>
+                    </a:prstGeom>
+                  </pic:spPr>
+                </pic:pic>
+              </a:graphicData>
+            </a:graphic>
+          </wp:inline>
+        </w:drawing>
+      </w:r>
+    </w:p>
+    <w:p>
+      <w:pPr>
+        <w:spacing w:before="100" w:beforeAutospacing="1" w:after="100" w:afterAutospacing="1" w:line="240" w:lineRule="auto"/>
+        <w:outlineLvl w:val="2"/>
+        <w:rPr>
+          <w:rFonts w:ascii="Times New Roman" w:eastAsia="Times New Roman" w:hAnsi="Times New Roman" w:cs="Times New Roman"/>
+          <w:b/>
+          <w:bCs/>
+          <w:sz w:val="27"/>
+          <w:szCs w:val="27"/>
+        </w:rPr>
+      </w:pPr>
+      <w:r>
+        <w:rPr>
+          <w:rFonts w:ascii="Times New Roman" w:eastAsia="Times New Roman" w:hAnsi="Times New Roman" w:cs="Times New Roman"/>
+          <w:b/>
+          <w:bCs/>
+          <w:sz w:val="27"/>
+          <w:szCs w:val="27"/>
+        </w:rPr>
+        <w:t>2</w:t>
+      </w:r>
+      <w:r>
+        <w:rPr>
+          <w:rFonts w:ascii="Times New Roman" w:eastAsia="Times New Roman" w:hAnsi="Times New Roman" w:cs="Times New Roman"/>
+          <w:b/>
+          <w:bCs/>
+          <w:sz w:val="27"/>
+          <w:szCs w:val="27"/>
+        </w:rPr>
+        <w:t>.</w:t>
+      </w:r>
+      <w:r>
+        <w:rPr>
+          <w:rFonts w:ascii="Times New Roman" w:eastAsia="Times New Roman" w:hAnsi="Times New Roman" w:cs="Times New Roman"/>
+          <w:b/>
+          <w:bCs/>
+          <w:sz w:val="27"/>
+          <w:szCs w:val="27"/>
+        </w:rPr>
+        <w:t xml:space="preserve"> Áp dụng Design Pattern</w:t>
+      </w:r>
+    </w:p>
+    <w:p>
+      <w:pPr>
+        <w:spacing w:before="100" w:beforeAutospacing="1" w:after="100" w:afterAutospacing="1" w:line="240" w:lineRule="auto"/>
+        <w:outlineLvl w:val="3"/>
+        <w:rPr>
+          <w:rFonts w:ascii="Times New Roman" w:eastAsia="Times New Roman" w:hAnsi="Times New Roman" w:cs="Times New Roman"/>
+          <w:b/>
+          <w:bCs/>
+          <w:sz w:val="24"/>
+          <w:szCs w:val="24"/>
+        </w:rPr>
+      </w:pPr>
+      <w:r>
+        <w:rPr>
+          <w:rFonts w:ascii="Times New Roman" w:eastAsia="Times New Roman" w:hAnsi="Times New Roman" w:cs="Times New Roman"/>
+          <w:b/>
+          <w:bCs/>
+          <w:sz w:val="24"/>
+          <w:szCs w:val="24"/>
+        </w:rPr>
+        <w:t>Strategy Pattern</w:t>
+      </w:r>
+    </w:p>
+    <w:p>
+      <w:pPr>
+        <w:numPr>
+          <w:ilvl w:val="0"/>
+          <w:numId w:val="7"/>
+        </w:numPr>
+        <w:spacing w:before="100" w:beforeAutospacing="1" w:after="100" w:afterAutospacing="1" w:line="240" w:lineRule="auto"/>
+        <w:rPr>
+          <w:rFonts w:ascii="Times New Roman" w:eastAsia="Times New Roman" w:hAnsi="Times New Roman" w:cs="Times New Roman"/>
+          <w:sz w:val="24"/>
+          <w:szCs w:val="24"/>
+        </w:rPr>
+      </w:pPr>
+      <w:r>
+        <w:rPr>
+          <w:rFonts w:ascii="Times New Roman" w:eastAsia="Times New Roman" w:hAnsi="Times New Roman" w:cs="Times New Roman"/>
+          <w:sz w:val="24"/>
+          <w:szCs w:val="24"/>
+        </w:rPr>
+        <w:t>Mỗi loại thuế là một chiến lược</w:t>
+      </w:r>
+    </w:p>
+    <w:p>
+      <w:pPr>
+        <w:numPr>
+          <w:ilvl w:val="0"/>
+          <w:numId w:val="7"/>
+        </w:numPr>
+        <w:spacing w:before="100" w:beforeAutospacing="1" w:after="100" w:afterAutospacing="1" w:line="240" w:lineRule="auto"/>
+        <w:rPr>
+          <w:rFonts w:ascii="Times New Roman" w:eastAsia="Times New Roman" w:hAnsi="Times New Roman" w:cs="Times New Roman"/>
+          <w:sz w:val="24"/>
+          <w:szCs w:val="24"/>
+        </w:rPr>
+      </w:pPr>
+      <w:r>
+        <w:rPr>
+          <w:rFonts w:ascii="Times New Roman" w:eastAsia="Times New Roman" w:hAnsi="Times New Roman" w:cs="Times New Roman"/>
+          <w:sz w:val="24"/>
+          <w:szCs w:val="24"/>
+        </w:rPr>
+        <w:t>Có thể thay đổi cách tính thuế linh hoạt</w:t>
+      </w:r>
+    </w:p>
+    <w:p>
+      <w:pPr>
+        <w:spacing w:before="100" w:beforeAutospacing="1" w:after="100" w:afterAutospacing="1" w:line="240" w:lineRule="auto"/>
+        <w:outlineLvl w:val="3"/>
+        <w:rPr>
+          <w:rFonts w:ascii="Times New Roman" w:eastAsia="Times New Roman" w:hAnsi="Times New Roman" w:cs="Times New Roman"/>
+          <w:b/>
+          <w:bCs/>
+          <w:sz w:val="24"/>
+          <w:szCs w:val="24"/>
+        </w:rPr>
+      </w:pPr>
+      <w:r>
+        <w:rPr>
+          <w:rFonts w:ascii="Times New Roman" w:eastAsia="Times New Roman" w:hAnsi="Times New Roman" w:cs="Times New Roman"/>
+          <w:b/>
+          <w:bCs/>
+          <w:sz w:val="24"/>
+          <w:szCs w:val="24"/>
+        </w:rPr>
+        <w:t>Decorator Pattern</w:t>
+      </w:r>
+    </w:p>
+    <w:p>
+      <w:pPr>
+        <w:numPr>
+          <w:ilvl w:val="0"/>
+          <w:numId w:val="8"/>
+        </w:numPr>
+        <w:spacing w:before="100" w:beforeAutospacing="1" w:after="100" w:afterAutospacing="1" w:line="240" w:lineRule="auto"/>
+        <w:rPr>
+          <w:rFonts w:ascii="Times New Roman" w:eastAsia="Times New Roman" w:hAnsi="Times New Roman" w:cs="Times New Roman"/>
+          <w:sz w:val="24"/>
+          <w:szCs w:val="24"/>
+        </w:rPr>
+      </w:pPr>
+      <w:r>
+        <w:rPr>
+          <w:rFonts w:ascii="Times New Roman" w:eastAsia="Times New Roman" w:hAnsi="Times New Roman" w:cs="Times New Roman"/>
+          <w:sz w:val="24"/>
+          <w:szCs w:val="24"/>
+        </w:rPr>
+        <w:t>Kết hợp nhiều loại thuế</w:t>
+      </w:r>
+    </w:p>
+    <w:p>
+      <w:pPr>
+        <w:numPr>
+          <w:ilvl w:val="0"/>
+          <w:numId w:val="8"/>
+        </w:numPr>
+        <w:spacing w:before="100" w:beforeAutospacing="1" w:after="100" w:afterAutospacing="1" w:line="240" w:lineRule="auto"/>
+        <w:rPr>
+          <w:rFonts w:ascii="Times New Roman" w:eastAsia="Times New Roman" w:hAnsi="Times New Roman" w:cs="Times New Roman"/>
+          <w:sz w:val="24"/>
+          <w:szCs w:val="24"/>
+        </w:rPr>
+      </w:pPr>
+      <w:r>
+        <w:rPr>
+          <w:rFonts w:ascii="Times New Roman" w:eastAsia="Times New Roman" w:hAnsi="Times New Roman" w:cs="Times New Roman"/>
+          <w:sz w:val="24"/>
+          <w:szCs w:val="24"/>
+        </w:rPr>
+        <w:t>Ví dụ: VAT + Luxury</w:t>
+      </w:r>
+    </w:p>
+    <w:p>
+      <w:pPr>
+        <w:spacing w:before="100" w:beforeAutospacing="1" w:after="100" w:afterAutospacing="1" w:line="240" w:lineRule="auto"/>
+        <w:outlineLvl w:val="3"/>
+        <w:rPr>
+          <w:rFonts w:ascii="Times New Roman" w:eastAsia="Times New Roman" w:hAnsi="Times New Roman" w:cs="Times New Roman"/>
+          <w:b/>
+          <w:bCs/>
+          <w:sz w:val="24"/>
+          <w:szCs w:val="24"/>
+        </w:rPr>
+      </w:pPr>
+      <w:r>
+        <w:rPr>
+          <w:rFonts w:ascii="Times New Roman" w:eastAsia="Times New Roman" w:hAnsi="Times New Roman" w:cs="Times New Roman"/>
+          <w:b/>
+          <w:bCs/>
+          <w:sz w:val="24"/>
+          <w:szCs w:val="24"/>
+        </w:rPr>
+        <w:t>State Pattern</w:t>
+      </w:r>
+    </w:p>
+    <w:p>
+      <w:pPr>
+        <w:numPr>
+          <w:ilvl w:val="0"/>
+          <w:numId w:val="9"/>
+        </w:numPr>
+        <w:spacing w:before="100" w:beforeAutospacing="1" w:after="100" w:afterAutospacing="1" w:line="240" w:lineRule="auto"/>
+        <w:rPr>
+          <w:rFonts w:ascii="Times New Roman" w:eastAsia="Times New Roman" w:hAnsi="Times New Roman" w:cs="Times New Roman"/>
+          <w:sz w:val="24"/>
+          <w:szCs w:val="24"/>
+        </w:rPr>
+      </w:pPr>
+      <w:r>
+        <w:rPr>
+          <w:rFonts w:ascii="Times New Roman" w:eastAsia="Times New Roman" w:hAnsi="Times New Roman" w:cs="Times New Roman"/>
+          <w:sz w:val="24"/>
+          <w:szCs w:val="24"/>
+        </w:rPr>
+        <w:t>Quản lý trạng thái tính thuế</w:t>
+      </w:r>
+    </w:p>
+    <w:p>
+      <w:pPr>
+        <w:numPr>
+          <w:ilvl w:val="0"/>
+          <w:numId w:val="9"/>
+        </w:numPr>
+        <w:spacing w:before="100" w:beforeAutospacing="1" w:after="100" w:afterAutospacing="1" w:line="240" w:lineRule="auto"/>
+        <w:rPr>
+          <w:rFonts w:ascii="Times New Roman" w:eastAsia="Times New Roman" w:hAnsi="Times New Roman" w:cs="Times New Roman"/>
+          <w:sz w:val="24"/>
+          <w:szCs w:val="24"/>
+        </w:rPr>
+      </w:pPr>
+      <w:r>
+        <w:rPr>
+          <w:rFonts w:ascii="Times New Roman" w:eastAsia="Times New Roman" w:hAnsi="Times New Roman" w:cs="Times New Roman"/>
+          <w:sz w:val="24"/>
+          <w:szCs w:val="24"/>
+        </w:rPr>
+        <w:t>Chưa tính / đã tính</w:t>
+      </w:r>
+    </w:p>
+    <w:p>
+      <w:pPr>
+        <w:spacing w:before="100" w:beforeAutospacing="1" w:after="100" w:afterAutospacing="1" w:line="240" w:lineRule="auto"/>
+        <w:outlineLvl w:val="2"/>
+        <w:rPr>
+          <w:rFonts w:ascii="Times New Roman" w:eastAsia="Times New Roman" w:hAnsi="Times New Roman" w:cs="Times New Roman"/>
+          <w:b/>
+          <w:bCs/>
+          <w:sz w:val="27"/>
+          <w:szCs w:val="27"/>
+        </w:rPr>
+      </w:pPr>
+      <w:r>
+        <w:rPr>
+          <w:rFonts w:ascii="Times New Roman" w:eastAsia="Times New Roman" w:hAnsi="Times New Roman" w:cs="Times New Roman"/>
+          <w:b/>
+          <w:bCs/>
+          <w:sz w:val="27"/>
+          <w:szCs w:val="27"/>
+        </w:rPr>
+        <w:t>3</w:t>
+      </w:r>
+      <w:r>
+        <w:rPr>
+          <w:rFonts w:ascii="Times New Roman" w:eastAsia="Times New Roman" w:hAnsi="Times New Roman" w:cs="Times New Roman"/>
+          <w:b/>
+          <w:bCs/>
+          <w:sz w:val="27"/>
+          <w:szCs w:val="27"/>
+        </w:rPr>
+        <w:t>.</w:t>
+      </w:r>
+      <w:r>
+        <w:rPr>
+          <w:rFonts w:ascii="Times New Roman" w:eastAsia="Times New Roman" w:hAnsi="Times New Roman" w:cs="Times New Roman"/>
+          <w:b/>
+          <w:bCs/>
+          <w:sz w:val="27"/>
+          <w:szCs w:val="27"/>
+        </w:rPr>
+        <w:t xml:space="preserve"> Kết quả</w:t>
+      </w:r>
+    </w:p>
+    <w:p>
+      <w:pPr>
+        <w:numPr>
+          <w:ilvl w:val="0"/>
+          <w:numId w:val="10"/>
+        </w:numPr>
+        <w:spacing w:before="100" w:beforeAutospacing="1" w:after="100" w:afterAutospacing="1" w:line="240" w:lineRule="auto"/>
+        <w:rPr>
+          <w:rFonts w:ascii="Times New Roman" w:eastAsia="Times New Roman" w:hAnsi="Times New Roman" w:cs="Times New Roman"/>
+          <w:sz w:val="24"/>
+          <w:szCs w:val="24"/>
+        </w:rPr>
+      </w:pPr>
+      <w:r>
+        <w:rPr>
+          <w:rFonts w:ascii="Times New Roman" w:eastAsia="Times New Roman" w:hAnsi="Times New Roman" w:cs="Times New Roman"/>
+          <w:sz w:val="24"/>
+          <w:szCs w:val="24"/>
+        </w:rPr>
+        <w:t>Tính thuế linh hoạt</w:t>
+      </w:r>
+    </w:p>
+    <w:p>
+      <w:pPr>
+        <w:numPr>
+          <w:ilvl w:val="0"/>
+          <w:numId w:val="10"/>
+        </w:numPr>
+        <w:spacing w:before="100" w:beforeAutospacing="1" w:after="100" w:afterAutospacing="1" w:line="240" w:lineRule="auto"/>
+        <w:rPr>
+          <w:rFonts w:ascii="Times New Roman" w:eastAsia="Times New Roman" w:hAnsi="Times New Roman" w:cs="Times New Roman"/>
+          <w:sz w:val="24"/>
+          <w:szCs w:val="24"/>
+        </w:rPr>
+      </w:pPr>
+      <w:r>
+        <w:rPr>
+          <w:rFonts w:ascii="Times New Roman" w:eastAsia="Times New Roman" w:hAnsi="Times New Roman" w:cs="Times New Roman"/>
+          <w:sz w:val="24"/>
+          <w:szCs w:val="24"/>
+        </w:rPr>
+        <w:t>Dễ thêm loại thuế mới</w:t>
+      </w:r>
+    </w:p>
+    <w:p>
+      <w:pPr>
+        <w:numPr>
+          <w:ilvl w:val="0"/>
+          <w:numId w:val="10"/>
+        </w:numPr>
+        <w:spacing w:before="100" w:beforeAutospacing="1" w:after="100" w:afterAutospacing="1" w:line="240" w:lineRule="auto"/>
+        <w:rPr>
+          <w:rFonts w:ascii="Times New Roman" w:eastAsia="Times New Roman" w:hAnsi="Times New Roman" w:cs="Times New Roman"/>
+          <w:sz w:val="24"/>
+          <w:szCs w:val="24"/>
+        </w:rPr>
+      </w:pPr>
+      <w:r>
+        <w:rPr>
+          <w:rFonts w:ascii="Times New Roman" w:eastAsia="Times New Roman" w:hAnsi="Times New Roman" w:cs="Times New Roman"/>
+          <w:sz w:val="24"/>
+          <w:szCs w:val="24"/>
+        </w:rPr>
+        <w:t>Không cần sửa code cũ</w:t>
+      </w:r>
+    </w:p>
+    <w:p>
+      <w:pPr>
+        <w:spacing w:before="100" w:beforeAutospacing="1" w:after="100" w:afterAutospacing="1" w:line="240" w:lineRule="auto"/>
+        <w:ind w:left="360"/>
+        <w:rPr>
+          <w:rFonts w:ascii="Times New Roman" w:eastAsia="Times New Roman" w:hAnsi="Times New Roman" w:cs="Times New Roman"/>
+          <w:sz w:val="24"/>
+          <w:szCs w:val="24"/>
+        </w:rPr>
+      </w:pPr>
+      <w:r>
+        <w:rPr>
+          <w:rFonts w:ascii="Times New Roman" w:eastAsia="Times New Roman" w:hAnsi="Times New Roman" w:cs="Times New Roman"/>
+          <w:sz w:val="24"/>
+          <w:szCs w:val="24"/>
+        </w:rPr>
+        <w:lastRenderedPageBreak/>
+        <w:drawing>
+          <wp:inline distT="0" distB="0" distL="0" distR="0" wp14:anchorId="0F85F55E" wp14:editId="534FFC5F">
+            <wp:extent cx="5943600" cy="3338830"/>
+            <wp:effectExtent l="0" t="0" r="0" b="0"/>
+            <wp:docPr id="2" name="Picture 2"/>
+            <wp:cNvGraphicFramePr>
+              <a:graphicFrameLocks xmlns:a="http://schemas.openxmlformats.org/drawingml/2006/main" noChangeAspect="1"/>
+            </wp:cNvGraphicFramePr>
+            <a:graphic xmlns:a="http://schemas.openxmlformats.org/drawingml/2006/main">
+              <a:graphicData uri="http://schemas.openxmlformats.org/drawingml/2006/picture">
+                <pic:pic xmlns:pic="http://schemas.openxmlformats.org/drawingml/2006/picture">
+                  <pic:nvPicPr>
+                    <pic:cNvPr id="1" name=""/>
+                    <pic:cNvPicPr/>
+                  </pic:nvPicPr>
+                  <pic:blipFill>
+                    <a:blip r:embed="rId8"/>
+                    <a:stretch>
+                      <a:fillRect/>
+                    </a:stretch>
+                  </pic:blipFill>
+                  <pic:spPr>
+                    <a:xfrm>
+                      <a:off x="0" y="0"/>
+                      <a:ext cx="5943600" cy="3338830"/>
+                    </a:xfrm>
+                    <a:prstGeom prst="rect">
+                      <a:avLst/>
+                    </a:prstGeom>
+                  </pic:spPr>
+                </pic:pic>
+              </a:graphicData>
+            </a:graphic>
+          </wp:inline>
+        </w:drawing>
+      </w:r>
+    </w:p>
+    <w:p>
+      <w:bookmarkStart w:id="0" w:name="_GoBack"/>
       <w:bookmarkEnd w:id="0"/>
     </w:p>
-    <w:p>
-      <w:pPr>
-        <w:spacing w:before="100" w:beforeAutospacing="1" w:after="100" w:afterAutospacing="1" w:line="240" w:lineRule="auto"/>
-        <w:ind w:left="360"/>
-        <w:rPr>
-          <w:rFonts w:ascii="Times New Roman" w:eastAsia="Times New Roman" w:hAnsi="Times New Roman" w:cs="Times New Roman"/>
-          <w:sz w:val="24"/>
-          <w:szCs w:val="24"/>
-        </w:rPr>
-      </w:pPr>
-    </w:p>
-    <w:p>
-      <w:pPr>
-        <w:spacing w:before="100" w:beforeAutospacing="1" w:after="100" w:afterAutospacing="1" w:line="240" w:lineRule="auto"/>
-        <w:ind w:left="360"/>
-        <w:rPr>
-          <w:rFonts w:ascii="Times New Roman" w:eastAsia="Times New Roman" w:hAnsi="Times New Roman" w:cs="Times New Roman"/>
-          <w:sz w:val="24"/>
-          <w:szCs w:val="24"/>
-        </w:rPr>
-      </w:pPr>
-    </w:p>
-    <w:p>
-      <w:pPr>
-        <w:spacing w:before="100" w:beforeAutospacing="1" w:after="100" w:afterAutospacing="1" w:line="240" w:lineRule="auto"/>
-        <w:ind w:left="360"/>
-        <w:rPr>
-          <w:rFonts w:ascii="Times New Roman" w:eastAsia="Times New Roman" w:hAnsi="Times New Roman" w:cs="Times New Roman"/>
-          <w:sz w:val="24"/>
-          <w:szCs w:val="24"/>
-        </w:rPr>
-      </w:pPr>
-    </w:p>
-    <w:p/>
     <w:sectPr>
       <w:pgSz w:w="12240" w:h="15840"/>
       <w:pgMar w:top="1440" w:right="1440" w:bottom="1440" w:left="1440" w:header="720" w:footer="720" w:gutter="0"/>
@@ -693,6 +1367,304 @@
 <file path=word/numbering.xml><?xml version="1.0" encoding="utf-8"?>
 <w:numbering xmlns:wpc="http://schemas.microsoft.com/office/word/2010/wordprocessingCanvas" xmlns:mc="http://schemas.openxmlformats.org/markup-compatibility/2006" xmlns:o="urn:schemas-microsoft-com:office:office" xmlns:r="http://schemas.openxmlformats.org/officeDocument/2006/relationships" xmlns:m="http://schemas.openxmlformats.org/officeDocument/2006/math" xmlns:v="urn:schemas-microsoft-com:vml" xmlns:wp14="http://schemas.microsoft.com/office/word/2010/wordprocessingDrawing" xmlns:wp="http://schemas.openxmlformats.org/drawingml/2006/wordprocessingDrawing" xmlns:w10="urn:schemas-microsoft-com:office:word" xmlns:w="http://schemas.openxmlformats.org/wordprocessingml/2006/main" xmlns:w14="http://schemas.microsoft.com/office/word/2010/wordml" xmlns:w15="http://schemas.microsoft.com/office/word/2012/wordml" xmlns:wpg="http://schemas.microsoft.com/office/word/2010/wordprocessingGroup" xmlns:wpi="http://schemas.microsoft.com/office/word/2010/wordprocessingInk" xmlns:wne="http://schemas.microsoft.com/office/word/2006/wordml" xmlns:wps="http://schemas.microsoft.com/office/word/2010/wordprocessingShape" mc:Ignorable="w14 w15 wp14">
   <w:abstractNum w:abstractNumId="0">
+    <w:nsid w:val="00CA7354"/>
+    <w:multiLevelType w:val="multilevel"/>
+    <w:tmpl w:val="439050EA"/>
+    <w:lvl w:ilvl="0">
+      <w:start w:val="1"/>
+      <w:numFmt w:val="bullet"/>
+      <w:lvlText w:val=""/>
+      <w:lvlJc w:val="left"/>
+      <w:pPr>
+        <w:tabs>
+          <w:tab w:val="num" w:pos="720"/>
+        </w:tabs>
+        <w:ind w:left="720" w:hanging="360"/>
+      </w:pPr>
+      <w:rPr>
+        <w:rFonts w:ascii="Symbol" w:hAnsi="Symbol" w:hint="default"/>
+        <w:sz w:val="20"/>
+      </w:rPr>
+    </w:lvl>
+    <w:lvl w:ilvl="1" w:tentative="1">
+      <w:start w:val="1"/>
+      <w:numFmt w:val="bullet"/>
+      <w:lvlText w:val="o"/>
+      <w:lvlJc w:val="left"/>
+      <w:pPr>
+        <w:tabs>
+          <w:tab w:val="num" w:pos="1440"/>
+        </w:tabs>
+        <w:ind w:left="1440" w:hanging="360"/>
+      </w:pPr>
+      <w:rPr>
+        <w:rFonts w:ascii="Courier New" w:hAnsi="Courier New" w:hint="default"/>
+        <w:sz w:val="20"/>
+      </w:rPr>
+    </w:lvl>
+    <w:lvl w:ilvl="2" w:tentative="1">
+      <w:start w:val="1"/>
+      <w:numFmt w:val="bullet"/>
+      <w:lvlText w:val=""/>
+      <w:lvlJc w:val="left"/>
+      <w:pPr>
+        <w:tabs>
+          <w:tab w:val="num" w:pos="2160"/>
+        </w:tabs>
+        <w:ind w:left="2160" w:hanging="360"/>
+      </w:pPr>
+      <w:rPr>
+        <w:rFonts w:ascii="Wingdings" w:hAnsi="Wingdings" w:hint="default"/>
+        <w:sz w:val="20"/>
+      </w:rPr>
+    </w:lvl>
+    <w:lvl w:ilvl="3" w:tentative="1">
+      <w:start w:val="1"/>
+      <w:numFmt w:val="bullet"/>
+      <w:lvlText w:val=""/>
+      <w:lvlJc w:val="left"/>
+      <w:pPr>
+        <w:tabs>
+          <w:tab w:val="num" w:pos="2880"/>
+        </w:tabs>
+        <w:ind w:left="2880" w:hanging="360"/>
+      </w:pPr>
+      <w:rPr>
+        <w:rFonts w:ascii="Wingdings" w:hAnsi="Wingdings" w:hint="default"/>
+        <w:sz w:val="20"/>
+      </w:rPr>
+    </w:lvl>
+    <w:lvl w:ilvl="4" w:tentative="1">
+      <w:start w:val="1"/>
+      <w:numFmt w:val="bullet"/>
+      <w:lvlText w:val=""/>
+      <w:lvlJc w:val="left"/>
+      <w:pPr>
+        <w:tabs>
+          <w:tab w:val="num" w:pos="3600"/>
+        </w:tabs>
+        <w:ind w:left="3600" w:hanging="360"/>
+      </w:pPr>
+      <w:rPr>
+        <w:rFonts w:ascii="Wingdings" w:hAnsi="Wingdings" w:hint="default"/>
+        <w:sz w:val="20"/>
+      </w:rPr>
+    </w:lvl>
+    <w:lvl w:ilvl="5" w:tentative="1">
+      <w:start w:val="1"/>
+      <w:numFmt w:val="bullet"/>
+      <w:lvlText w:val=""/>
+      <w:lvlJc w:val="left"/>
+      <w:pPr>
+        <w:tabs>
+          <w:tab w:val="num" w:pos="4320"/>
+        </w:tabs>
+        <w:ind w:left="4320" w:hanging="360"/>
+      </w:pPr>
+      <w:rPr>
+        <w:rFonts w:ascii="Wingdings" w:hAnsi="Wingdings" w:hint="default"/>
+        <w:sz w:val="20"/>
+      </w:rPr>
+    </w:lvl>
+    <w:lvl w:ilvl="6" w:tentative="1">
+      <w:start w:val="1"/>
+      <w:numFmt w:val="bullet"/>
+      <w:lvlText w:val=""/>
+      <w:lvlJc w:val="left"/>
+      <w:pPr>
+        <w:tabs>
+          <w:tab w:val="num" w:pos="5040"/>
+        </w:tabs>
+        <w:ind w:left="5040" w:hanging="360"/>
+      </w:pPr>
+      <w:rPr>
+        <w:rFonts w:ascii="Wingdings" w:hAnsi="Wingdings" w:hint="default"/>
+        <w:sz w:val="20"/>
+      </w:rPr>
+    </w:lvl>
+    <w:lvl w:ilvl="7" w:tentative="1">
+      <w:start w:val="1"/>
+      <w:numFmt w:val="bullet"/>
+      <w:lvlText w:val=""/>
+      <w:lvlJc w:val="left"/>
+      <w:pPr>
+        <w:tabs>
+          <w:tab w:val="num" w:pos="5760"/>
+        </w:tabs>
+        <w:ind w:left="5760" w:hanging="360"/>
+      </w:pPr>
+      <w:rPr>
+        <w:rFonts w:ascii="Wingdings" w:hAnsi="Wingdings" w:hint="default"/>
+        <w:sz w:val="20"/>
+      </w:rPr>
+    </w:lvl>
+    <w:lvl w:ilvl="8" w:tentative="1">
+      <w:start w:val="1"/>
+      <w:numFmt w:val="bullet"/>
+      <w:lvlText w:val=""/>
+      <w:lvlJc w:val="left"/>
+      <w:pPr>
+        <w:tabs>
+          <w:tab w:val="num" w:pos="6480"/>
+        </w:tabs>
+        <w:ind w:left="6480" w:hanging="360"/>
+      </w:pPr>
+      <w:rPr>
+        <w:rFonts w:ascii="Wingdings" w:hAnsi="Wingdings" w:hint="default"/>
+        <w:sz w:val="20"/>
+      </w:rPr>
+    </w:lvl>
+  </w:abstractNum>
+  <w:abstractNum w:abstractNumId="1">
+    <w:nsid w:val="135C5424"/>
+    <w:multiLevelType w:val="multilevel"/>
+    <w:tmpl w:val="43DEE7DC"/>
+    <w:lvl w:ilvl="0">
+      <w:start w:val="1"/>
+      <w:numFmt w:val="bullet"/>
+      <w:lvlText w:val=""/>
+      <w:lvlJc w:val="left"/>
+      <w:pPr>
+        <w:tabs>
+          <w:tab w:val="num" w:pos="720"/>
+        </w:tabs>
+        <w:ind w:left="720" w:hanging="360"/>
+      </w:pPr>
+      <w:rPr>
+        <w:rFonts w:ascii="Symbol" w:hAnsi="Symbol" w:hint="default"/>
+        <w:sz w:val="20"/>
+      </w:rPr>
+    </w:lvl>
+    <w:lvl w:ilvl="1" w:tentative="1">
+      <w:start w:val="1"/>
+      <w:numFmt w:val="bullet"/>
+      <w:lvlText w:val="o"/>
+      <w:lvlJc w:val="left"/>
+      <w:pPr>
+        <w:tabs>
+          <w:tab w:val="num" w:pos="1440"/>
+        </w:tabs>
+        <w:ind w:left="1440" w:hanging="360"/>
+      </w:pPr>
+      <w:rPr>
+        <w:rFonts w:ascii="Courier New" w:hAnsi="Courier New" w:hint="default"/>
+        <w:sz w:val="20"/>
+      </w:rPr>
+    </w:lvl>
+    <w:lvl w:ilvl="2" w:tentative="1">
+      <w:start w:val="1"/>
+      <w:numFmt w:val="bullet"/>
+      <w:lvlText w:val=""/>
+      <w:lvlJc w:val="left"/>
+      <w:pPr>
+        <w:tabs>
+          <w:tab w:val="num" w:pos="2160"/>
+        </w:tabs>
+        <w:ind w:left="2160" w:hanging="360"/>
+      </w:pPr>
+      <w:rPr>
+        <w:rFonts w:ascii="Wingdings" w:hAnsi="Wingdings" w:hint="default"/>
+        <w:sz w:val="20"/>
+      </w:rPr>
+    </w:lvl>
+    <w:lvl w:ilvl="3" w:tentative="1">
+      <w:start w:val="1"/>
+      <w:numFmt w:val="bullet"/>
+      <w:lvlText w:val=""/>
+      <w:lvlJc w:val="left"/>
+      <w:pPr>
+        <w:tabs>
+          <w:tab w:val="num" w:pos="2880"/>
+        </w:tabs>
+        <w:ind w:left="2880" w:hanging="360"/>
+      </w:pPr>
+      <w:rPr>
+        <w:rFonts w:ascii="Wingdings" w:hAnsi="Wingdings" w:hint="default"/>
+        <w:sz w:val="20"/>
+      </w:rPr>
+    </w:lvl>
+    <w:lvl w:ilvl="4" w:tentative="1">
+      <w:start w:val="1"/>
+      <w:numFmt w:val="bullet"/>
+      <w:lvlText w:val=""/>
+      <w:lvlJc w:val="left"/>
+      <w:pPr>
+        <w:tabs>
+          <w:tab w:val="num" w:pos="3600"/>
+        </w:tabs>
+        <w:ind w:left="3600" w:hanging="360"/>
+      </w:pPr>
+      <w:rPr>
+        <w:rFonts w:ascii="Wingdings" w:hAnsi="Wingdings" w:hint="default"/>
+        <w:sz w:val="20"/>
+      </w:rPr>
+    </w:lvl>
+    <w:lvl w:ilvl="5" w:tentative="1">
+      <w:start w:val="1"/>
+      <w:numFmt w:val="bullet"/>
+      <w:lvlText w:val=""/>
+      <w:lvlJc w:val="left"/>
+      <w:pPr>
+        <w:tabs>
+          <w:tab w:val="num" w:pos="4320"/>
+        </w:tabs>
+        <w:ind w:left="4320" w:hanging="360"/>
+      </w:pPr>
+      <w:rPr>
+        <w:rFonts w:ascii="Wingdings" w:hAnsi="Wingdings" w:hint="default"/>
+        <w:sz w:val="20"/>
+      </w:rPr>
+    </w:lvl>
+    <w:lvl w:ilvl="6" w:tentative="1">
+      <w:start w:val="1"/>
+      <w:numFmt w:val="bullet"/>
+      <w:lvlText w:val=""/>
+      <w:lvlJc w:val="left"/>
+      <w:pPr>
+        <w:tabs>
+          <w:tab w:val="num" w:pos="5040"/>
+        </w:tabs>
+        <w:ind w:left="5040" w:hanging="360"/>
+      </w:pPr>
+      <w:rPr>
+        <w:rFonts w:ascii="Wingdings" w:hAnsi="Wingdings" w:hint="default"/>
+        <w:sz w:val="20"/>
+      </w:rPr>
+    </w:lvl>
+    <w:lvl w:ilvl="7" w:tentative="1">
+      <w:start w:val="1"/>
+      <w:numFmt w:val="bullet"/>
+      <w:lvlText w:val=""/>
+      <w:lvlJc w:val="left"/>
+      <w:pPr>
+        <w:tabs>
+          <w:tab w:val="num" w:pos="5760"/>
+        </w:tabs>
+        <w:ind w:left="5760" w:hanging="360"/>
+      </w:pPr>
+      <w:rPr>
+        <w:rFonts w:ascii="Wingdings" w:hAnsi="Wingdings" w:hint="default"/>
+        <w:sz w:val="20"/>
+      </w:rPr>
+    </w:lvl>
+    <w:lvl w:ilvl="8" w:tentative="1">
+      <w:start w:val="1"/>
+      <w:numFmt w:val="bullet"/>
+      <w:lvlText w:val=""/>
+      <w:lvlJc w:val="left"/>
+      <w:pPr>
+        <w:tabs>
+          <w:tab w:val="num" w:pos="6480"/>
+        </w:tabs>
+        <w:ind w:left="6480" w:hanging="360"/>
+      </w:pPr>
+      <w:rPr>
+        <w:rFonts w:ascii="Wingdings" w:hAnsi="Wingdings" w:hint="default"/>
+        <w:sz w:val="20"/>
+      </w:rPr>
+    </w:lvl>
+  </w:abstractNum>
+  <w:abstractNum w:abstractNumId="2">
     <w:nsid w:val="1EBC4295"/>
     <w:multiLevelType w:val="multilevel"/>
     <w:tmpl w:val="FCBA2030"/>
@@ -841,7 +1813,156 @@
       </w:rPr>
     </w:lvl>
   </w:abstractNum>
-  <w:abstractNum w:abstractNumId="1">
+  <w:abstractNum w:abstractNumId="3">
+    <w:nsid w:val="1F6F1823"/>
+    <w:multiLevelType w:val="multilevel"/>
+    <w:tmpl w:val="45181006"/>
+    <w:lvl w:ilvl="0">
+      <w:start w:val="1"/>
+      <w:numFmt w:val="bullet"/>
+      <w:lvlText w:val=""/>
+      <w:lvlJc w:val="left"/>
+      <w:pPr>
+        <w:tabs>
+          <w:tab w:val="num" w:pos="720"/>
+        </w:tabs>
+        <w:ind w:left="720" w:hanging="360"/>
+      </w:pPr>
+      <w:rPr>
+        <w:rFonts w:ascii="Symbol" w:hAnsi="Symbol" w:hint="default"/>
+        <w:sz w:val="20"/>
+      </w:rPr>
+    </w:lvl>
+    <w:lvl w:ilvl="1" w:tentative="1">
+      <w:start w:val="1"/>
+      <w:numFmt w:val="bullet"/>
+      <w:lvlText w:val="o"/>
+      <w:lvlJc w:val="left"/>
+      <w:pPr>
+        <w:tabs>
+          <w:tab w:val="num" w:pos="1440"/>
+        </w:tabs>
+        <w:ind w:left="1440" w:hanging="360"/>
+      </w:pPr>
+      <w:rPr>
+        <w:rFonts w:ascii="Courier New" w:hAnsi="Courier New" w:hint="default"/>
+        <w:sz w:val="20"/>
+      </w:rPr>
+    </w:lvl>
+    <w:lvl w:ilvl="2" w:tentative="1">
+      <w:start w:val="1"/>
+      <w:numFmt w:val="bullet"/>
+      <w:lvlText w:val=""/>
+      <w:lvlJc w:val="left"/>
+      <w:pPr>
+        <w:tabs>
+          <w:tab w:val="num" w:pos="2160"/>
+        </w:tabs>
+        <w:ind w:left="2160" w:hanging="360"/>
+      </w:pPr>
+      <w:rPr>
+        <w:rFonts w:ascii="Wingdings" w:hAnsi="Wingdings" w:hint="default"/>
+        <w:sz w:val="20"/>
+      </w:rPr>
+    </w:lvl>
+    <w:lvl w:ilvl="3" w:tentative="1">
+      <w:start w:val="1"/>
+      <w:numFmt w:val="bullet"/>
+      <w:lvlText w:val=""/>
+      <w:lvlJc w:val="left"/>
+      <w:pPr>
+        <w:tabs>
+          <w:tab w:val="num" w:pos="2880"/>
+        </w:tabs>
+        <w:ind w:left="2880" w:hanging="360"/>
+      </w:pPr>
+      <w:rPr>
+        <w:rFonts w:ascii="Wingdings" w:hAnsi="Wingdings" w:hint="default"/>
+        <w:sz w:val="20"/>
+      </w:rPr>
+    </w:lvl>
+    <w:lvl w:ilvl="4" w:tentative="1">
+      <w:start w:val="1"/>
+      <w:numFmt w:val="bullet"/>
+      <w:lvlText w:val=""/>
+      <w:lvlJc w:val="left"/>
+      <w:pPr>
+        <w:tabs>
+          <w:tab w:val="num" w:pos="3600"/>
+        </w:tabs>
+        <w:ind w:left="3600" w:hanging="360"/>
+      </w:pPr>
+      <w:rPr>
+        <w:rFonts w:ascii="Wingdings" w:hAnsi="Wingdings" w:hint="default"/>
+        <w:sz w:val="20"/>
+      </w:rPr>
+    </w:lvl>
+    <w:lvl w:ilvl="5" w:tentative="1">
+      <w:start w:val="1"/>
+      <w:numFmt w:val="bullet"/>
+      <w:lvlText w:val=""/>
+      <w:lvlJc w:val="left"/>
+      <w:pPr>
+        <w:tabs>
+          <w:tab w:val="num" w:pos="4320"/>
+        </w:tabs>
+        <w:ind w:left="4320" w:hanging="360"/>
+      </w:pPr>
+      <w:rPr>
+        <w:rFonts w:ascii="Wingdings" w:hAnsi="Wingdings" w:hint="default"/>
+        <w:sz w:val="20"/>
+      </w:rPr>
+    </w:lvl>
+    <w:lvl w:ilvl="6" w:tentative="1">
+      <w:start w:val="1"/>
+      <w:numFmt w:val="bullet"/>
+      <w:lvlText w:val=""/>
+      <w:lvlJc w:val="left"/>
+      <w:pPr>
+        <w:tabs>
+          <w:tab w:val="num" w:pos="5040"/>
+        </w:tabs>
+        <w:ind w:left="5040" w:hanging="360"/>
+      </w:pPr>
+      <w:rPr>
+        <w:rFonts w:ascii="Wingdings" w:hAnsi="Wingdings" w:hint="default"/>
+        <w:sz w:val="20"/>
+      </w:rPr>
+    </w:lvl>
+    <w:lvl w:ilvl="7" w:tentative="1">
+      <w:start w:val="1"/>
+      <w:numFmt w:val="bullet"/>
+      <w:lvlText w:val=""/>
+      <w:lvlJc w:val="left"/>
+      <w:pPr>
+        <w:tabs>
+          <w:tab w:val="num" w:pos="5760"/>
+        </w:tabs>
+        <w:ind w:left="5760" w:hanging="360"/>
+      </w:pPr>
+      <w:rPr>
+        <w:rFonts w:ascii="Wingdings" w:hAnsi="Wingdings" w:hint="default"/>
+        <w:sz w:val="20"/>
+      </w:rPr>
+    </w:lvl>
+    <w:lvl w:ilvl="8" w:tentative="1">
+      <w:start w:val="1"/>
+      <w:numFmt w:val="bullet"/>
+      <w:lvlText w:val=""/>
+      <w:lvlJc w:val="left"/>
+      <w:pPr>
+        <w:tabs>
+          <w:tab w:val="num" w:pos="6480"/>
+        </w:tabs>
+        <w:ind w:left="6480" w:hanging="360"/>
+      </w:pPr>
+      <w:rPr>
+        <w:rFonts w:ascii="Wingdings" w:hAnsi="Wingdings" w:hint="default"/>
+        <w:sz w:val="20"/>
+      </w:rPr>
+    </w:lvl>
+  </w:abstractNum>
+  <w:abstractNum w:abstractNumId="4">
     <w:nsid w:val="233143FB"/>
     <w:multiLevelType w:val="multilevel"/>
     <w:tmpl w:val="80BC1004"/>
@@ -990,7 +2111,156 @@
       </w:rPr>
     </w:lvl>
   </w:abstractNum>
-  <w:abstractNum w:abstractNumId="2">
+  <w:abstractNum w:abstractNumId="5">
+    <w:nsid w:val="4210300E"/>
+    <w:multiLevelType w:val="multilevel"/>
+    <w:tmpl w:val="8F3A0B28"/>
+    <w:lvl w:ilvl="0">
+      <w:start w:val="1"/>
+      <w:numFmt w:val="bullet"/>
+      <w:lvlText w:val=""/>
+      <w:lvlJc w:val="left"/>
+      <w:pPr>
+        <w:tabs>
+          <w:tab w:val="num" w:pos="720"/>
+        </w:tabs>
+        <w:ind w:left="720" w:hanging="360"/>
+      </w:pPr>
+      <w:rPr>
+        <w:rFonts w:ascii="Symbol" w:hAnsi="Symbol" w:hint="default"/>
+        <w:sz w:val="20"/>
+      </w:rPr>
+    </w:lvl>
+    <w:lvl w:ilvl="1" w:tentative="1">
+      <w:start w:val="1"/>
+      <w:numFmt w:val="bullet"/>
+      <w:lvlText w:val="o"/>
+      <w:lvlJc w:val="left"/>
+      <w:pPr>
+        <w:tabs>
+          <w:tab w:val="num" w:pos="1440"/>
+        </w:tabs>
+        <w:ind w:left="1440" w:hanging="360"/>
+      </w:pPr>
+      <w:rPr>
+        <w:rFonts w:ascii="Courier New" w:hAnsi="Courier New" w:hint="default"/>
+        <w:sz w:val="20"/>
+      </w:rPr>
+    </w:lvl>
+    <w:lvl w:ilvl="2" w:tentative="1">
+      <w:start w:val="1"/>
+      <w:numFmt w:val="bullet"/>
+      <w:lvlText w:val=""/>
+      <w:lvlJc w:val="left"/>
+      <w:pPr>
+        <w:tabs>
+          <w:tab w:val="num" w:pos="2160"/>
+        </w:tabs>
+        <w:ind w:left="2160" w:hanging="360"/>
+      </w:pPr>
+      <w:rPr>
+        <w:rFonts w:ascii="Wingdings" w:hAnsi="Wingdings" w:hint="default"/>
+        <w:sz w:val="20"/>
+      </w:rPr>
+    </w:lvl>
+    <w:lvl w:ilvl="3" w:tentative="1">
+      <w:start w:val="1"/>
+      <w:numFmt w:val="bullet"/>
+      <w:lvlText w:val=""/>
+      <w:lvlJc w:val="left"/>
+      <w:pPr>
+        <w:tabs>
+          <w:tab w:val="num" w:pos="2880"/>
+        </w:tabs>
+        <w:ind w:left="2880" w:hanging="360"/>
+      </w:pPr>
+      <w:rPr>
+        <w:rFonts w:ascii="Wingdings" w:hAnsi="Wingdings" w:hint="default"/>
+        <w:sz w:val="20"/>
+      </w:rPr>
+    </w:lvl>
+    <w:lvl w:ilvl="4" w:tentative="1">
+      <w:start w:val="1"/>
+      <w:numFmt w:val="bullet"/>
+      <w:lvlText w:val=""/>
+      <w:lvlJc w:val="left"/>
+      <w:pPr>
+        <w:tabs>
+          <w:tab w:val="num" w:pos="3600"/>
+        </w:tabs>
+        <w:ind w:left="3600" w:hanging="360"/>
+      </w:pPr>
+      <w:rPr>
+        <w:rFonts w:ascii="Wingdings" w:hAnsi="Wingdings" w:hint="default"/>
+        <w:sz w:val="20"/>
+      </w:rPr>
+    </w:lvl>
+    <w:lvl w:ilvl="5" w:tentative="1">
+      <w:start w:val="1"/>
+      <w:numFmt w:val="bullet"/>
+      <w:lvlText w:val=""/>
+      <w:lvlJc w:val="left"/>
+      <w:pPr>
+        <w:tabs>
+          <w:tab w:val="num" w:pos="4320"/>
+        </w:tabs>
+        <w:ind w:left="4320" w:hanging="360"/>
+      </w:pPr>
+      <w:rPr>
+        <w:rFonts w:ascii="Wingdings" w:hAnsi="Wingdings" w:hint="default"/>
+        <w:sz w:val="20"/>
+      </w:rPr>
+    </w:lvl>
+    <w:lvl w:ilvl="6" w:tentative="1">
+      <w:start w:val="1"/>
+      <w:numFmt w:val="bullet"/>
+      <w:lvlText w:val=""/>
+      <w:lvlJc w:val="left"/>
+      <w:pPr>
+        <w:tabs>
+          <w:tab w:val="num" w:pos="5040"/>
+        </w:tabs>
+        <w:ind w:left="5040" w:hanging="360"/>
+      </w:pPr>
+      <w:rPr>
+        <w:rFonts w:ascii="Wingdings" w:hAnsi="Wingdings" w:hint="default"/>
+        <w:sz w:val="20"/>
+      </w:rPr>
+    </w:lvl>
+    <w:lvl w:ilvl="7" w:tentative="1">
+      <w:start w:val="1"/>
+      <w:numFmt w:val="bullet"/>
+      <w:lvlText w:val=""/>
+      <w:lvlJc w:val="left"/>
+      <w:pPr>
+        <w:tabs>
+          <w:tab w:val="num" w:pos="5760"/>
+        </w:tabs>
+        <w:ind w:left="5760" w:hanging="360"/>
+      </w:pPr>
+      <w:rPr>
+        <w:rFonts w:ascii="Wingdings" w:hAnsi="Wingdings" w:hint="default"/>
+        <w:sz w:val="20"/>
+      </w:rPr>
+    </w:lvl>
+    <w:lvl w:ilvl="8" w:tentative="1">
+      <w:start w:val="1"/>
+      <w:numFmt w:val="bullet"/>
+      <w:lvlText w:val=""/>
+      <w:lvlJc w:val="left"/>
+      <w:pPr>
+        <w:tabs>
+          <w:tab w:val="num" w:pos="6480"/>
+        </w:tabs>
+        <w:ind w:left="6480" w:hanging="360"/>
+      </w:pPr>
+      <w:rPr>
+        <w:rFonts w:ascii="Wingdings" w:hAnsi="Wingdings" w:hint="default"/>
+        <w:sz w:val="20"/>
+      </w:rPr>
+    </w:lvl>
+  </w:abstractNum>
+  <w:abstractNum w:abstractNumId="6">
     <w:nsid w:val="43803A4A"/>
     <w:multiLevelType w:val="multilevel"/>
     <w:tmpl w:val="BCEC4656"/>
@@ -1139,7 +2409,156 @@
       </w:rPr>
     </w:lvl>
   </w:abstractNum>
-  <w:abstractNum w:abstractNumId="3">
+  <w:abstractNum w:abstractNumId="7">
+    <w:nsid w:val="47DA42A8"/>
+    <w:multiLevelType w:val="multilevel"/>
+    <w:tmpl w:val="C99050D2"/>
+    <w:lvl w:ilvl="0">
+      <w:start w:val="1"/>
+      <w:numFmt w:val="bullet"/>
+      <w:lvlText w:val=""/>
+      <w:lvlJc w:val="left"/>
+      <w:pPr>
+        <w:tabs>
+          <w:tab w:val="num" w:pos="720"/>
+        </w:tabs>
+        <w:ind w:left="720" w:hanging="360"/>
+      </w:pPr>
+      <w:rPr>
+        <w:rFonts w:ascii="Symbol" w:hAnsi="Symbol" w:hint="default"/>
+        <w:sz w:val="20"/>
+      </w:rPr>
+    </w:lvl>
+    <w:lvl w:ilvl="1" w:tentative="1">
+      <w:start w:val="1"/>
+      <w:numFmt w:val="bullet"/>
+      <w:lvlText w:val="o"/>
+      <w:lvlJc w:val="left"/>
+      <w:pPr>
+        <w:tabs>
+          <w:tab w:val="num" w:pos="1440"/>
+        </w:tabs>
+        <w:ind w:left="1440" w:hanging="360"/>
+      </w:pPr>
+      <w:rPr>
+        <w:rFonts w:ascii="Courier New" w:hAnsi="Courier New" w:hint="default"/>
+        <w:sz w:val="20"/>
+      </w:rPr>
+    </w:lvl>
+    <w:lvl w:ilvl="2" w:tentative="1">
+      <w:start w:val="1"/>
+      <w:numFmt w:val="bullet"/>
+      <w:lvlText w:val=""/>
+      <w:lvlJc w:val="left"/>
+      <w:pPr>
+        <w:tabs>
+          <w:tab w:val="num" w:pos="2160"/>
+        </w:tabs>
+        <w:ind w:left="2160" w:hanging="360"/>
+      </w:pPr>
+      <w:rPr>
+        <w:rFonts w:ascii="Wingdings" w:hAnsi="Wingdings" w:hint="default"/>
+        <w:sz w:val="20"/>
+      </w:rPr>
+    </w:lvl>
+    <w:lvl w:ilvl="3" w:tentative="1">
+      <w:start w:val="1"/>
+      <w:numFmt w:val="bullet"/>
+      <w:lvlText w:val=""/>
+      <w:lvlJc w:val="left"/>
+      <w:pPr>
+        <w:tabs>
+          <w:tab w:val="num" w:pos="2880"/>
+        </w:tabs>
+        <w:ind w:left="2880" w:hanging="360"/>
+      </w:pPr>
+      <w:rPr>
+        <w:rFonts w:ascii="Wingdings" w:hAnsi="Wingdings" w:hint="default"/>
+        <w:sz w:val="20"/>
+      </w:rPr>
+    </w:lvl>
+    <w:lvl w:ilvl="4" w:tentative="1">
+      <w:start w:val="1"/>
+      <w:numFmt w:val="bullet"/>
+      <w:lvlText w:val=""/>
+      <w:lvlJc w:val="left"/>
+      <w:pPr>
+        <w:tabs>
+          <w:tab w:val="num" w:pos="3600"/>
+        </w:tabs>
+        <w:ind w:left="3600" w:hanging="360"/>
+      </w:pPr>
+      <w:rPr>
+        <w:rFonts w:ascii="Wingdings" w:hAnsi="Wingdings" w:hint="default"/>
+        <w:sz w:val="20"/>
+      </w:rPr>
+    </w:lvl>
+    <w:lvl w:ilvl="5" w:tentative="1">
+      <w:start w:val="1"/>
+      <w:numFmt w:val="bullet"/>
+      <w:lvlText w:val=""/>
+      <w:lvlJc w:val="left"/>
+      <w:pPr>
+        <w:tabs>
+          <w:tab w:val="num" w:pos="4320"/>
+        </w:tabs>
+        <w:ind w:left="4320" w:hanging="360"/>
+      </w:pPr>
+      <w:rPr>
+        <w:rFonts w:ascii="Wingdings" w:hAnsi="Wingdings" w:hint="default"/>
+        <w:sz w:val="20"/>
+      </w:rPr>
+    </w:lvl>
+    <w:lvl w:ilvl="6" w:tentative="1">
+      <w:start w:val="1"/>
+      <w:numFmt w:val="bullet"/>
+      <w:lvlText w:val=""/>
+      <w:lvlJc w:val="left"/>
+      <w:pPr>
+        <w:tabs>
+          <w:tab w:val="num" w:pos="5040"/>
+        </w:tabs>
+        <w:ind w:left="5040" w:hanging="360"/>
+      </w:pPr>
+      <w:rPr>
+        <w:rFonts w:ascii="Wingdings" w:hAnsi="Wingdings" w:hint="default"/>
+        <w:sz w:val="20"/>
+      </w:rPr>
+    </w:lvl>
+    <w:lvl w:ilvl="7" w:tentative="1">
+      <w:start w:val="1"/>
+      <w:numFmt w:val="bullet"/>
+      <w:lvlText w:val=""/>
+      <w:lvlJc w:val="left"/>
+      <w:pPr>
+        <w:tabs>
+          <w:tab w:val="num" w:pos="5760"/>
+        </w:tabs>
+        <w:ind w:left="5760" w:hanging="360"/>
+      </w:pPr>
+      <w:rPr>
+        <w:rFonts w:ascii="Wingdings" w:hAnsi="Wingdings" w:hint="default"/>
+        <w:sz w:val="20"/>
+      </w:rPr>
+    </w:lvl>
+    <w:lvl w:ilvl="8" w:tentative="1">
+      <w:start w:val="1"/>
+      <w:numFmt w:val="bullet"/>
+      <w:lvlText w:val=""/>
+      <w:lvlJc w:val="left"/>
+      <w:pPr>
+        <w:tabs>
+          <w:tab w:val="num" w:pos="6480"/>
+        </w:tabs>
+        <w:ind w:left="6480" w:hanging="360"/>
+      </w:pPr>
+      <w:rPr>
+        <w:rFonts w:ascii="Wingdings" w:hAnsi="Wingdings" w:hint="default"/>
+        <w:sz w:val="20"/>
+      </w:rPr>
+    </w:lvl>
+  </w:abstractNum>
+  <w:abstractNum w:abstractNumId="8">
     <w:nsid w:val="5A59604A"/>
     <w:multiLevelType w:val="multilevel"/>
     <w:tmpl w:val="A87E65B6"/>
@@ -1288,7 +2707,7 @@
       </w:rPr>
     </w:lvl>
   </w:abstractNum>
-  <w:abstractNum w:abstractNumId="4">
+  <w:abstractNum w:abstractNumId="9">
     <w:nsid w:val="719D71B9"/>
     <w:multiLevelType w:val="multilevel"/>
     <w:tmpl w:val="13BEE546"/>
@@ -1438,19 +2857,34 @@
     </w:lvl>
   </w:abstractNum>
   <w:num w:numId="1">
+    <w:abstractNumId w:val="8"/>
+  </w:num>
+  <w:num w:numId="2">
+    <w:abstractNumId w:val="6"/>
+  </w:num>
+  <w:num w:numId="3">
+    <w:abstractNumId w:val="9"/>
+  </w:num>
+  <w:num w:numId="4">
+    <w:abstractNumId w:val="2"/>
+  </w:num>
+  <w:num w:numId="5">
+    <w:abstractNumId w:val="4"/>
+  </w:num>
+  <w:num w:numId="6">
+    <w:abstractNumId w:val="1"/>
+  </w:num>
+  <w:num w:numId="7">
+    <w:abstractNumId w:val="5"/>
+  </w:num>
+  <w:num w:numId="8">
     <w:abstractNumId w:val="3"/>
   </w:num>
-  <w:num w:numId="2">
-    <w:abstractNumId w:val="2"/>
-  </w:num>
-  <w:num w:numId="3">
-    <w:abstractNumId w:val="4"/>
-  </w:num>
-  <w:num w:numId="4">
+  <w:num w:numId="9">
     <w:abstractNumId w:val="0"/>
   </w:num>
-  <w:num w:numId="5">
-    <w:abstractNumId w:val="1"/>
+  <w:num w:numId="10">
+    <w:abstractNumId w:val="7"/>
   </w:num>
 </w:numbering>
 </file>

</xml_diff>

<commit_message>
bai3: he thong thanh toan
</commit_message>
<xml_diff>
--- a/Tuan03/22726151_LuuNgocCaoSon.docx
+++ b/Tuan03/22726151_LuuNgocCaoSon.docx
@@ -1295,6 +1295,8 @@
         </w:rPr>
         <w:t>Không cần sửa code cũ</w:t>
       </w:r>
+      <w:bookmarkStart w:id="0" w:name="_GoBack"/>
+      <w:bookmarkEnd w:id="0"/>
     </w:p>
     <w:p>
       <w:pPr>
@@ -1351,9 +1353,896 @@
       </w:r>
     </w:p>
     <w:p>
-      <w:bookmarkStart w:id="0" w:name="_GoBack"/>
-      <w:bookmarkEnd w:id="0"/>
-    </w:p>
+      <w:pPr>
+        <w:spacing w:before="100" w:beforeAutospacing="1" w:after="100" w:afterAutospacing="1" w:line="240" w:lineRule="auto"/>
+        <w:outlineLvl w:val="1"/>
+        <w:rPr>
+          <w:rFonts w:ascii="Times New Roman" w:eastAsia="Times New Roman" w:hAnsi="Times New Roman" w:cs="Times New Roman"/>
+          <w:b/>
+          <w:bCs/>
+          <w:sz w:val="36"/>
+          <w:szCs w:val="36"/>
+        </w:rPr>
+      </w:pPr>
+      <w:r>
+        <w:rPr>
+          <w:rFonts w:ascii="Times New Roman" w:eastAsia="Times New Roman" w:hAnsi="Times New Roman" w:cs="Times New Roman"/>
+          <w:b/>
+          <w:bCs/>
+          <w:sz w:val="36"/>
+          <w:szCs w:val="36"/>
+        </w:rPr>
+        <w:t>Bài 3 – Hệ thống thanh toán</w:t>
+      </w:r>
+    </w:p>
+    <w:p>
+      <w:pPr>
+        <w:spacing w:before="100" w:beforeAutospacing="1" w:after="100" w:afterAutospacing="1" w:line="240" w:lineRule="auto"/>
+        <w:outlineLvl w:val="2"/>
+        <w:rPr>
+          <w:rFonts w:ascii="Times New Roman" w:eastAsia="Times New Roman" w:hAnsi="Times New Roman" w:cs="Times New Roman"/>
+          <w:b/>
+          <w:bCs/>
+          <w:sz w:val="27"/>
+          <w:szCs w:val="27"/>
+        </w:rPr>
+      </w:pPr>
+      <w:r>
+        <w:rPr>
+          <w:rFonts w:ascii="Times New Roman" w:eastAsia="Times New Roman" w:hAnsi="Times New Roman" w:cs="Times New Roman"/>
+          <w:b/>
+          <w:bCs/>
+          <w:sz w:val="27"/>
+          <w:szCs w:val="27"/>
+        </w:rPr>
+        <w:t>1</w:t>
+      </w:r>
+      <w:r>
+        <w:rPr>
+          <w:rFonts w:ascii="Times New Roman" w:eastAsia="Times New Roman" w:hAnsi="Times New Roman" w:cs="Times New Roman"/>
+          <w:b/>
+          <w:bCs/>
+          <w:sz w:val="27"/>
+          <w:szCs w:val="27"/>
+        </w:rPr>
+        <w:t>.</w:t>
+      </w:r>
+      <w:r>
+        <w:rPr>
+          <w:rFonts w:ascii="Times New Roman" w:eastAsia="Times New Roman" w:hAnsi="Times New Roman" w:cs="Times New Roman"/>
+          <w:b/>
+          <w:bCs/>
+          <w:sz w:val="27"/>
+          <w:szCs w:val="27"/>
+        </w:rPr>
+        <w:t xml:space="preserve"> Mô tả</w:t>
+      </w:r>
+    </w:p>
+    <w:p>
+      <w:pPr>
+        <w:spacing w:before="100" w:beforeAutospacing="1" w:after="100" w:afterAutospacing="1" w:line="240" w:lineRule="auto"/>
+        <w:rPr>
+          <w:rFonts w:ascii="Times New Roman" w:eastAsia="Times New Roman" w:hAnsi="Times New Roman" w:cs="Times New Roman"/>
+          <w:sz w:val="24"/>
+          <w:szCs w:val="24"/>
+        </w:rPr>
+      </w:pPr>
+      <w:r>
+        <w:rPr>
+          <w:rFonts w:ascii="Times New Roman" w:eastAsia="Times New Roman" w:hAnsi="Times New Roman" w:cs="Times New Roman"/>
+          <w:sz w:val="24"/>
+          <w:szCs w:val="24"/>
+        </w:rPr>
+        <w:t>Hệ thống cho phép thanh toán bằng nhiều phương thức:</w:t>
+      </w:r>
+    </w:p>
+    <w:p>
+      <w:pPr>
+        <w:numPr>
+          <w:ilvl w:val="0"/>
+          <w:numId w:val="11"/>
+        </w:numPr>
+        <w:spacing w:before="100" w:beforeAutospacing="1" w:after="100" w:afterAutospacing="1" w:line="240" w:lineRule="auto"/>
+        <w:rPr>
+          <w:rFonts w:ascii="Times New Roman" w:eastAsia="Times New Roman" w:hAnsi="Times New Roman" w:cs="Times New Roman"/>
+          <w:sz w:val="24"/>
+          <w:szCs w:val="24"/>
+        </w:rPr>
+      </w:pPr>
+      <w:r>
+        <w:rPr>
+          <w:rFonts w:ascii="Times New Roman" w:eastAsia="Times New Roman" w:hAnsi="Times New Roman" w:cs="Times New Roman"/>
+          <w:sz w:val="24"/>
+          <w:szCs w:val="24"/>
+        </w:rPr>
+        <w:t>Credit Card</w:t>
+      </w:r>
+    </w:p>
+    <w:p>
+      <w:pPr>
+        <w:numPr>
+          <w:ilvl w:val="0"/>
+          <w:numId w:val="11"/>
+        </w:numPr>
+        <w:spacing w:before="100" w:beforeAutospacing="1" w:after="100" w:afterAutospacing="1" w:line="240" w:lineRule="auto"/>
+        <w:rPr>
+          <w:rFonts w:ascii="Times New Roman" w:eastAsia="Times New Roman" w:hAnsi="Times New Roman" w:cs="Times New Roman"/>
+          <w:sz w:val="24"/>
+          <w:szCs w:val="24"/>
+        </w:rPr>
+      </w:pPr>
+      <w:r>
+        <w:rPr>
+          <w:rFonts w:ascii="Times New Roman" w:eastAsia="Times New Roman" w:hAnsi="Times New Roman" w:cs="Times New Roman"/>
+          <w:sz w:val="24"/>
+          <w:szCs w:val="24"/>
+        </w:rPr>
+        <w:t>PayPal</w:t>
+      </w:r>
+    </w:p>
+    <w:p>
+      <w:pPr>
+        <w:spacing w:before="100" w:beforeAutospacing="1" w:after="100" w:afterAutospacing="1" w:line="240" w:lineRule="auto"/>
+        <w:rPr>
+          <w:rFonts w:ascii="Times New Roman" w:eastAsia="Times New Roman" w:hAnsi="Times New Roman" w:cs="Times New Roman"/>
+          <w:sz w:val="24"/>
+          <w:szCs w:val="24"/>
+        </w:rPr>
+      </w:pPr>
+      <w:r>
+        <w:rPr>
+          <w:rFonts w:ascii="Times New Roman" w:eastAsia="Times New Roman" w:hAnsi="Times New Roman" w:cs="Times New Roman"/>
+          <w:sz w:val="24"/>
+          <w:szCs w:val="24"/>
+        </w:rPr>
+        <w:t>Ngoài ra có thể thêm:</w:t>
+      </w:r>
+    </w:p>
+    <w:p>
+      <w:pPr>
+        <w:numPr>
+          <w:ilvl w:val="0"/>
+          <w:numId w:val="12"/>
+        </w:numPr>
+        <w:spacing w:before="100" w:beforeAutospacing="1" w:after="100" w:afterAutospacing="1" w:line="240" w:lineRule="auto"/>
+        <w:rPr>
+          <w:rFonts w:ascii="Times New Roman" w:eastAsia="Times New Roman" w:hAnsi="Times New Roman" w:cs="Times New Roman"/>
+          <w:sz w:val="24"/>
+          <w:szCs w:val="24"/>
+        </w:rPr>
+      </w:pPr>
+      <w:r>
+        <w:rPr>
+          <w:rFonts w:ascii="Times New Roman" w:eastAsia="Times New Roman" w:hAnsi="Times New Roman" w:cs="Times New Roman"/>
+          <w:sz w:val="24"/>
+          <w:szCs w:val="24"/>
+        </w:rPr>
+        <w:t>Phí xử lý</w:t>
+      </w:r>
+    </w:p>
+    <w:p>
+      <w:pPr>
+        <w:numPr>
+          <w:ilvl w:val="0"/>
+          <w:numId w:val="12"/>
+        </w:numPr>
+        <w:spacing w:before="100" w:beforeAutospacing="1" w:after="100" w:afterAutospacing="1" w:line="240" w:lineRule="auto"/>
+        <w:rPr>
+          <w:rFonts w:ascii="Times New Roman" w:eastAsia="Times New Roman" w:hAnsi="Times New Roman" w:cs="Times New Roman"/>
+          <w:sz w:val="24"/>
+          <w:szCs w:val="24"/>
+        </w:rPr>
+      </w:pPr>
+      <w:r>
+        <w:rPr>
+          <w:rFonts w:ascii="Times New Roman" w:eastAsia="Times New Roman" w:hAnsi="Times New Roman" w:cs="Times New Roman"/>
+          <w:sz w:val="24"/>
+          <w:szCs w:val="24"/>
+        </w:rPr>
+        <w:t>Mã giảm giá</w:t>
+      </w:r>
+    </w:p>
+    <w:p>
+      <w:pPr>
+        <w:spacing w:before="100" w:beforeAutospacing="1" w:after="100" w:afterAutospacing="1" w:line="240" w:lineRule="auto"/>
+        <w:rPr>
+          <w:rFonts w:ascii="Times New Roman" w:eastAsia="Times New Roman" w:hAnsi="Times New Roman" w:cs="Times New Roman"/>
+          <w:sz w:val="24"/>
+          <w:szCs w:val="24"/>
+        </w:rPr>
+      </w:pPr>
+      <w:r>
+        <w:rPr>
+          <w:rFonts w:ascii="Times New Roman" w:eastAsia="Times New Roman" w:hAnsi="Times New Roman" w:cs="Times New Roman"/>
+          <w:sz w:val="24"/>
+          <w:szCs w:val="24"/>
+        </w:rPr>
+        <w:t>Và quản lý trạng thái thanh toán.</w:t>
+      </w:r>
+    </w:p>
+    <w:p>
+      <w:pPr>
+        <w:spacing w:after="0" w:line="240" w:lineRule="auto"/>
+        <w:rPr>
+          <w:rFonts w:ascii="Times New Roman" w:eastAsia="Times New Roman" w:hAnsi="Times New Roman" w:cs="Times New Roman"/>
+          <w:b/>
+          <w:sz w:val="24"/>
+          <w:szCs w:val="24"/>
+        </w:rPr>
+      </w:pPr>
+      <w:r>
+        <w:rPr>
+          <w:rFonts w:ascii="Times New Roman" w:eastAsia="Times New Roman" w:hAnsi="Times New Roman" w:cs="Times New Roman"/>
+          <w:b/>
+          <w:sz w:val="24"/>
+          <w:szCs w:val="24"/>
+        </w:rPr>
+        <w:t>UML:</w:t>
+      </w:r>
+      <w:r>
+        <w:rPr>
+          <w:rFonts w:ascii="Times New Roman" w:eastAsia="Times New Roman" w:hAnsi="Times New Roman" w:cs="Times New Roman"/>
+          <w:b/>
+          <w:sz w:val="24"/>
+          <w:szCs w:val="24"/>
+        </w:rPr>
+        <w:br/>
+      </w:r>
+      <w:r>
+        <w:rPr>
+          <w:rFonts w:ascii="Times New Roman" w:eastAsia="Times New Roman" w:hAnsi="Times New Roman" w:cs="Times New Roman"/>
+          <w:b/>
+          <w:sz w:val="24"/>
+          <w:szCs w:val="24"/>
+        </w:rPr>
+        <w:drawing>
+          <wp:inline distT="0" distB="0" distL="0" distR="0" wp14:anchorId="0AE6A88C" wp14:editId="5BE1BEDA">
+            <wp:extent cx="5943600" cy="1429385"/>
+            <wp:effectExtent l="0" t="0" r="0" b="0"/>
+            <wp:docPr id="5" name="Picture 5"/>
+            <wp:cNvGraphicFramePr>
+              <a:graphicFrameLocks xmlns:a="http://schemas.openxmlformats.org/drawingml/2006/main" noChangeAspect="1"/>
+            </wp:cNvGraphicFramePr>
+            <a:graphic xmlns:a="http://schemas.openxmlformats.org/drawingml/2006/main">
+              <a:graphicData uri="http://schemas.openxmlformats.org/drawingml/2006/picture">
+                <pic:pic xmlns:pic="http://schemas.openxmlformats.org/drawingml/2006/picture">
+                  <pic:nvPicPr>
+                    <pic:cNvPr id="1" name=""/>
+                    <pic:cNvPicPr/>
+                  </pic:nvPicPr>
+                  <pic:blipFill>
+                    <a:blip r:embed="rId9"/>
+                    <a:stretch>
+                      <a:fillRect/>
+                    </a:stretch>
+                  </pic:blipFill>
+                  <pic:spPr>
+                    <a:xfrm>
+                      <a:off x="0" y="0"/>
+                      <a:ext cx="5943600" cy="1429385"/>
+                    </a:xfrm>
+                    <a:prstGeom prst="rect">
+                      <a:avLst/>
+                    </a:prstGeom>
+                  </pic:spPr>
+                </pic:pic>
+              </a:graphicData>
+            </a:graphic>
+          </wp:inline>
+        </w:drawing>
+      </w:r>
+    </w:p>
+    <w:p>
+      <w:pPr>
+        <w:spacing w:before="100" w:beforeAutospacing="1" w:after="100" w:afterAutospacing="1" w:line="240" w:lineRule="auto"/>
+        <w:outlineLvl w:val="2"/>
+        <w:rPr>
+          <w:rFonts w:ascii="Times New Roman" w:eastAsia="Times New Roman" w:hAnsi="Times New Roman" w:cs="Times New Roman"/>
+          <w:b/>
+          <w:bCs/>
+          <w:sz w:val="27"/>
+          <w:szCs w:val="27"/>
+        </w:rPr>
+      </w:pPr>
+      <w:r>
+        <w:rPr>
+          <w:rFonts w:ascii="Times New Roman" w:eastAsia="Times New Roman" w:hAnsi="Times New Roman" w:cs="Times New Roman"/>
+          <w:b/>
+          <w:bCs/>
+          <w:sz w:val="27"/>
+          <w:szCs w:val="27"/>
+        </w:rPr>
+        <w:lastRenderedPageBreak/>
+        <w:t>2</w:t>
+      </w:r>
+      <w:r>
+        <w:rPr>
+          <w:rFonts w:ascii="Times New Roman" w:eastAsia="Times New Roman" w:hAnsi="Times New Roman" w:cs="Times New Roman"/>
+          <w:b/>
+          <w:bCs/>
+          <w:sz w:val="27"/>
+          <w:szCs w:val="27"/>
+        </w:rPr>
+        <w:t>.</w:t>
+      </w:r>
+      <w:r>
+        <w:rPr>
+          <w:rFonts w:ascii="Times New Roman" w:eastAsia="Times New Roman" w:hAnsi="Times New Roman" w:cs="Times New Roman"/>
+          <w:b/>
+          <w:bCs/>
+          <w:sz w:val="27"/>
+          <w:szCs w:val="27"/>
+        </w:rPr>
+        <w:t xml:space="preserve"> Áp dụng Design Pattern</w:t>
+      </w:r>
+    </w:p>
+    <w:p>
+      <w:pPr>
+        <w:spacing w:before="100" w:beforeAutospacing="1" w:after="100" w:afterAutospacing="1" w:line="240" w:lineRule="auto"/>
+        <w:outlineLvl w:val="3"/>
+        <w:rPr>
+          <w:rFonts w:ascii="Times New Roman" w:eastAsia="Times New Roman" w:hAnsi="Times New Roman" w:cs="Times New Roman"/>
+          <w:b/>
+          <w:bCs/>
+          <w:sz w:val="24"/>
+          <w:szCs w:val="24"/>
+        </w:rPr>
+      </w:pPr>
+      <w:r>
+        <w:rPr>
+          <w:rFonts w:ascii="Times New Roman" w:eastAsia="Times New Roman" w:hAnsi="Times New Roman" w:cs="Times New Roman"/>
+          <w:b/>
+          <w:bCs/>
+          <w:sz w:val="24"/>
+          <w:szCs w:val="24"/>
+        </w:rPr>
+        <w:t>Strategy Pattern</w:t>
+      </w:r>
+    </w:p>
+    <w:p>
+      <w:pPr>
+        <w:numPr>
+          <w:ilvl w:val="0"/>
+          <w:numId w:val="13"/>
+        </w:numPr>
+        <w:spacing w:before="100" w:beforeAutospacing="1" w:after="100" w:afterAutospacing="1" w:line="240" w:lineRule="auto"/>
+        <w:rPr>
+          <w:rFonts w:ascii="Times New Roman" w:eastAsia="Times New Roman" w:hAnsi="Times New Roman" w:cs="Times New Roman"/>
+          <w:sz w:val="24"/>
+          <w:szCs w:val="24"/>
+        </w:rPr>
+      </w:pPr>
+      <w:r>
+        <w:rPr>
+          <w:rFonts w:ascii="Times New Roman" w:eastAsia="Times New Roman" w:hAnsi="Times New Roman" w:cs="Times New Roman"/>
+          <w:sz w:val="24"/>
+          <w:szCs w:val="24"/>
+        </w:rPr>
+        <w:t>Đại diện cho các phương thức thanh toán</w:t>
+      </w:r>
+    </w:p>
+    <w:p>
+      <w:pPr>
+        <w:numPr>
+          <w:ilvl w:val="0"/>
+          <w:numId w:val="13"/>
+        </w:numPr>
+        <w:spacing w:before="100" w:beforeAutospacing="1" w:after="100" w:afterAutospacing="1" w:line="240" w:lineRule="auto"/>
+        <w:rPr>
+          <w:rFonts w:ascii="Times New Roman" w:eastAsia="Times New Roman" w:hAnsi="Times New Roman" w:cs="Times New Roman"/>
+          <w:sz w:val="24"/>
+          <w:szCs w:val="24"/>
+        </w:rPr>
+      </w:pPr>
+      <w:r>
+        <w:rPr>
+          <w:rFonts w:ascii="Times New Roman" w:eastAsia="Times New Roman" w:hAnsi="Times New Roman" w:cs="Times New Roman"/>
+          <w:sz w:val="24"/>
+          <w:szCs w:val="24"/>
+        </w:rPr>
+        <w:t>Dễ dàng thêm phương thức mới</w:t>
+      </w:r>
+    </w:p>
+    <w:p>
+      <w:pPr>
+        <w:spacing w:before="100" w:beforeAutospacing="1" w:after="100" w:afterAutospacing="1" w:line="240" w:lineRule="auto"/>
+        <w:outlineLvl w:val="3"/>
+        <w:rPr>
+          <w:rFonts w:ascii="Times New Roman" w:eastAsia="Times New Roman" w:hAnsi="Times New Roman" w:cs="Times New Roman"/>
+          <w:b/>
+          <w:bCs/>
+          <w:sz w:val="24"/>
+          <w:szCs w:val="24"/>
+        </w:rPr>
+      </w:pPr>
+      <w:r>
+        <w:rPr>
+          <w:rFonts w:ascii="Times New Roman" w:eastAsia="Times New Roman" w:hAnsi="Times New Roman" w:cs="Times New Roman"/>
+          <w:b/>
+          <w:bCs/>
+          <w:sz w:val="24"/>
+          <w:szCs w:val="24"/>
+        </w:rPr>
+        <w:t>Decorator Pattern</w:t>
+      </w:r>
+    </w:p>
+    <w:p>
+      <w:pPr>
+        <w:numPr>
+          <w:ilvl w:val="0"/>
+          <w:numId w:val="14"/>
+        </w:numPr>
+        <w:spacing w:before="100" w:beforeAutospacing="1" w:after="100" w:afterAutospacing="1" w:line="240" w:lineRule="auto"/>
+        <w:rPr>
+          <w:rFonts w:ascii="Times New Roman" w:eastAsia="Times New Roman" w:hAnsi="Times New Roman" w:cs="Times New Roman"/>
+          <w:sz w:val="24"/>
+          <w:szCs w:val="24"/>
+        </w:rPr>
+      </w:pPr>
+      <w:r>
+        <w:rPr>
+          <w:rFonts w:ascii="Times New Roman" w:eastAsia="Times New Roman" w:hAnsi="Times New Roman" w:cs="Times New Roman"/>
+          <w:sz w:val="24"/>
+          <w:szCs w:val="24"/>
+        </w:rPr>
+        <w:t>Thêm phí hoặc giảm giá</w:t>
+      </w:r>
+    </w:p>
+    <w:p>
+      <w:pPr>
+        <w:numPr>
+          <w:ilvl w:val="0"/>
+          <w:numId w:val="14"/>
+        </w:numPr>
+        <w:spacing w:before="100" w:beforeAutospacing="1" w:after="100" w:afterAutospacing="1" w:line="240" w:lineRule="auto"/>
+        <w:rPr>
+          <w:rFonts w:ascii="Times New Roman" w:eastAsia="Times New Roman" w:hAnsi="Times New Roman" w:cs="Times New Roman"/>
+          <w:sz w:val="24"/>
+          <w:szCs w:val="24"/>
+        </w:rPr>
+      </w:pPr>
+      <w:r>
+        <w:rPr>
+          <w:rFonts w:ascii="Times New Roman" w:eastAsia="Times New Roman" w:hAnsi="Times New Roman" w:cs="Times New Roman"/>
+          <w:sz w:val="24"/>
+          <w:szCs w:val="24"/>
+        </w:rPr>
+        <w:t>Kết hợp linh hoạt</w:t>
+      </w:r>
+    </w:p>
+    <w:p>
+      <w:pPr>
+        <w:spacing w:before="100" w:beforeAutospacing="1" w:after="100" w:afterAutospacing="1" w:line="240" w:lineRule="auto"/>
+        <w:outlineLvl w:val="3"/>
+        <w:rPr>
+          <w:rFonts w:ascii="Times New Roman" w:eastAsia="Times New Roman" w:hAnsi="Times New Roman" w:cs="Times New Roman"/>
+          <w:b/>
+          <w:bCs/>
+          <w:sz w:val="24"/>
+          <w:szCs w:val="24"/>
+        </w:rPr>
+      </w:pPr>
+      <w:r>
+        <w:rPr>
+          <w:rFonts w:ascii="Times New Roman" w:eastAsia="Times New Roman" w:hAnsi="Times New Roman" w:cs="Times New Roman"/>
+          <w:b/>
+          <w:bCs/>
+          <w:sz w:val="24"/>
+          <w:szCs w:val="24"/>
+        </w:rPr>
+        <w:t>State Pattern</w:t>
+      </w:r>
+    </w:p>
+    <w:p>
+      <w:pPr>
+        <w:numPr>
+          <w:ilvl w:val="0"/>
+          <w:numId w:val="15"/>
+        </w:numPr>
+        <w:spacing w:before="100" w:beforeAutospacing="1" w:after="100" w:afterAutospacing="1" w:line="240" w:lineRule="auto"/>
+        <w:rPr>
+          <w:rFonts w:ascii="Times New Roman" w:eastAsia="Times New Roman" w:hAnsi="Times New Roman" w:cs="Times New Roman"/>
+          <w:sz w:val="24"/>
+          <w:szCs w:val="24"/>
+        </w:rPr>
+      </w:pPr>
+      <w:r>
+        <w:rPr>
+          <w:rFonts w:ascii="Times New Roman" w:eastAsia="Times New Roman" w:hAnsi="Times New Roman" w:cs="Times New Roman"/>
+          <w:sz w:val="24"/>
+          <w:szCs w:val="24"/>
+        </w:rPr>
+        <w:t>Quản lý trạng thái thanh toán</w:t>
+      </w:r>
+    </w:p>
+    <w:p>
+      <w:pPr>
+        <w:numPr>
+          <w:ilvl w:val="0"/>
+          <w:numId w:val="15"/>
+        </w:numPr>
+        <w:spacing w:before="100" w:beforeAutospacing="1" w:after="100" w:afterAutospacing="1" w:line="240" w:lineRule="auto"/>
+        <w:rPr>
+          <w:rFonts w:ascii="Times New Roman" w:eastAsia="Times New Roman" w:hAnsi="Times New Roman" w:cs="Times New Roman"/>
+          <w:sz w:val="24"/>
+          <w:szCs w:val="24"/>
+        </w:rPr>
+      </w:pPr>
+      <w:r>
+        <w:rPr>
+          <w:rFonts w:ascii="Times New Roman" w:eastAsia="Times New Roman" w:hAnsi="Times New Roman" w:cs="Times New Roman"/>
+          <w:sz w:val="24"/>
+          <w:szCs w:val="24"/>
+        </w:rPr>
+        <w:t>Tránh if-else</w:t>
+      </w:r>
+    </w:p>
+    <w:p>
+      <w:pPr>
+        <w:spacing w:after="0" w:line="240" w:lineRule="auto"/>
+        <w:rPr>
+          <w:rFonts w:ascii="Times New Roman" w:eastAsia="Times New Roman" w:hAnsi="Times New Roman" w:cs="Times New Roman"/>
+          <w:sz w:val="24"/>
+          <w:szCs w:val="24"/>
+        </w:rPr>
+      </w:pPr>
+    </w:p>
+    <w:p>
+      <w:pPr>
+        <w:spacing w:before="100" w:beforeAutospacing="1" w:after="100" w:afterAutospacing="1" w:line="240" w:lineRule="auto"/>
+        <w:outlineLvl w:val="2"/>
+        <w:rPr>
+          <w:rFonts w:ascii="Times New Roman" w:eastAsia="Times New Roman" w:hAnsi="Times New Roman" w:cs="Times New Roman"/>
+          <w:b/>
+          <w:bCs/>
+          <w:sz w:val="27"/>
+          <w:szCs w:val="27"/>
+        </w:rPr>
+      </w:pPr>
+      <w:r>
+        <w:rPr>
+          <w:rFonts w:ascii="Times New Roman" w:eastAsia="Times New Roman" w:hAnsi="Times New Roman" w:cs="Times New Roman"/>
+          <w:b/>
+          <w:bCs/>
+          <w:sz w:val="27"/>
+          <w:szCs w:val="27"/>
+        </w:rPr>
+        <w:t>3.</w:t>
+      </w:r>
+      <w:r>
+        <w:rPr>
+          <w:rFonts w:ascii="Times New Roman" w:eastAsia="Times New Roman" w:hAnsi="Times New Roman" w:cs="Times New Roman"/>
+          <w:b/>
+          <w:bCs/>
+          <w:sz w:val="27"/>
+          <w:szCs w:val="27"/>
+        </w:rPr>
+        <w:t xml:space="preserve"> Kết quả</w:t>
+      </w:r>
+    </w:p>
+    <w:p>
+      <w:pPr>
+        <w:numPr>
+          <w:ilvl w:val="0"/>
+          <w:numId w:val="16"/>
+        </w:numPr>
+        <w:spacing w:before="100" w:beforeAutospacing="1" w:after="100" w:afterAutospacing="1" w:line="240" w:lineRule="auto"/>
+        <w:rPr>
+          <w:rFonts w:ascii="Times New Roman" w:eastAsia="Times New Roman" w:hAnsi="Times New Roman" w:cs="Times New Roman"/>
+          <w:sz w:val="24"/>
+          <w:szCs w:val="24"/>
+        </w:rPr>
+      </w:pPr>
+      <w:r>
+        <w:rPr>
+          <w:rFonts w:ascii="Times New Roman" w:eastAsia="Times New Roman" w:hAnsi="Times New Roman" w:cs="Times New Roman"/>
+          <w:sz w:val="24"/>
+          <w:szCs w:val="24"/>
+        </w:rPr>
+        <w:t>Hệ thống linh hoạt</w:t>
+      </w:r>
+    </w:p>
+    <w:p>
+      <w:pPr>
+        <w:numPr>
+          <w:ilvl w:val="0"/>
+          <w:numId w:val="16"/>
+        </w:numPr>
+        <w:spacing w:before="100" w:beforeAutospacing="1" w:after="100" w:afterAutospacing="1" w:line="240" w:lineRule="auto"/>
+        <w:rPr>
+          <w:rFonts w:ascii="Times New Roman" w:eastAsia="Times New Roman" w:hAnsi="Times New Roman" w:cs="Times New Roman"/>
+          <w:sz w:val="24"/>
+          <w:szCs w:val="24"/>
+        </w:rPr>
+      </w:pPr>
+      <w:r>
+        <w:rPr>
+          <w:rFonts w:ascii="Times New Roman" w:eastAsia="Times New Roman" w:hAnsi="Times New Roman" w:cs="Times New Roman"/>
+          <w:sz w:val="24"/>
+          <w:szCs w:val="24"/>
+        </w:rPr>
+        <w:t>Dễ mở rộng</w:t>
+      </w:r>
+    </w:p>
+    <w:p>
+      <w:pPr>
+        <w:numPr>
+          <w:ilvl w:val="0"/>
+          <w:numId w:val="16"/>
+        </w:numPr>
+        <w:spacing w:before="100" w:beforeAutospacing="1" w:after="100" w:afterAutospacing="1" w:line="240" w:lineRule="auto"/>
+        <w:rPr>
+          <w:rFonts w:ascii="Times New Roman" w:eastAsia="Times New Roman" w:hAnsi="Times New Roman" w:cs="Times New Roman"/>
+          <w:sz w:val="24"/>
+          <w:szCs w:val="24"/>
+        </w:rPr>
+      </w:pPr>
+      <w:r>
+        <w:rPr>
+          <w:rFonts w:ascii="Times New Roman" w:eastAsia="Times New Roman" w:hAnsi="Times New Roman" w:cs="Times New Roman"/>
+          <w:sz w:val="24"/>
+          <w:szCs w:val="24"/>
+        </w:rPr>
+        <w:t>Code rõ ràng, dễ bảo trì</w:t>
+      </w:r>
+    </w:p>
+    <w:p>
+      <w:pPr>
+        <w:spacing w:after="0" w:line="240" w:lineRule="auto"/>
+        <w:rPr>
+          <w:rFonts w:ascii="Times New Roman" w:eastAsia="Times New Roman" w:hAnsi="Times New Roman" w:cs="Times New Roman"/>
+          <w:sz w:val="24"/>
+          <w:szCs w:val="24"/>
+        </w:rPr>
+      </w:pPr>
+      <w:r>
+        <w:rPr>
+          <w:rFonts w:ascii="Times New Roman" w:eastAsia="Times New Roman" w:hAnsi="Times New Roman" w:cs="Times New Roman"/>
+          <w:sz w:val="24"/>
+          <w:szCs w:val="24"/>
+        </w:rPr>
+        <w:drawing>
+          <wp:inline distT="0" distB="0" distL="0" distR="0" wp14:anchorId="09CC814E" wp14:editId="1B24B39C">
+            <wp:extent cx="5943600" cy="3343275"/>
+            <wp:effectExtent l="0" t="0" r="0" b="9525"/>
+            <wp:docPr id="6" name="Picture 6"/>
+            <wp:cNvGraphicFramePr>
+              <a:graphicFrameLocks xmlns:a="http://schemas.openxmlformats.org/drawingml/2006/main" noChangeAspect="1"/>
+            </wp:cNvGraphicFramePr>
+            <a:graphic xmlns:a="http://schemas.openxmlformats.org/drawingml/2006/main">
+              <a:graphicData uri="http://schemas.openxmlformats.org/drawingml/2006/picture">
+                <pic:pic xmlns:pic="http://schemas.openxmlformats.org/drawingml/2006/picture">
+                  <pic:nvPicPr>
+                    <pic:cNvPr id="1" name=""/>
+                    <pic:cNvPicPr/>
+                  </pic:nvPicPr>
+                  <pic:blipFill>
+                    <a:blip r:embed="rId10"/>
+                    <a:stretch>
+                      <a:fillRect/>
+                    </a:stretch>
+                  </pic:blipFill>
+                  <pic:spPr>
+                    <a:xfrm>
+                      <a:off x="0" y="0"/>
+                      <a:ext cx="5943600" cy="3343275"/>
+                    </a:xfrm>
+                    <a:prstGeom prst="rect">
+                      <a:avLst/>
+                    </a:prstGeom>
+                  </pic:spPr>
+                </pic:pic>
+              </a:graphicData>
+            </a:graphic>
+          </wp:inline>
+        </w:drawing>
+      </w:r>
+    </w:p>
+    <w:p>
+      <w:pPr>
+        <w:spacing w:before="100" w:beforeAutospacing="1" w:after="100" w:afterAutospacing="1" w:line="240" w:lineRule="auto"/>
+        <w:outlineLvl w:val="1"/>
+        <w:rPr>
+          <w:rFonts w:ascii="Times New Roman" w:eastAsia="Times New Roman" w:hAnsi="Times New Roman" w:cs="Times New Roman"/>
+          <w:b/>
+          <w:bCs/>
+          <w:sz w:val="36"/>
+          <w:szCs w:val="36"/>
+        </w:rPr>
+      </w:pPr>
+      <w:r>
+        <w:rPr>
+          <w:rFonts w:ascii="Times New Roman" w:eastAsia="Times New Roman" w:hAnsi="Times New Roman" w:cs="Times New Roman"/>
+          <w:b/>
+          <w:bCs/>
+          <w:sz w:val="36"/>
+          <w:szCs w:val="36"/>
+        </w:rPr>
+        <w:lastRenderedPageBreak/>
+        <w:t xml:space="preserve">4. Kết luận </w:t>
+      </w:r>
+      <w:proofErr w:type="gramStart"/>
+      <w:r>
+        <w:rPr>
+          <w:rFonts w:ascii="Times New Roman" w:eastAsia="Times New Roman" w:hAnsi="Times New Roman" w:cs="Times New Roman"/>
+          <w:b/>
+          <w:bCs/>
+          <w:sz w:val="36"/>
+          <w:szCs w:val="36"/>
+        </w:rPr>
+        <w:t>chung</w:t>
+      </w:r>
+      <w:proofErr w:type="gramEnd"/>
+    </w:p>
+    <w:p>
+      <w:pPr>
+        <w:spacing w:before="100" w:beforeAutospacing="1" w:after="100" w:afterAutospacing="1" w:line="240" w:lineRule="auto"/>
+        <w:rPr>
+          <w:rFonts w:ascii="Times New Roman" w:eastAsia="Times New Roman" w:hAnsi="Times New Roman" w:cs="Times New Roman"/>
+          <w:sz w:val="24"/>
+          <w:szCs w:val="24"/>
+        </w:rPr>
+      </w:pPr>
+      <w:r>
+        <w:rPr>
+          <w:rFonts w:ascii="Times New Roman" w:eastAsia="Times New Roman" w:hAnsi="Times New Roman" w:cs="Times New Roman"/>
+          <w:sz w:val="24"/>
+          <w:szCs w:val="24"/>
+        </w:rPr>
+        <w:t>Việc áp dụng các Design Pattern giúp hệ thống:</w:t>
+      </w:r>
+    </w:p>
+    <w:p>
+      <w:pPr>
+        <w:numPr>
+          <w:ilvl w:val="0"/>
+          <w:numId w:val="17"/>
+        </w:numPr>
+        <w:spacing w:before="100" w:beforeAutospacing="1" w:after="100" w:afterAutospacing="1" w:line="240" w:lineRule="auto"/>
+        <w:rPr>
+          <w:rFonts w:ascii="Times New Roman" w:eastAsia="Times New Roman" w:hAnsi="Times New Roman" w:cs="Times New Roman"/>
+          <w:sz w:val="24"/>
+          <w:szCs w:val="24"/>
+        </w:rPr>
+      </w:pPr>
+      <w:r>
+        <w:rPr>
+          <w:rFonts w:ascii="Times New Roman" w:eastAsia="Times New Roman" w:hAnsi="Times New Roman" w:cs="Times New Roman"/>
+          <w:sz w:val="24"/>
+          <w:szCs w:val="24"/>
+        </w:rPr>
+        <w:t>Giảm phụ thuộc giữa các lớp</w:t>
+      </w:r>
+    </w:p>
+    <w:p>
+      <w:pPr>
+        <w:numPr>
+          <w:ilvl w:val="0"/>
+          <w:numId w:val="17"/>
+        </w:numPr>
+        <w:spacing w:before="100" w:beforeAutospacing="1" w:after="100" w:afterAutospacing="1" w:line="240" w:lineRule="auto"/>
+        <w:rPr>
+          <w:rFonts w:ascii="Times New Roman" w:eastAsia="Times New Roman" w:hAnsi="Times New Roman" w:cs="Times New Roman"/>
+          <w:sz w:val="24"/>
+          <w:szCs w:val="24"/>
+        </w:rPr>
+      </w:pPr>
+      <w:r>
+        <w:rPr>
+          <w:rFonts w:ascii="Times New Roman" w:eastAsia="Times New Roman" w:hAnsi="Times New Roman" w:cs="Times New Roman"/>
+          <w:sz w:val="24"/>
+          <w:szCs w:val="24"/>
+        </w:rPr>
+        <w:t>Dễ mở rộng</w:t>
+      </w:r>
+    </w:p>
+    <w:p>
+      <w:pPr>
+        <w:numPr>
+          <w:ilvl w:val="0"/>
+          <w:numId w:val="17"/>
+        </w:numPr>
+        <w:spacing w:before="100" w:beforeAutospacing="1" w:after="100" w:afterAutospacing="1" w:line="240" w:lineRule="auto"/>
+        <w:rPr>
+          <w:rFonts w:ascii="Times New Roman" w:eastAsia="Times New Roman" w:hAnsi="Times New Roman" w:cs="Times New Roman"/>
+          <w:sz w:val="24"/>
+          <w:szCs w:val="24"/>
+        </w:rPr>
+      </w:pPr>
+      <w:r>
+        <w:rPr>
+          <w:rFonts w:ascii="Times New Roman" w:eastAsia="Times New Roman" w:hAnsi="Times New Roman" w:cs="Times New Roman"/>
+          <w:sz w:val="24"/>
+          <w:szCs w:val="24"/>
+        </w:rPr>
+        <w:t>Tái sử dụng code</w:t>
+      </w:r>
+    </w:p>
+    <w:p>
+      <w:pPr>
+        <w:spacing w:before="100" w:beforeAutospacing="1" w:after="100" w:afterAutospacing="1" w:line="240" w:lineRule="auto"/>
+        <w:rPr>
+          <w:rFonts w:ascii="Times New Roman" w:eastAsia="Times New Roman" w:hAnsi="Times New Roman" w:cs="Times New Roman"/>
+          <w:sz w:val="24"/>
+          <w:szCs w:val="24"/>
+        </w:rPr>
+      </w:pPr>
+      <w:r>
+        <w:rPr>
+          <w:rFonts w:ascii="Times New Roman" w:eastAsia="Times New Roman" w:hAnsi="Times New Roman" w:cs="Times New Roman"/>
+          <w:sz w:val="24"/>
+          <w:szCs w:val="24"/>
+        </w:rPr>
+        <w:t>Ba pattern State, Strategy và Decorator rất phù hợp cho các hệ thống thực tế như:</w:t>
+      </w:r>
+    </w:p>
+    <w:p>
+      <w:pPr>
+        <w:numPr>
+          <w:ilvl w:val="0"/>
+          <w:numId w:val="18"/>
+        </w:numPr>
+        <w:spacing w:before="100" w:beforeAutospacing="1" w:after="100" w:afterAutospacing="1" w:line="240" w:lineRule="auto"/>
+        <w:rPr>
+          <w:rFonts w:ascii="Times New Roman" w:eastAsia="Times New Roman" w:hAnsi="Times New Roman" w:cs="Times New Roman"/>
+          <w:sz w:val="24"/>
+          <w:szCs w:val="24"/>
+        </w:rPr>
+      </w:pPr>
+      <w:r>
+        <w:rPr>
+          <w:rFonts w:ascii="Times New Roman" w:eastAsia="Times New Roman" w:hAnsi="Times New Roman" w:cs="Times New Roman"/>
+          <w:sz w:val="24"/>
+          <w:szCs w:val="24"/>
+        </w:rPr>
+        <w:t>Thương mại điện tử</w:t>
+      </w:r>
+    </w:p>
+    <w:p>
+      <w:pPr>
+        <w:numPr>
+          <w:ilvl w:val="0"/>
+          <w:numId w:val="18"/>
+        </w:numPr>
+        <w:spacing w:before="100" w:beforeAutospacing="1" w:after="100" w:afterAutospacing="1" w:line="240" w:lineRule="auto"/>
+        <w:rPr>
+          <w:rFonts w:ascii="Times New Roman" w:eastAsia="Times New Roman" w:hAnsi="Times New Roman" w:cs="Times New Roman"/>
+          <w:sz w:val="24"/>
+          <w:szCs w:val="24"/>
+        </w:rPr>
+      </w:pPr>
+      <w:r>
+        <w:rPr>
+          <w:rFonts w:ascii="Times New Roman" w:eastAsia="Times New Roman" w:hAnsi="Times New Roman" w:cs="Times New Roman"/>
+          <w:sz w:val="24"/>
+          <w:szCs w:val="24"/>
+        </w:rPr>
+        <w:t>Thanh toán online</w:t>
+      </w:r>
+    </w:p>
+    <w:p>
+      <w:pPr>
+        <w:numPr>
+          <w:ilvl w:val="0"/>
+          <w:numId w:val="18"/>
+        </w:numPr>
+        <w:spacing w:before="100" w:beforeAutospacing="1" w:after="100" w:afterAutospacing="1" w:line="240" w:lineRule="auto"/>
+        <w:rPr>
+          <w:rFonts w:ascii="Times New Roman" w:eastAsia="Times New Roman" w:hAnsi="Times New Roman" w:cs="Times New Roman"/>
+          <w:sz w:val="24"/>
+          <w:szCs w:val="24"/>
+        </w:rPr>
+      </w:pPr>
+      <w:r>
+        <w:rPr>
+          <w:rFonts w:ascii="Times New Roman" w:eastAsia="Times New Roman" w:hAnsi="Times New Roman" w:cs="Times New Roman"/>
+          <w:sz w:val="24"/>
+          <w:szCs w:val="24"/>
+        </w:rPr>
+        <w:t>Quản lý đơn hàng</w:t>
+      </w:r>
+    </w:p>
+    <w:p/>
     <w:sectPr>
       <w:pgSz w:w="12240" w:h="15840"/>
       <w:pgMar w:top="1440" w:right="1440" w:bottom="1440" w:left="1440" w:header="720" w:footer="720" w:gutter="0"/>
@@ -1516,6 +2405,304 @@
     </w:lvl>
   </w:abstractNum>
   <w:abstractNum w:abstractNumId="1">
+    <w:nsid w:val="0CC046E6"/>
+    <w:multiLevelType w:val="multilevel"/>
+    <w:tmpl w:val="50CAB1D2"/>
+    <w:lvl w:ilvl="0">
+      <w:start w:val="1"/>
+      <w:numFmt w:val="bullet"/>
+      <w:lvlText w:val=""/>
+      <w:lvlJc w:val="left"/>
+      <w:pPr>
+        <w:tabs>
+          <w:tab w:val="num" w:pos="720"/>
+        </w:tabs>
+        <w:ind w:left="720" w:hanging="360"/>
+      </w:pPr>
+      <w:rPr>
+        <w:rFonts w:ascii="Symbol" w:hAnsi="Symbol" w:hint="default"/>
+        <w:sz w:val="20"/>
+      </w:rPr>
+    </w:lvl>
+    <w:lvl w:ilvl="1" w:tentative="1">
+      <w:start w:val="1"/>
+      <w:numFmt w:val="bullet"/>
+      <w:lvlText w:val="o"/>
+      <w:lvlJc w:val="left"/>
+      <w:pPr>
+        <w:tabs>
+          <w:tab w:val="num" w:pos="1440"/>
+        </w:tabs>
+        <w:ind w:left="1440" w:hanging="360"/>
+      </w:pPr>
+      <w:rPr>
+        <w:rFonts w:ascii="Courier New" w:hAnsi="Courier New" w:hint="default"/>
+        <w:sz w:val="20"/>
+      </w:rPr>
+    </w:lvl>
+    <w:lvl w:ilvl="2" w:tentative="1">
+      <w:start w:val="1"/>
+      <w:numFmt w:val="bullet"/>
+      <w:lvlText w:val=""/>
+      <w:lvlJc w:val="left"/>
+      <w:pPr>
+        <w:tabs>
+          <w:tab w:val="num" w:pos="2160"/>
+        </w:tabs>
+        <w:ind w:left="2160" w:hanging="360"/>
+      </w:pPr>
+      <w:rPr>
+        <w:rFonts w:ascii="Wingdings" w:hAnsi="Wingdings" w:hint="default"/>
+        <w:sz w:val="20"/>
+      </w:rPr>
+    </w:lvl>
+    <w:lvl w:ilvl="3" w:tentative="1">
+      <w:start w:val="1"/>
+      <w:numFmt w:val="bullet"/>
+      <w:lvlText w:val=""/>
+      <w:lvlJc w:val="left"/>
+      <w:pPr>
+        <w:tabs>
+          <w:tab w:val="num" w:pos="2880"/>
+        </w:tabs>
+        <w:ind w:left="2880" w:hanging="360"/>
+      </w:pPr>
+      <w:rPr>
+        <w:rFonts w:ascii="Wingdings" w:hAnsi="Wingdings" w:hint="default"/>
+        <w:sz w:val="20"/>
+      </w:rPr>
+    </w:lvl>
+    <w:lvl w:ilvl="4" w:tentative="1">
+      <w:start w:val="1"/>
+      <w:numFmt w:val="bullet"/>
+      <w:lvlText w:val=""/>
+      <w:lvlJc w:val="left"/>
+      <w:pPr>
+        <w:tabs>
+          <w:tab w:val="num" w:pos="3600"/>
+        </w:tabs>
+        <w:ind w:left="3600" w:hanging="360"/>
+      </w:pPr>
+      <w:rPr>
+        <w:rFonts w:ascii="Wingdings" w:hAnsi="Wingdings" w:hint="default"/>
+        <w:sz w:val="20"/>
+      </w:rPr>
+    </w:lvl>
+    <w:lvl w:ilvl="5" w:tentative="1">
+      <w:start w:val="1"/>
+      <w:numFmt w:val="bullet"/>
+      <w:lvlText w:val=""/>
+      <w:lvlJc w:val="left"/>
+      <w:pPr>
+        <w:tabs>
+          <w:tab w:val="num" w:pos="4320"/>
+        </w:tabs>
+        <w:ind w:left="4320" w:hanging="360"/>
+      </w:pPr>
+      <w:rPr>
+        <w:rFonts w:ascii="Wingdings" w:hAnsi="Wingdings" w:hint="default"/>
+        <w:sz w:val="20"/>
+      </w:rPr>
+    </w:lvl>
+    <w:lvl w:ilvl="6" w:tentative="1">
+      <w:start w:val="1"/>
+      <w:numFmt w:val="bullet"/>
+      <w:lvlText w:val=""/>
+      <w:lvlJc w:val="left"/>
+      <w:pPr>
+        <w:tabs>
+          <w:tab w:val="num" w:pos="5040"/>
+        </w:tabs>
+        <w:ind w:left="5040" w:hanging="360"/>
+      </w:pPr>
+      <w:rPr>
+        <w:rFonts w:ascii="Wingdings" w:hAnsi="Wingdings" w:hint="default"/>
+        <w:sz w:val="20"/>
+      </w:rPr>
+    </w:lvl>
+    <w:lvl w:ilvl="7" w:tentative="1">
+      <w:start w:val="1"/>
+      <w:numFmt w:val="bullet"/>
+      <w:lvlText w:val=""/>
+      <w:lvlJc w:val="left"/>
+      <w:pPr>
+        <w:tabs>
+          <w:tab w:val="num" w:pos="5760"/>
+        </w:tabs>
+        <w:ind w:left="5760" w:hanging="360"/>
+      </w:pPr>
+      <w:rPr>
+        <w:rFonts w:ascii="Wingdings" w:hAnsi="Wingdings" w:hint="default"/>
+        <w:sz w:val="20"/>
+      </w:rPr>
+    </w:lvl>
+    <w:lvl w:ilvl="8" w:tentative="1">
+      <w:start w:val="1"/>
+      <w:numFmt w:val="bullet"/>
+      <w:lvlText w:val=""/>
+      <w:lvlJc w:val="left"/>
+      <w:pPr>
+        <w:tabs>
+          <w:tab w:val="num" w:pos="6480"/>
+        </w:tabs>
+        <w:ind w:left="6480" w:hanging="360"/>
+      </w:pPr>
+      <w:rPr>
+        <w:rFonts w:ascii="Wingdings" w:hAnsi="Wingdings" w:hint="default"/>
+        <w:sz w:val="20"/>
+      </w:rPr>
+    </w:lvl>
+  </w:abstractNum>
+  <w:abstractNum w:abstractNumId="2">
+    <w:nsid w:val="0D9E0845"/>
+    <w:multiLevelType w:val="multilevel"/>
+    <w:tmpl w:val="DBA6F324"/>
+    <w:lvl w:ilvl="0">
+      <w:start w:val="1"/>
+      <w:numFmt w:val="bullet"/>
+      <w:lvlText w:val=""/>
+      <w:lvlJc w:val="left"/>
+      <w:pPr>
+        <w:tabs>
+          <w:tab w:val="num" w:pos="720"/>
+        </w:tabs>
+        <w:ind w:left="720" w:hanging="360"/>
+      </w:pPr>
+      <w:rPr>
+        <w:rFonts w:ascii="Symbol" w:hAnsi="Symbol" w:hint="default"/>
+        <w:sz w:val="20"/>
+      </w:rPr>
+    </w:lvl>
+    <w:lvl w:ilvl="1" w:tentative="1">
+      <w:start w:val="1"/>
+      <w:numFmt w:val="bullet"/>
+      <w:lvlText w:val="o"/>
+      <w:lvlJc w:val="left"/>
+      <w:pPr>
+        <w:tabs>
+          <w:tab w:val="num" w:pos="1440"/>
+        </w:tabs>
+        <w:ind w:left="1440" w:hanging="360"/>
+      </w:pPr>
+      <w:rPr>
+        <w:rFonts w:ascii="Courier New" w:hAnsi="Courier New" w:hint="default"/>
+        <w:sz w:val="20"/>
+      </w:rPr>
+    </w:lvl>
+    <w:lvl w:ilvl="2" w:tentative="1">
+      <w:start w:val="1"/>
+      <w:numFmt w:val="bullet"/>
+      <w:lvlText w:val=""/>
+      <w:lvlJc w:val="left"/>
+      <w:pPr>
+        <w:tabs>
+          <w:tab w:val="num" w:pos="2160"/>
+        </w:tabs>
+        <w:ind w:left="2160" w:hanging="360"/>
+      </w:pPr>
+      <w:rPr>
+        <w:rFonts w:ascii="Wingdings" w:hAnsi="Wingdings" w:hint="default"/>
+        <w:sz w:val="20"/>
+      </w:rPr>
+    </w:lvl>
+    <w:lvl w:ilvl="3" w:tentative="1">
+      <w:start w:val="1"/>
+      <w:numFmt w:val="bullet"/>
+      <w:lvlText w:val=""/>
+      <w:lvlJc w:val="left"/>
+      <w:pPr>
+        <w:tabs>
+          <w:tab w:val="num" w:pos="2880"/>
+        </w:tabs>
+        <w:ind w:left="2880" w:hanging="360"/>
+      </w:pPr>
+      <w:rPr>
+        <w:rFonts w:ascii="Wingdings" w:hAnsi="Wingdings" w:hint="default"/>
+        <w:sz w:val="20"/>
+      </w:rPr>
+    </w:lvl>
+    <w:lvl w:ilvl="4" w:tentative="1">
+      <w:start w:val="1"/>
+      <w:numFmt w:val="bullet"/>
+      <w:lvlText w:val=""/>
+      <w:lvlJc w:val="left"/>
+      <w:pPr>
+        <w:tabs>
+          <w:tab w:val="num" w:pos="3600"/>
+        </w:tabs>
+        <w:ind w:left="3600" w:hanging="360"/>
+      </w:pPr>
+      <w:rPr>
+        <w:rFonts w:ascii="Wingdings" w:hAnsi="Wingdings" w:hint="default"/>
+        <w:sz w:val="20"/>
+      </w:rPr>
+    </w:lvl>
+    <w:lvl w:ilvl="5" w:tentative="1">
+      <w:start w:val="1"/>
+      <w:numFmt w:val="bullet"/>
+      <w:lvlText w:val=""/>
+      <w:lvlJc w:val="left"/>
+      <w:pPr>
+        <w:tabs>
+          <w:tab w:val="num" w:pos="4320"/>
+        </w:tabs>
+        <w:ind w:left="4320" w:hanging="360"/>
+      </w:pPr>
+      <w:rPr>
+        <w:rFonts w:ascii="Wingdings" w:hAnsi="Wingdings" w:hint="default"/>
+        <w:sz w:val="20"/>
+      </w:rPr>
+    </w:lvl>
+    <w:lvl w:ilvl="6" w:tentative="1">
+      <w:start w:val="1"/>
+      <w:numFmt w:val="bullet"/>
+      <w:lvlText w:val=""/>
+      <w:lvlJc w:val="left"/>
+      <w:pPr>
+        <w:tabs>
+          <w:tab w:val="num" w:pos="5040"/>
+        </w:tabs>
+        <w:ind w:left="5040" w:hanging="360"/>
+      </w:pPr>
+      <w:rPr>
+        <w:rFonts w:ascii="Wingdings" w:hAnsi="Wingdings" w:hint="default"/>
+        <w:sz w:val="20"/>
+      </w:rPr>
+    </w:lvl>
+    <w:lvl w:ilvl="7" w:tentative="1">
+      <w:start w:val="1"/>
+      <w:numFmt w:val="bullet"/>
+      <w:lvlText w:val=""/>
+      <w:lvlJc w:val="left"/>
+      <w:pPr>
+        <w:tabs>
+          <w:tab w:val="num" w:pos="5760"/>
+        </w:tabs>
+        <w:ind w:left="5760" w:hanging="360"/>
+      </w:pPr>
+      <w:rPr>
+        <w:rFonts w:ascii="Wingdings" w:hAnsi="Wingdings" w:hint="default"/>
+        <w:sz w:val="20"/>
+      </w:rPr>
+    </w:lvl>
+    <w:lvl w:ilvl="8" w:tentative="1">
+      <w:start w:val="1"/>
+      <w:numFmt w:val="bullet"/>
+      <w:lvlText w:val=""/>
+      <w:lvlJc w:val="left"/>
+      <w:pPr>
+        <w:tabs>
+          <w:tab w:val="num" w:pos="6480"/>
+        </w:tabs>
+        <w:ind w:left="6480" w:hanging="360"/>
+      </w:pPr>
+      <w:rPr>
+        <w:rFonts w:ascii="Wingdings" w:hAnsi="Wingdings" w:hint="default"/>
+        <w:sz w:val="20"/>
+      </w:rPr>
+    </w:lvl>
+  </w:abstractNum>
+  <w:abstractNum w:abstractNumId="3">
     <w:nsid w:val="135C5424"/>
     <w:multiLevelType w:val="multilevel"/>
     <w:tmpl w:val="43DEE7DC"/>
@@ -1664,7 +2851,7 @@
       </w:rPr>
     </w:lvl>
   </w:abstractNum>
-  <w:abstractNum w:abstractNumId="2">
+  <w:abstractNum w:abstractNumId="4">
     <w:nsid w:val="1EBC4295"/>
     <w:multiLevelType w:val="multilevel"/>
     <w:tmpl w:val="FCBA2030"/>
@@ -1813,7 +3000,7 @@
       </w:rPr>
     </w:lvl>
   </w:abstractNum>
-  <w:abstractNum w:abstractNumId="3">
+  <w:abstractNum w:abstractNumId="5">
     <w:nsid w:val="1F6F1823"/>
     <w:multiLevelType w:val="multilevel"/>
     <w:tmpl w:val="45181006"/>
@@ -1962,7 +3149,305 @@
       </w:rPr>
     </w:lvl>
   </w:abstractNum>
-  <w:abstractNum w:abstractNumId="4">
+  <w:abstractNum w:abstractNumId="6">
+    <w:nsid w:val="1FCD2911"/>
+    <w:multiLevelType w:val="multilevel"/>
+    <w:tmpl w:val="57E2F32E"/>
+    <w:lvl w:ilvl="0">
+      <w:start w:val="1"/>
+      <w:numFmt w:val="bullet"/>
+      <w:lvlText w:val=""/>
+      <w:lvlJc w:val="left"/>
+      <w:pPr>
+        <w:tabs>
+          <w:tab w:val="num" w:pos="720"/>
+        </w:tabs>
+        <w:ind w:left="720" w:hanging="360"/>
+      </w:pPr>
+      <w:rPr>
+        <w:rFonts w:ascii="Symbol" w:hAnsi="Symbol" w:hint="default"/>
+        <w:sz w:val="20"/>
+      </w:rPr>
+    </w:lvl>
+    <w:lvl w:ilvl="1" w:tentative="1">
+      <w:start w:val="1"/>
+      <w:numFmt w:val="bullet"/>
+      <w:lvlText w:val="o"/>
+      <w:lvlJc w:val="left"/>
+      <w:pPr>
+        <w:tabs>
+          <w:tab w:val="num" w:pos="1440"/>
+        </w:tabs>
+        <w:ind w:left="1440" w:hanging="360"/>
+      </w:pPr>
+      <w:rPr>
+        <w:rFonts w:ascii="Courier New" w:hAnsi="Courier New" w:hint="default"/>
+        <w:sz w:val="20"/>
+      </w:rPr>
+    </w:lvl>
+    <w:lvl w:ilvl="2" w:tentative="1">
+      <w:start w:val="1"/>
+      <w:numFmt w:val="bullet"/>
+      <w:lvlText w:val=""/>
+      <w:lvlJc w:val="left"/>
+      <w:pPr>
+        <w:tabs>
+          <w:tab w:val="num" w:pos="2160"/>
+        </w:tabs>
+        <w:ind w:left="2160" w:hanging="360"/>
+      </w:pPr>
+      <w:rPr>
+        <w:rFonts w:ascii="Wingdings" w:hAnsi="Wingdings" w:hint="default"/>
+        <w:sz w:val="20"/>
+      </w:rPr>
+    </w:lvl>
+    <w:lvl w:ilvl="3" w:tentative="1">
+      <w:start w:val="1"/>
+      <w:numFmt w:val="bullet"/>
+      <w:lvlText w:val=""/>
+      <w:lvlJc w:val="left"/>
+      <w:pPr>
+        <w:tabs>
+          <w:tab w:val="num" w:pos="2880"/>
+        </w:tabs>
+        <w:ind w:left="2880" w:hanging="360"/>
+      </w:pPr>
+      <w:rPr>
+        <w:rFonts w:ascii="Wingdings" w:hAnsi="Wingdings" w:hint="default"/>
+        <w:sz w:val="20"/>
+      </w:rPr>
+    </w:lvl>
+    <w:lvl w:ilvl="4" w:tentative="1">
+      <w:start w:val="1"/>
+      <w:numFmt w:val="bullet"/>
+      <w:lvlText w:val=""/>
+      <w:lvlJc w:val="left"/>
+      <w:pPr>
+        <w:tabs>
+          <w:tab w:val="num" w:pos="3600"/>
+        </w:tabs>
+        <w:ind w:left="3600" w:hanging="360"/>
+      </w:pPr>
+      <w:rPr>
+        <w:rFonts w:ascii="Wingdings" w:hAnsi="Wingdings" w:hint="default"/>
+        <w:sz w:val="20"/>
+      </w:rPr>
+    </w:lvl>
+    <w:lvl w:ilvl="5" w:tentative="1">
+      <w:start w:val="1"/>
+      <w:numFmt w:val="bullet"/>
+      <w:lvlText w:val=""/>
+      <w:lvlJc w:val="left"/>
+      <w:pPr>
+        <w:tabs>
+          <w:tab w:val="num" w:pos="4320"/>
+        </w:tabs>
+        <w:ind w:left="4320" w:hanging="360"/>
+      </w:pPr>
+      <w:rPr>
+        <w:rFonts w:ascii="Wingdings" w:hAnsi="Wingdings" w:hint="default"/>
+        <w:sz w:val="20"/>
+      </w:rPr>
+    </w:lvl>
+    <w:lvl w:ilvl="6" w:tentative="1">
+      <w:start w:val="1"/>
+      <w:numFmt w:val="bullet"/>
+      <w:lvlText w:val=""/>
+      <w:lvlJc w:val="left"/>
+      <w:pPr>
+        <w:tabs>
+          <w:tab w:val="num" w:pos="5040"/>
+        </w:tabs>
+        <w:ind w:left="5040" w:hanging="360"/>
+      </w:pPr>
+      <w:rPr>
+        <w:rFonts w:ascii="Wingdings" w:hAnsi="Wingdings" w:hint="default"/>
+        <w:sz w:val="20"/>
+      </w:rPr>
+    </w:lvl>
+    <w:lvl w:ilvl="7" w:tentative="1">
+      <w:start w:val="1"/>
+      <w:numFmt w:val="bullet"/>
+      <w:lvlText w:val=""/>
+      <w:lvlJc w:val="left"/>
+      <w:pPr>
+        <w:tabs>
+          <w:tab w:val="num" w:pos="5760"/>
+        </w:tabs>
+        <w:ind w:left="5760" w:hanging="360"/>
+      </w:pPr>
+      <w:rPr>
+        <w:rFonts w:ascii="Wingdings" w:hAnsi="Wingdings" w:hint="default"/>
+        <w:sz w:val="20"/>
+      </w:rPr>
+    </w:lvl>
+    <w:lvl w:ilvl="8" w:tentative="1">
+      <w:start w:val="1"/>
+      <w:numFmt w:val="bullet"/>
+      <w:lvlText w:val=""/>
+      <w:lvlJc w:val="left"/>
+      <w:pPr>
+        <w:tabs>
+          <w:tab w:val="num" w:pos="6480"/>
+        </w:tabs>
+        <w:ind w:left="6480" w:hanging="360"/>
+      </w:pPr>
+      <w:rPr>
+        <w:rFonts w:ascii="Wingdings" w:hAnsi="Wingdings" w:hint="default"/>
+        <w:sz w:val="20"/>
+      </w:rPr>
+    </w:lvl>
+  </w:abstractNum>
+  <w:abstractNum w:abstractNumId="7">
+    <w:nsid w:val="21101C8B"/>
+    <w:multiLevelType w:val="multilevel"/>
+    <w:tmpl w:val="5A0AC66E"/>
+    <w:lvl w:ilvl="0">
+      <w:start w:val="1"/>
+      <w:numFmt w:val="bullet"/>
+      <w:lvlText w:val=""/>
+      <w:lvlJc w:val="left"/>
+      <w:pPr>
+        <w:tabs>
+          <w:tab w:val="num" w:pos="720"/>
+        </w:tabs>
+        <w:ind w:left="720" w:hanging="360"/>
+      </w:pPr>
+      <w:rPr>
+        <w:rFonts w:ascii="Symbol" w:hAnsi="Symbol" w:hint="default"/>
+        <w:sz w:val="20"/>
+      </w:rPr>
+    </w:lvl>
+    <w:lvl w:ilvl="1" w:tentative="1">
+      <w:start w:val="1"/>
+      <w:numFmt w:val="bullet"/>
+      <w:lvlText w:val="o"/>
+      <w:lvlJc w:val="left"/>
+      <w:pPr>
+        <w:tabs>
+          <w:tab w:val="num" w:pos="1440"/>
+        </w:tabs>
+        <w:ind w:left="1440" w:hanging="360"/>
+      </w:pPr>
+      <w:rPr>
+        <w:rFonts w:ascii="Courier New" w:hAnsi="Courier New" w:hint="default"/>
+        <w:sz w:val="20"/>
+      </w:rPr>
+    </w:lvl>
+    <w:lvl w:ilvl="2" w:tentative="1">
+      <w:start w:val="1"/>
+      <w:numFmt w:val="bullet"/>
+      <w:lvlText w:val=""/>
+      <w:lvlJc w:val="left"/>
+      <w:pPr>
+        <w:tabs>
+          <w:tab w:val="num" w:pos="2160"/>
+        </w:tabs>
+        <w:ind w:left="2160" w:hanging="360"/>
+      </w:pPr>
+      <w:rPr>
+        <w:rFonts w:ascii="Wingdings" w:hAnsi="Wingdings" w:hint="default"/>
+        <w:sz w:val="20"/>
+      </w:rPr>
+    </w:lvl>
+    <w:lvl w:ilvl="3" w:tentative="1">
+      <w:start w:val="1"/>
+      <w:numFmt w:val="bullet"/>
+      <w:lvlText w:val=""/>
+      <w:lvlJc w:val="left"/>
+      <w:pPr>
+        <w:tabs>
+          <w:tab w:val="num" w:pos="2880"/>
+        </w:tabs>
+        <w:ind w:left="2880" w:hanging="360"/>
+      </w:pPr>
+      <w:rPr>
+        <w:rFonts w:ascii="Wingdings" w:hAnsi="Wingdings" w:hint="default"/>
+        <w:sz w:val="20"/>
+      </w:rPr>
+    </w:lvl>
+    <w:lvl w:ilvl="4" w:tentative="1">
+      <w:start w:val="1"/>
+      <w:numFmt w:val="bullet"/>
+      <w:lvlText w:val=""/>
+      <w:lvlJc w:val="left"/>
+      <w:pPr>
+        <w:tabs>
+          <w:tab w:val="num" w:pos="3600"/>
+        </w:tabs>
+        <w:ind w:left="3600" w:hanging="360"/>
+      </w:pPr>
+      <w:rPr>
+        <w:rFonts w:ascii="Wingdings" w:hAnsi="Wingdings" w:hint="default"/>
+        <w:sz w:val="20"/>
+      </w:rPr>
+    </w:lvl>
+    <w:lvl w:ilvl="5" w:tentative="1">
+      <w:start w:val="1"/>
+      <w:numFmt w:val="bullet"/>
+      <w:lvlText w:val=""/>
+      <w:lvlJc w:val="left"/>
+      <w:pPr>
+        <w:tabs>
+          <w:tab w:val="num" w:pos="4320"/>
+        </w:tabs>
+        <w:ind w:left="4320" w:hanging="360"/>
+      </w:pPr>
+      <w:rPr>
+        <w:rFonts w:ascii="Wingdings" w:hAnsi="Wingdings" w:hint="default"/>
+        <w:sz w:val="20"/>
+      </w:rPr>
+    </w:lvl>
+    <w:lvl w:ilvl="6" w:tentative="1">
+      <w:start w:val="1"/>
+      <w:numFmt w:val="bullet"/>
+      <w:lvlText w:val=""/>
+      <w:lvlJc w:val="left"/>
+      <w:pPr>
+        <w:tabs>
+          <w:tab w:val="num" w:pos="5040"/>
+        </w:tabs>
+        <w:ind w:left="5040" w:hanging="360"/>
+      </w:pPr>
+      <w:rPr>
+        <w:rFonts w:ascii="Wingdings" w:hAnsi="Wingdings" w:hint="default"/>
+        <w:sz w:val="20"/>
+      </w:rPr>
+    </w:lvl>
+    <w:lvl w:ilvl="7" w:tentative="1">
+      <w:start w:val="1"/>
+      <w:numFmt w:val="bullet"/>
+      <w:lvlText w:val=""/>
+      <w:lvlJc w:val="left"/>
+      <w:pPr>
+        <w:tabs>
+          <w:tab w:val="num" w:pos="5760"/>
+        </w:tabs>
+        <w:ind w:left="5760" w:hanging="360"/>
+      </w:pPr>
+      <w:rPr>
+        <w:rFonts w:ascii="Wingdings" w:hAnsi="Wingdings" w:hint="default"/>
+        <w:sz w:val="20"/>
+      </w:rPr>
+    </w:lvl>
+    <w:lvl w:ilvl="8" w:tentative="1">
+      <w:start w:val="1"/>
+      <w:numFmt w:val="bullet"/>
+      <w:lvlText w:val=""/>
+      <w:lvlJc w:val="left"/>
+      <w:pPr>
+        <w:tabs>
+          <w:tab w:val="num" w:pos="6480"/>
+        </w:tabs>
+        <w:ind w:left="6480" w:hanging="360"/>
+      </w:pPr>
+      <w:rPr>
+        <w:rFonts w:ascii="Wingdings" w:hAnsi="Wingdings" w:hint="default"/>
+        <w:sz w:val="20"/>
+      </w:rPr>
+    </w:lvl>
+  </w:abstractNum>
+  <w:abstractNum w:abstractNumId="8">
     <w:nsid w:val="233143FB"/>
     <w:multiLevelType w:val="multilevel"/>
     <w:tmpl w:val="80BC1004"/>
@@ -2111,7 +3596,156 @@
       </w:rPr>
     </w:lvl>
   </w:abstractNum>
-  <w:abstractNum w:abstractNumId="5">
+  <w:abstractNum w:abstractNumId="9">
+    <w:nsid w:val="2E1B0715"/>
+    <w:multiLevelType w:val="multilevel"/>
+    <w:tmpl w:val="CD4EAB74"/>
+    <w:lvl w:ilvl="0">
+      <w:start w:val="1"/>
+      <w:numFmt w:val="bullet"/>
+      <w:lvlText w:val=""/>
+      <w:lvlJc w:val="left"/>
+      <w:pPr>
+        <w:tabs>
+          <w:tab w:val="num" w:pos="720"/>
+        </w:tabs>
+        <w:ind w:left="720" w:hanging="360"/>
+      </w:pPr>
+      <w:rPr>
+        <w:rFonts w:ascii="Symbol" w:hAnsi="Symbol" w:hint="default"/>
+        <w:sz w:val="20"/>
+      </w:rPr>
+    </w:lvl>
+    <w:lvl w:ilvl="1" w:tentative="1">
+      <w:start w:val="1"/>
+      <w:numFmt w:val="bullet"/>
+      <w:lvlText w:val="o"/>
+      <w:lvlJc w:val="left"/>
+      <w:pPr>
+        <w:tabs>
+          <w:tab w:val="num" w:pos="1440"/>
+        </w:tabs>
+        <w:ind w:left="1440" w:hanging="360"/>
+      </w:pPr>
+      <w:rPr>
+        <w:rFonts w:ascii="Courier New" w:hAnsi="Courier New" w:hint="default"/>
+        <w:sz w:val="20"/>
+      </w:rPr>
+    </w:lvl>
+    <w:lvl w:ilvl="2" w:tentative="1">
+      <w:start w:val="1"/>
+      <w:numFmt w:val="bullet"/>
+      <w:lvlText w:val=""/>
+      <w:lvlJc w:val="left"/>
+      <w:pPr>
+        <w:tabs>
+          <w:tab w:val="num" w:pos="2160"/>
+        </w:tabs>
+        <w:ind w:left="2160" w:hanging="360"/>
+      </w:pPr>
+      <w:rPr>
+        <w:rFonts w:ascii="Wingdings" w:hAnsi="Wingdings" w:hint="default"/>
+        <w:sz w:val="20"/>
+      </w:rPr>
+    </w:lvl>
+    <w:lvl w:ilvl="3" w:tentative="1">
+      <w:start w:val="1"/>
+      <w:numFmt w:val="bullet"/>
+      <w:lvlText w:val=""/>
+      <w:lvlJc w:val="left"/>
+      <w:pPr>
+        <w:tabs>
+          <w:tab w:val="num" w:pos="2880"/>
+        </w:tabs>
+        <w:ind w:left="2880" w:hanging="360"/>
+      </w:pPr>
+      <w:rPr>
+        <w:rFonts w:ascii="Wingdings" w:hAnsi="Wingdings" w:hint="default"/>
+        <w:sz w:val="20"/>
+      </w:rPr>
+    </w:lvl>
+    <w:lvl w:ilvl="4" w:tentative="1">
+      <w:start w:val="1"/>
+      <w:numFmt w:val="bullet"/>
+      <w:lvlText w:val=""/>
+      <w:lvlJc w:val="left"/>
+      <w:pPr>
+        <w:tabs>
+          <w:tab w:val="num" w:pos="3600"/>
+        </w:tabs>
+        <w:ind w:left="3600" w:hanging="360"/>
+      </w:pPr>
+      <w:rPr>
+        <w:rFonts w:ascii="Wingdings" w:hAnsi="Wingdings" w:hint="default"/>
+        <w:sz w:val="20"/>
+      </w:rPr>
+    </w:lvl>
+    <w:lvl w:ilvl="5" w:tentative="1">
+      <w:start w:val="1"/>
+      <w:numFmt w:val="bullet"/>
+      <w:lvlText w:val=""/>
+      <w:lvlJc w:val="left"/>
+      <w:pPr>
+        <w:tabs>
+          <w:tab w:val="num" w:pos="4320"/>
+        </w:tabs>
+        <w:ind w:left="4320" w:hanging="360"/>
+      </w:pPr>
+      <w:rPr>
+        <w:rFonts w:ascii="Wingdings" w:hAnsi="Wingdings" w:hint="default"/>
+        <w:sz w:val="20"/>
+      </w:rPr>
+    </w:lvl>
+    <w:lvl w:ilvl="6" w:tentative="1">
+      <w:start w:val="1"/>
+      <w:numFmt w:val="bullet"/>
+      <w:lvlText w:val=""/>
+      <w:lvlJc w:val="left"/>
+      <w:pPr>
+        <w:tabs>
+          <w:tab w:val="num" w:pos="5040"/>
+        </w:tabs>
+        <w:ind w:left="5040" w:hanging="360"/>
+      </w:pPr>
+      <w:rPr>
+        <w:rFonts w:ascii="Wingdings" w:hAnsi="Wingdings" w:hint="default"/>
+        <w:sz w:val="20"/>
+      </w:rPr>
+    </w:lvl>
+    <w:lvl w:ilvl="7" w:tentative="1">
+      <w:start w:val="1"/>
+      <w:numFmt w:val="bullet"/>
+      <w:lvlText w:val=""/>
+      <w:lvlJc w:val="left"/>
+      <w:pPr>
+        <w:tabs>
+          <w:tab w:val="num" w:pos="5760"/>
+        </w:tabs>
+        <w:ind w:left="5760" w:hanging="360"/>
+      </w:pPr>
+      <w:rPr>
+        <w:rFonts w:ascii="Wingdings" w:hAnsi="Wingdings" w:hint="default"/>
+        <w:sz w:val="20"/>
+      </w:rPr>
+    </w:lvl>
+    <w:lvl w:ilvl="8" w:tentative="1">
+      <w:start w:val="1"/>
+      <w:numFmt w:val="bullet"/>
+      <w:lvlText w:val=""/>
+      <w:lvlJc w:val="left"/>
+      <w:pPr>
+        <w:tabs>
+          <w:tab w:val="num" w:pos="6480"/>
+        </w:tabs>
+        <w:ind w:left="6480" w:hanging="360"/>
+      </w:pPr>
+      <w:rPr>
+        <w:rFonts w:ascii="Wingdings" w:hAnsi="Wingdings" w:hint="default"/>
+        <w:sz w:val="20"/>
+      </w:rPr>
+    </w:lvl>
+  </w:abstractNum>
+  <w:abstractNum w:abstractNumId="10">
     <w:nsid w:val="4210300E"/>
     <w:multiLevelType w:val="multilevel"/>
     <w:tmpl w:val="8F3A0B28"/>
@@ -2260,7 +3894,7 @@
       </w:rPr>
     </w:lvl>
   </w:abstractNum>
-  <w:abstractNum w:abstractNumId="6">
+  <w:abstractNum w:abstractNumId="11">
     <w:nsid w:val="43803A4A"/>
     <w:multiLevelType w:val="multilevel"/>
     <w:tmpl w:val="BCEC4656"/>
@@ -2409,7 +4043,7 @@
       </w:rPr>
     </w:lvl>
   </w:abstractNum>
-  <w:abstractNum w:abstractNumId="7">
+  <w:abstractNum w:abstractNumId="12">
     <w:nsid w:val="47DA42A8"/>
     <w:multiLevelType w:val="multilevel"/>
     <w:tmpl w:val="C99050D2"/>
@@ -2558,7 +4192,156 @@
       </w:rPr>
     </w:lvl>
   </w:abstractNum>
-  <w:abstractNum w:abstractNumId="8">
+  <w:abstractNum w:abstractNumId="13">
+    <w:nsid w:val="589A58FE"/>
+    <w:multiLevelType w:val="multilevel"/>
+    <w:tmpl w:val="863C31F0"/>
+    <w:lvl w:ilvl="0">
+      <w:start w:val="1"/>
+      <w:numFmt w:val="bullet"/>
+      <w:lvlText w:val=""/>
+      <w:lvlJc w:val="left"/>
+      <w:pPr>
+        <w:tabs>
+          <w:tab w:val="num" w:pos="720"/>
+        </w:tabs>
+        <w:ind w:left="720" w:hanging="360"/>
+      </w:pPr>
+      <w:rPr>
+        <w:rFonts w:ascii="Symbol" w:hAnsi="Symbol" w:hint="default"/>
+        <w:sz w:val="20"/>
+      </w:rPr>
+    </w:lvl>
+    <w:lvl w:ilvl="1" w:tentative="1">
+      <w:start w:val="1"/>
+      <w:numFmt w:val="bullet"/>
+      <w:lvlText w:val="o"/>
+      <w:lvlJc w:val="left"/>
+      <w:pPr>
+        <w:tabs>
+          <w:tab w:val="num" w:pos="1440"/>
+        </w:tabs>
+        <w:ind w:left="1440" w:hanging="360"/>
+      </w:pPr>
+      <w:rPr>
+        <w:rFonts w:ascii="Courier New" w:hAnsi="Courier New" w:hint="default"/>
+        <w:sz w:val="20"/>
+      </w:rPr>
+    </w:lvl>
+    <w:lvl w:ilvl="2" w:tentative="1">
+      <w:start w:val="1"/>
+      <w:numFmt w:val="bullet"/>
+      <w:lvlText w:val=""/>
+      <w:lvlJc w:val="left"/>
+      <w:pPr>
+        <w:tabs>
+          <w:tab w:val="num" w:pos="2160"/>
+        </w:tabs>
+        <w:ind w:left="2160" w:hanging="360"/>
+      </w:pPr>
+      <w:rPr>
+        <w:rFonts w:ascii="Wingdings" w:hAnsi="Wingdings" w:hint="default"/>
+        <w:sz w:val="20"/>
+      </w:rPr>
+    </w:lvl>
+    <w:lvl w:ilvl="3" w:tentative="1">
+      <w:start w:val="1"/>
+      <w:numFmt w:val="bullet"/>
+      <w:lvlText w:val=""/>
+      <w:lvlJc w:val="left"/>
+      <w:pPr>
+        <w:tabs>
+          <w:tab w:val="num" w:pos="2880"/>
+        </w:tabs>
+        <w:ind w:left="2880" w:hanging="360"/>
+      </w:pPr>
+      <w:rPr>
+        <w:rFonts w:ascii="Wingdings" w:hAnsi="Wingdings" w:hint="default"/>
+        <w:sz w:val="20"/>
+      </w:rPr>
+    </w:lvl>
+    <w:lvl w:ilvl="4" w:tentative="1">
+      <w:start w:val="1"/>
+      <w:numFmt w:val="bullet"/>
+      <w:lvlText w:val=""/>
+      <w:lvlJc w:val="left"/>
+      <w:pPr>
+        <w:tabs>
+          <w:tab w:val="num" w:pos="3600"/>
+        </w:tabs>
+        <w:ind w:left="3600" w:hanging="360"/>
+      </w:pPr>
+      <w:rPr>
+        <w:rFonts w:ascii="Wingdings" w:hAnsi="Wingdings" w:hint="default"/>
+        <w:sz w:val="20"/>
+      </w:rPr>
+    </w:lvl>
+    <w:lvl w:ilvl="5" w:tentative="1">
+      <w:start w:val="1"/>
+      <w:numFmt w:val="bullet"/>
+      <w:lvlText w:val=""/>
+      <w:lvlJc w:val="left"/>
+      <w:pPr>
+        <w:tabs>
+          <w:tab w:val="num" w:pos="4320"/>
+        </w:tabs>
+        <w:ind w:left="4320" w:hanging="360"/>
+      </w:pPr>
+      <w:rPr>
+        <w:rFonts w:ascii="Wingdings" w:hAnsi="Wingdings" w:hint="default"/>
+        <w:sz w:val="20"/>
+      </w:rPr>
+    </w:lvl>
+    <w:lvl w:ilvl="6" w:tentative="1">
+      <w:start w:val="1"/>
+      <w:numFmt w:val="bullet"/>
+      <w:lvlText w:val=""/>
+      <w:lvlJc w:val="left"/>
+      <w:pPr>
+        <w:tabs>
+          <w:tab w:val="num" w:pos="5040"/>
+        </w:tabs>
+        <w:ind w:left="5040" w:hanging="360"/>
+      </w:pPr>
+      <w:rPr>
+        <w:rFonts w:ascii="Wingdings" w:hAnsi="Wingdings" w:hint="default"/>
+        <w:sz w:val="20"/>
+      </w:rPr>
+    </w:lvl>
+    <w:lvl w:ilvl="7" w:tentative="1">
+      <w:start w:val="1"/>
+      <w:numFmt w:val="bullet"/>
+      <w:lvlText w:val=""/>
+      <w:lvlJc w:val="left"/>
+      <w:pPr>
+        <w:tabs>
+          <w:tab w:val="num" w:pos="5760"/>
+        </w:tabs>
+        <w:ind w:left="5760" w:hanging="360"/>
+      </w:pPr>
+      <w:rPr>
+        <w:rFonts w:ascii="Wingdings" w:hAnsi="Wingdings" w:hint="default"/>
+        <w:sz w:val="20"/>
+      </w:rPr>
+    </w:lvl>
+    <w:lvl w:ilvl="8" w:tentative="1">
+      <w:start w:val="1"/>
+      <w:numFmt w:val="bullet"/>
+      <w:lvlText w:val=""/>
+      <w:lvlJc w:val="left"/>
+      <w:pPr>
+        <w:tabs>
+          <w:tab w:val="num" w:pos="6480"/>
+        </w:tabs>
+        <w:ind w:left="6480" w:hanging="360"/>
+      </w:pPr>
+      <w:rPr>
+        <w:rFonts w:ascii="Wingdings" w:hAnsi="Wingdings" w:hint="default"/>
+        <w:sz w:val="20"/>
+      </w:rPr>
+    </w:lvl>
+  </w:abstractNum>
+  <w:abstractNum w:abstractNumId="14">
     <w:nsid w:val="5A59604A"/>
     <w:multiLevelType w:val="multilevel"/>
     <w:tmpl w:val="A87E65B6"/>
@@ -2707,7 +4490,156 @@
       </w:rPr>
     </w:lvl>
   </w:abstractNum>
-  <w:abstractNum w:abstractNumId="9">
+  <w:abstractNum w:abstractNumId="15">
+    <w:nsid w:val="61570B8D"/>
+    <w:multiLevelType w:val="multilevel"/>
+    <w:tmpl w:val="B61240DE"/>
+    <w:lvl w:ilvl="0">
+      <w:start w:val="1"/>
+      <w:numFmt w:val="bullet"/>
+      <w:lvlText w:val=""/>
+      <w:lvlJc w:val="left"/>
+      <w:pPr>
+        <w:tabs>
+          <w:tab w:val="num" w:pos="720"/>
+        </w:tabs>
+        <w:ind w:left="720" w:hanging="360"/>
+      </w:pPr>
+      <w:rPr>
+        <w:rFonts w:ascii="Symbol" w:hAnsi="Symbol" w:hint="default"/>
+        <w:sz w:val="20"/>
+      </w:rPr>
+    </w:lvl>
+    <w:lvl w:ilvl="1" w:tentative="1">
+      <w:start w:val="1"/>
+      <w:numFmt w:val="bullet"/>
+      <w:lvlText w:val="o"/>
+      <w:lvlJc w:val="left"/>
+      <w:pPr>
+        <w:tabs>
+          <w:tab w:val="num" w:pos="1440"/>
+        </w:tabs>
+        <w:ind w:left="1440" w:hanging="360"/>
+      </w:pPr>
+      <w:rPr>
+        <w:rFonts w:ascii="Courier New" w:hAnsi="Courier New" w:hint="default"/>
+        <w:sz w:val="20"/>
+      </w:rPr>
+    </w:lvl>
+    <w:lvl w:ilvl="2" w:tentative="1">
+      <w:start w:val="1"/>
+      <w:numFmt w:val="bullet"/>
+      <w:lvlText w:val=""/>
+      <w:lvlJc w:val="left"/>
+      <w:pPr>
+        <w:tabs>
+          <w:tab w:val="num" w:pos="2160"/>
+        </w:tabs>
+        <w:ind w:left="2160" w:hanging="360"/>
+      </w:pPr>
+      <w:rPr>
+        <w:rFonts w:ascii="Wingdings" w:hAnsi="Wingdings" w:hint="default"/>
+        <w:sz w:val="20"/>
+      </w:rPr>
+    </w:lvl>
+    <w:lvl w:ilvl="3" w:tentative="1">
+      <w:start w:val="1"/>
+      <w:numFmt w:val="bullet"/>
+      <w:lvlText w:val=""/>
+      <w:lvlJc w:val="left"/>
+      <w:pPr>
+        <w:tabs>
+          <w:tab w:val="num" w:pos="2880"/>
+        </w:tabs>
+        <w:ind w:left="2880" w:hanging="360"/>
+      </w:pPr>
+      <w:rPr>
+        <w:rFonts w:ascii="Wingdings" w:hAnsi="Wingdings" w:hint="default"/>
+        <w:sz w:val="20"/>
+      </w:rPr>
+    </w:lvl>
+    <w:lvl w:ilvl="4" w:tentative="1">
+      <w:start w:val="1"/>
+      <w:numFmt w:val="bullet"/>
+      <w:lvlText w:val=""/>
+      <w:lvlJc w:val="left"/>
+      <w:pPr>
+        <w:tabs>
+          <w:tab w:val="num" w:pos="3600"/>
+        </w:tabs>
+        <w:ind w:left="3600" w:hanging="360"/>
+      </w:pPr>
+      <w:rPr>
+        <w:rFonts w:ascii="Wingdings" w:hAnsi="Wingdings" w:hint="default"/>
+        <w:sz w:val="20"/>
+      </w:rPr>
+    </w:lvl>
+    <w:lvl w:ilvl="5" w:tentative="1">
+      <w:start w:val="1"/>
+      <w:numFmt w:val="bullet"/>
+      <w:lvlText w:val=""/>
+      <w:lvlJc w:val="left"/>
+      <w:pPr>
+        <w:tabs>
+          <w:tab w:val="num" w:pos="4320"/>
+        </w:tabs>
+        <w:ind w:left="4320" w:hanging="360"/>
+      </w:pPr>
+      <w:rPr>
+        <w:rFonts w:ascii="Wingdings" w:hAnsi="Wingdings" w:hint="default"/>
+        <w:sz w:val="20"/>
+      </w:rPr>
+    </w:lvl>
+    <w:lvl w:ilvl="6" w:tentative="1">
+      <w:start w:val="1"/>
+      <w:numFmt w:val="bullet"/>
+      <w:lvlText w:val=""/>
+      <w:lvlJc w:val="left"/>
+      <w:pPr>
+        <w:tabs>
+          <w:tab w:val="num" w:pos="5040"/>
+        </w:tabs>
+        <w:ind w:left="5040" w:hanging="360"/>
+      </w:pPr>
+      <w:rPr>
+        <w:rFonts w:ascii="Wingdings" w:hAnsi="Wingdings" w:hint="default"/>
+        <w:sz w:val="20"/>
+      </w:rPr>
+    </w:lvl>
+    <w:lvl w:ilvl="7" w:tentative="1">
+      <w:start w:val="1"/>
+      <w:numFmt w:val="bullet"/>
+      <w:lvlText w:val=""/>
+      <w:lvlJc w:val="left"/>
+      <w:pPr>
+        <w:tabs>
+          <w:tab w:val="num" w:pos="5760"/>
+        </w:tabs>
+        <w:ind w:left="5760" w:hanging="360"/>
+      </w:pPr>
+      <w:rPr>
+        <w:rFonts w:ascii="Wingdings" w:hAnsi="Wingdings" w:hint="default"/>
+        <w:sz w:val="20"/>
+      </w:rPr>
+    </w:lvl>
+    <w:lvl w:ilvl="8" w:tentative="1">
+      <w:start w:val="1"/>
+      <w:numFmt w:val="bullet"/>
+      <w:lvlText w:val=""/>
+      <w:lvlJc w:val="left"/>
+      <w:pPr>
+        <w:tabs>
+          <w:tab w:val="num" w:pos="6480"/>
+        </w:tabs>
+        <w:ind w:left="6480" w:hanging="360"/>
+      </w:pPr>
+      <w:rPr>
+        <w:rFonts w:ascii="Wingdings" w:hAnsi="Wingdings" w:hint="default"/>
+        <w:sz w:val="20"/>
+      </w:rPr>
+    </w:lvl>
+  </w:abstractNum>
+  <w:abstractNum w:abstractNumId="16">
     <w:nsid w:val="719D71B9"/>
     <w:multiLevelType w:val="multilevel"/>
     <w:tmpl w:val="13BEE546"/>
@@ -2856,35 +4788,208 @@
       </w:rPr>
     </w:lvl>
   </w:abstractNum>
+  <w:abstractNum w:abstractNumId="17">
+    <w:nsid w:val="7E560718"/>
+    <w:multiLevelType w:val="multilevel"/>
+    <w:tmpl w:val="9F10AAB0"/>
+    <w:lvl w:ilvl="0">
+      <w:start w:val="1"/>
+      <w:numFmt w:val="bullet"/>
+      <w:lvlText w:val=""/>
+      <w:lvlJc w:val="left"/>
+      <w:pPr>
+        <w:tabs>
+          <w:tab w:val="num" w:pos="720"/>
+        </w:tabs>
+        <w:ind w:left="720" w:hanging="360"/>
+      </w:pPr>
+      <w:rPr>
+        <w:rFonts w:ascii="Symbol" w:hAnsi="Symbol" w:hint="default"/>
+        <w:sz w:val="20"/>
+      </w:rPr>
+    </w:lvl>
+    <w:lvl w:ilvl="1" w:tentative="1">
+      <w:start w:val="1"/>
+      <w:numFmt w:val="bullet"/>
+      <w:lvlText w:val="o"/>
+      <w:lvlJc w:val="left"/>
+      <w:pPr>
+        <w:tabs>
+          <w:tab w:val="num" w:pos="1440"/>
+        </w:tabs>
+        <w:ind w:left="1440" w:hanging="360"/>
+      </w:pPr>
+      <w:rPr>
+        <w:rFonts w:ascii="Courier New" w:hAnsi="Courier New" w:hint="default"/>
+        <w:sz w:val="20"/>
+      </w:rPr>
+    </w:lvl>
+    <w:lvl w:ilvl="2" w:tentative="1">
+      <w:start w:val="1"/>
+      <w:numFmt w:val="bullet"/>
+      <w:lvlText w:val=""/>
+      <w:lvlJc w:val="left"/>
+      <w:pPr>
+        <w:tabs>
+          <w:tab w:val="num" w:pos="2160"/>
+        </w:tabs>
+        <w:ind w:left="2160" w:hanging="360"/>
+      </w:pPr>
+      <w:rPr>
+        <w:rFonts w:ascii="Wingdings" w:hAnsi="Wingdings" w:hint="default"/>
+        <w:sz w:val="20"/>
+      </w:rPr>
+    </w:lvl>
+    <w:lvl w:ilvl="3" w:tentative="1">
+      <w:start w:val="1"/>
+      <w:numFmt w:val="bullet"/>
+      <w:lvlText w:val=""/>
+      <w:lvlJc w:val="left"/>
+      <w:pPr>
+        <w:tabs>
+          <w:tab w:val="num" w:pos="2880"/>
+        </w:tabs>
+        <w:ind w:left="2880" w:hanging="360"/>
+      </w:pPr>
+      <w:rPr>
+        <w:rFonts w:ascii="Wingdings" w:hAnsi="Wingdings" w:hint="default"/>
+        <w:sz w:val="20"/>
+      </w:rPr>
+    </w:lvl>
+    <w:lvl w:ilvl="4" w:tentative="1">
+      <w:start w:val="1"/>
+      <w:numFmt w:val="bullet"/>
+      <w:lvlText w:val=""/>
+      <w:lvlJc w:val="left"/>
+      <w:pPr>
+        <w:tabs>
+          <w:tab w:val="num" w:pos="3600"/>
+        </w:tabs>
+        <w:ind w:left="3600" w:hanging="360"/>
+      </w:pPr>
+      <w:rPr>
+        <w:rFonts w:ascii="Wingdings" w:hAnsi="Wingdings" w:hint="default"/>
+        <w:sz w:val="20"/>
+      </w:rPr>
+    </w:lvl>
+    <w:lvl w:ilvl="5" w:tentative="1">
+      <w:start w:val="1"/>
+      <w:numFmt w:val="bullet"/>
+      <w:lvlText w:val=""/>
+      <w:lvlJc w:val="left"/>
+      <w:pPr>
+        <w:tabs>
+          <w:tab w:val="num" w:pos="4320"/>
+        </w:tabs>
+        <w:ind w:left="4320" w:hanging="360"/>
+      </w:pPr>
+      <w:rPr>
+        <w:rFonts w:ascii="Wingdings" w:hAnsi="Wingdings" w:hint="default"/>
+        <w:sz w:val="20"/>
+      </w:rPr>
+    </w:lvl>
+    <w:lvl w:ilvl="6" w:tentative="1">
+      <w:start w:val="1"/>
+      <w:numFmt w:val="bullet"/>
+      <w:lvlText w:val=""/>
+      <w:lvlJc w:val="left"/>
+      <w:pPr>
+        <w:tabs>
+          <w:tab w:val="num" w:pos="5040"/>
+        </w:tabs>
+        <w:ind w:left="5040" w:hanging="360"/>
+      </w:pPr>
+      <w:rPr>
+        <w:rFonts w:ascii="Wingdings" w:hAnsi="Wingdings" w:hint="default"/>
+        <w:sz w:val="20"/>
+      </w:rPr>
+    </w:lvl>
+    <w:lvl w:ilvl="7" w:tentative="1">
+      <w:start w:val="1"/>
+      <w:numFmt w:val="bullet"/>
+      <w:lvlText w:val=""/>
+      <w:lvlJc w:val="left"/>
+      <w:pPr>
+        <w:tabs>
+          <w:tab w:val="num" w:pos="5760"/>
+        </w:tabs>
+        <w:ind w:left="5760" w:hanging="360"/>
+      </w:pPr>
+      <w:rPr>
+        <w:rFonts w:ascii="Wingdings" w:hAnsi="Wingdings" w:hint="default"/>
+        <w:sz w:val="20"/>
+      </w:rPr>
+    </w:lvl>
+    <w:lvl w:ilvl="8" w:tentative="1">
+      <w:start w:val="1"/>
+      <w:numFmt w:val="bullet"/>
+      <w:lvlText w:val=""/>
+      <w:lvlJc w:val="left"/>
+      <w:pPr>
+        <w:tabs>
+          <w:tab w:val="num" w:pos="6480"/>
+        </w:tabs>
+        <w:ind w:left="6480" w:hanging="360"/>
+      </w:pPr>
+      <w:rPr>
+        <w:rFonts w:ascii="Wingdings" w:hAnsi="Wingdings" w:hint="default"/>
+        <w:sz w:val="20"/>
+      </w:rPr>
+    </w:lvl>
+  </w:abstractNum>
   <w:num w:numId="1">
+    <w:abstractNumId w:val="14"/>
+  </w:num>
+  <w:num w:numId="2">
+    <w:abstractNumId w:val="11"/>
+  </w:num>
+  <w:num w:numId="3">
+    <w:abstractNumId w:val="16"/>
+  </w:num>
+  <w:num w:numId="4">
+    <w:abstractNumId w:val="4"/>
+  </w:num>
+  <w:num w:numId="5">
     <w:abstractNumId w:val="8"/>
   </w:num>
-  <w:num w:numId="2">
-    <w:abstractNumId w:val="6"/>
-  </w:num>
-  <w:num w:numId="3">
-    <w:abstractNumId w:val="9"/>
-  </w:num>
-  <w:num w:numId="4">
-    <w:abstractNumId w:val="2"/>
-  </w:num>
-  <w:num w:numId="5">
-    <w:abstractNumId w:val="4"/>
-  </w:num>
   <w:num w:numId="6">
-    <w:abstractNumId w:val="1"/>
+    <w:abstractNumId w:val="3"/>
   </w:num>
   <w:num w:numId="7">
-    <w:abstractNumId w:val="5"/>
+    <w:abstractNumId w:val="10"/>
   </w:num>
   <w:num w:numId="8">
-    <w:abstractNumId w:val="3"/>
+    <w:abstractNumId w:val="5"/>
   </w:num>
   <w:num w:numId="9">
     <w:abstractNumId w:val="0"/>
   </w:num>
   <w:num w:numId="10">
+    <w:abstractNumId w:val="12"/>
+  </w:num>
+  <w:num w:numId="11">
+    <w:abstractNumId w:val="15"/>
+  </w:num>
+  <w:num w:numId="12">
+    <w:abstractNumId w:val="1"/>
+  </w:num>
+  <w:num w:numId="13">
+    <w:abstractNumId w:val="9"/>
+  </w:num>
+  <w:num w:numId="14">
+    <w:abstractNumId w:val="17"/>
+  </w:num>
+  <w:num w:numId="15">
+    <w:abstractNumId w:val="13"/>
+  </w:num>
+  <w:num w:numId="16">
     <w:abstractNumId w:val="7"/>
+  </w:num>
+  <w:num w:numId="17">
+    <w:abstractNumId w:val="2"/>
+  </w:num>
+  <w:num w:numId="18">
+    <w:abstractNumId w:val="6"/>
   </w:num>
 </w:numbering>
 </file>

</xml_diff>